<commit_message>
Show submitter-entered mode of inheritance from ClinVar as one summarised line (AD/AR counts, for reference)
Co-Authored-By: Claude Fable 5.1 <noreply@anthropic.com>
</commit_message>
<xml_diff>
--- a/docs/Missense_Variant_Evaluation_Report_Requirements_and_Design.docx
+++ b/docs/Missense_Variant_Evaluation_Report_Requirements_and_Design.docx
@@ -75,7 +75,7 @@
     <w:sdt>
       <w:sdtPr>
         <w:alias w:val="Contents"/>
-        <w:id w:val="1559594061"/>
+        <w:id w:val="-1358034016"/>
       </w:sdtPr>
       <w:sdtEndPr/>
       <w:sdtContent>
@@ -103,7 +103,7 @@
           <w:r>
             <w:fldChar w:fldCharType="separate"/>
           </w:r>
-          <w:hyperlink w:anchor="_Toc239955755" w:history="1">
+          <w:hyperlink w:anchor="_Toc239966380" w:history="1">
             <w:r>
               <w:rPr>
                 <w:rStyle w:val="a5"/>
@@ -127,7 +127,7 @@
               <w:rPr>
                 <w:noProof/>
               </w:rPr>
-              <w:instrText xml:space="preserve"> PAGEREF _Toc239955755 \h </w:instrText>
+              <w:instrText xml:space="preserve"> PAGEREF _Toc239966380 \h </w:instrText>
             </w:r>
             <w:r>
               <w:rPr>
@@ -169,7 +169,7 @@
               <w14:ligatures w14:val="standardContextual"/>
             </w:rPr>
           </w:pPr>
-          <w:hyperlink w:anchor="_Toc239955756" w:history="1">
+          <w:hyperlink w:anchor="_Toc239966381" w:history="1">
             <w:r>
               <w:rPr>
                 <w:rStyle w:val="a5"/>
@@ -193,7 +193,7 @@
               <w:rPr>
                 <w:noProof/>
               </w:rPr>
-              <w:instrText xml:space="preserve"> PAGEREF _Toc239955756 \h </w:instrText>
+              <w:instrText xml:space="preserve"> PAGEREF _Toc239966381 \h </w:instrText>
             </w:r>
             <w:r>
               <w:rPr>
@@ -235,7 +235,7 @@
               <w14:ligatures w14:val="standardContextual"/>
             </w:rPr>
           </w:pPr>
-          <w:hyperlink w:anchor="_Toc239955757" w:history="1">
+          <w:hyperlink w:anchor="_Toc239966382" w:history="1">
             <w:r>
               <w:rPr>
                 <w:rStyle w:val="a5"/>
@@ -259,7 +259,7 @@
               <w:rPr>
                 <w:noProof/>
               </w:rPr>
-              <w:instrText xml:space="preserve"> PAGEREF _Toc239955757 \h </w:instrText>
+              <w:instrText xml:space="preserve"> PAGEREF _Toc239966382 \h </w:instrText>
             </w:r>
             <w:r>
               <w:rPr>
@@ -301,7 +301,7 @@
               <w14:ligatures w14:val="standardContextual"/>
             </w:rPr>
           </w:pPr>
-          <w:hyperlink w:anchor="_Toc239955758" w:history="1">
+          <w:hyperlink w:anchor="_Toc239966383" w:history="1">
             <w:r>
               <w:rPr>
                 <w:rStyle w:val="a5"/>
@@ -325,7 +325,7 @@
               <w:rPr>
                 <w:noProof/>
               </w:rPr>
-              <w:instrText xml:space="preserve"> PAGEREF _Toc239955758 \h </w:instrText>
+              <w:instrText xml:space="preserve"> PAGEREF _Toc239966383 \h </w:instrText>
             </w:r>
             <w:r>
               <w:rPr>
@@ -367,7 +367,7 @@
               <w14:ligatures w14:val="standardContextual"/>
             </w:rPr>
           </w:pPr>
-          <w:hyperlink w:anchor="_Toc239955759" w:history="1">
+          <w:hyperlink w:anchor="_Toc239966384" w:history="1">
             <w:r>
               <w:rPr>
                 <w:rStyle w:val="a5"/>
@@ -391,7 +391,7 @@
               <w:rPr>
                 <w:noProof/>
               </w:rPr>
-              <w:instrText xml:space="preserve"> PAGEREF _Toc239955759 \h </w:instrText>
+              <w:instrText xml:space="preserve"> PAGEREF _Toc239966384 \h </w:instrText>
             </w:r>
             <w:r>
               <w:rPr>
@@ -433,7 +433,7 @@
               <w14:ligatures w14:val="standardContextual"/>
             </w:rPr>
           </w:pPr>
-          <w:hyperlink w:anchor="_Toc239955760" w:history="1">
+          <w:hyperlink w:anchor="_Toc239966385" w:history="1">
             <w:r>
               <w:rPr>
                 <w:rStyle w:val="a5"/>
@@ -457,7 +457,7 @@
               <w:rPr>
                 <w:noProof/>
               </w:rPr>
-              <w:instrText xml:space="preserve"> PAGEREF _Toc239955760 \h </w:instrText>
+              <w:instrText xml:space="preserve"> PAGEREF _Toc239966385 \h </w:instrText>
             </w:r>
             <w:r>
               <w:rPr>
@@ -499,7 +499,7 @@
               <w14:ligatures w14:val="standardContextual"/>
             </w:rPr>
           </w:pPr>
-          <w:hyperlink w:anchor="_Toc239955761" w:history="1">
+          <w:hyperlink w:anchor="_Toc239966386" w:history="1">
             <w:r>
               <w:rPr>
                 <w:rStyle w:val="a5"/>
@@ -523,7 +523,7 @@
               <w:rPr>
                 <w:noProof/>
               </w:rPr>
-              <w:instrText xml:space="preserve"> PAGEREF _Toc239955761 \h </w:instrText>
+              <w:instrText xml:space="preserve"> PAGEREF _Toc239966386 \h </w:instrText>
             </w:r>
             <w:r>
               <w:rPr>
@@ -565,7 +565,7 @@
               <w14:ligatures w14:val="standardContextual"/>
             </w:rPr>
           </w:pPr>
-          <w:hyperlink w:anchor="_Toc239955762" w:history="1">
+          <w:hyperlink w:anchor="_Toc239966387" w:history="1">
             <w:r>
               <w:rPr>
                 <w:rStyle w:val="a5"/>
@@ -589,7 +589,7 @@
               <w:rPr>
                 <w:noProof/>
               </w:rPr>
-              <w:instrText xml:space="preserve"> PAGEREF _Toc239955762 \h </w:instrText>
+              <w:instrText xml:space="preserve"> PAGEREF _Toc239966387 \h </w:instrText>
             </w:r>
             <w:r>
               <w:rPr>
@@ -631,7 +631,7 @@
               <w14:ligatures w14:val="standardContextual"/>
             </w:rPr>
           </w:pPr>
-          <w:hyperlink w:anchor="_Toc239955763" w:history="1">
+          <w:hyperlink w:anchor="_Toc239966388" w:history="1">
             <w:r>
               <w:rPr>
                 <w:rStyle w:val="a5"/>
@@ -655,7 +655,7 @@
               <w:rPr>
                 <w:noProof/>
               </w:rPr>
-              <w:instrText xml:space="preserve"> PAGEREF _Toc239955763 \h </w:instrText>
+              <w:instrText xml:space="preserve"> PAGEREF _Toc239966388 \h </w:instrText>
             </w:r>
             <w:r>
               <w:rPr>
@@ -697,7 +697,7 @@
               <w14:ligatures w14:val="standardContextual"/>
             </w:rPr>
           </w:pPr>
-          <w:hyperlink w:anchor="_Toc239955764" w:history="1">
+          <w:hyperlink w:anchor="_Toc239966389" w:history="1">
             <w:r>
               <w:rPr>
                 <w:rStyle w:val="a5"/>
@@ -721,7 +721,7 @@
               <w:rPr>
                 <w:noProof/>
               </w:rPr>
-              <w:instrText xml:space="preserve"> PAGEREF _Toc239955764 \h </w:instrText>
+              <w:instrText xml:space="preserve"> PAGEREF _Toc239966389 \h </w:instrText>
             </w:r>
             <w:r>
               <w:rPr>
@@ -763,7 +763,7 @@
               <w14:ligatures w14:val="standardContextual"/>
             </w:rPr>
           </w:pPr>
-          <w:hyperlink w:anchor="_Toc239955765" w:history="1">
+          <w:hyperlink w:anchor="_Toc239966390" w:history="1">
             <w:r>
               <w:rPr>
                 <w:rStyle w:val="a5"/>
@@ -787,7 +787,7 @@
               <w:rPr>
                 <w:noProof/>
               </w:rPr>
-              <w:instrText xml:space="preserve"> PAGEREF _Toc239955765 \h </w:instrText>
+              <w:instrText xml:space="preserve"> PAGEREF _Toc239966390 \h </w:instrText>
             </w:r>
             <w:r>
               <w:rPr>
@@ -804,7 +804,7 @@
               <w:rPr>
                 <w:noProof/>
               </w:rPr>
-              <w:t>6</w:t>
+              <w:t>7</w:t>
             </w:r>
             <w:r>
               <w:rPr>
@@ -829,7 +829,7 @@
               <w14:ligatures w14:val="standardContextual"/>
             </w:rPr>
           </w:pPr>
-          <w:hyperlink w:anchor="_Toc239955766" w:history="1">
+          <w:hyperlink w:anchor="_Toc239966391" w:history="1">
             <w:r>
               <w:rPr>
                 <w:rStyle w:val="a5"/>
@@ -853,7 +853,7 @@
               <w:rPr>
                 <w:noProof/>
               </w:rPr>
-              <w:instrText xml:space="preserve"> PAGEREF _Toc239955766 \h </w:instrText>
+              <w:instrText xml:space="preserve"> PAGEREF _Toc239966391 \h </w:instrText>
             </w:r>
             <w:r>
               <w:rPr>
@@ -895,7 +895,7 @@
               <w14:ligatures w14:val="standardContextual"/>
             </w:rPr>
           </w:pPr>
-          <w:hyperlink w:anchor="_Toc239955767" w:history="1">
+          <w:hyperlink w:anchor="_Toc239966392" w:history="1">
             <w:r>
               <w:rPr>
                 <w:rStyle w:val="a5"/>
@@ -919,7 +919,7 @@
               <w:rPr>
                 <w:noProof/>
               </w:rPr>
-              <w:instrText xml:space="preserve"> PAGEREF _Toc239955767 \h </w:instrText>
+              <w:instrText xml:space="preserve"> PAGEREF _Toc239966392 \h </w:instrText>
             </w:r>
             <w:r>
               <w:rPr>
@@ -961,7 +961,7 @@
               <w14:ligatures w14:val="standardContextual"/>
             </w:rPr>
           </w:pPr>
-          <w:hyperlink w:anchor="_Toc239955768" w:history="1">
+          <w:hyperlink w:anchor="_Toc239966393" w:history="1">
             <w:r>
               <w:rPr>
                 <w:rStyle w:val="a5"/>
@@ -985,7 +985,7 @@
               <w:rPr>
                 <w:noProof/>
               </w:rPr>
-              <w:instrText xml:space="preserve"> PAGEREF _Toc239955768 \h </w:instrText>
+              <w:instrText xml:space="preserve"> PAGEREF _Toc239966393 \h </w:instrText>
             </w:r>
             <w:r>
               <w:rPr>
@@ -1027,7 +1027,7 @@
               <w14:ligatures w14:val="standardContextual"/>
             </w:rPr>
           </w:pPr>
-          <w:hyperlink w:anchor="_Toc239955769" w:history="1">
+          <w:hyperlink w:anchor="_Toc239966394" w:history="1">
             <w:r>
               <w:rPr>
                 <w:rStyle w:val="a5"/>
@@ -1051,7 +1051,7 @@
               <w:rPr>
                 <w:noProof/>
               </w:rPr>
-              <w:instrText xml:space="preserve"> PAGEREF _Toc239955769 \h </w:instrText>
+              <w:instrText xml:space="preserve"> PAGEREF _Toc239966394 \h </w:instrText>
             </w:r>
             <w:r>
               <w:rPr>
@@ -1093,7 +1093,7 @@
               <w14:ligatures w14:val="standardContextual"/>
             </w:rPr>
           </w:pPr>
-          <w:hyperlink w:anchor="_Toc239955770" w:history="1">
+          <w:hyperlink w:anchor="_Toc239966395" w:history="1">
             <w:r>
               <w:rPr>
                 <w:rStyle w:val="a5"/>
@@ -1117,7 +1117,7 @@
               <w:rPr>
                 <w:noProof/>
               </w:rPr>
-              <w:instrText xml:space="preserve"> PAGEREF _Toc239955770 \h </w:instrText>
+              <w:instrText xml:space="preserve"> PAGEREF _Toc239966395 \h </w:instrText>
             </w:r>
             <w:r>
               <w:rPr>
@@ -1159,7 +1159,7 @@
               <w14:ligatures w14:val="standardContextual"/>
             </w:rPr>
           </w:pPr>
-          <w:hyperlink w:anchor="_Toc239955771" w:history="1">
+          <w:hyperlink w:anchor="_Toc239966396" w:history="1">
             <w:r>
               <w:rPr>
                 <w:rStyle w:val="a5"/>
@@ -1183,7 +1183,7 @@
               <w:rPr>
                 <w:noProof/>
               </w:rPr>
-              <w:instrText xml:space="preserve"> PAGEREF _Toc239955771 \h </w:instrText>
+              <w:instrText xml:space="preserve"> PAGEREF _Toc239966396 \h </w:instrText>
             </w:r>
             <w:r>
               <w:rPr>
@@ -1225,7 +1225,7 @@
               <w14:ligatures w14:val="standardContextual"/>
             </w:rPr>
           </w:pPr>
-          <w:hyperlink w:anchor="_Toc239955772" w:history="1">
+          <w:hyperlink w:anchor="_Toc239966397" w:history="1">
             <w:r>
               <w:rPr>
                 <w:rStyle w:val="a5"/>
@@ -1249,7 +1249,7 @@
               <w:rPr>
                 <w:noProof/>
               </w:rPr>
-              <w:instrText xml:space="preserve"> PAGEREF _Toc239955772 \h </w:instrText>
+              <w:instrText xml:space="preserve"> PAGEREF _Toc239966397 \h </w:instrText>
             </w:r>
             <w:r>
               <w:rPr>
@@ -1266,7 +1266,7 @@
               <w:rPr>
                 <w:noProof/>
               </w:rPr>
-              <w:t>10</w:t>
+              <w:t>11</w:t>
             </w:r>
             <w:r>
               <w:rPr>
@@ -1291,7 +1291,7 @@
               <w14:ligatures w14:val="standardContextual"/>
             </w:rPr>
           </w:pPr>
-          <w:hyperlink w:anchor="_Toc239955773" w:history="1">
+          <w:hyperlink w:anchor="_Toc239966398" w:history="1">
             <w:r>
               <w:rPr>
                 <w:rStyle w:val="a5"/>
@@ -1315,7 +1315,7 @@
               <w:rPr>
                 <w:noProof/>
               </w:rPr>
-              <w:instrText xml:space="preserve"> PAGEREF _Toc239955773 \h </w:instrText>
+              <w:instrText xml:space="preserve"> PAGEREF _Toc239966398 \h </w:instrText>
             </w:r>
             <w:r>
               <w:rPr>
@@ -1332,7 +1332,7 @@
               <w:rPr>
                 <w:noProof/>
               </w:rPr>
-              <w:t>10</w:t>
+              <w:t>11</w:t>
             </w:r>
             <w:r>
               <w:rPr>
@@ -1357,7 +1357,7 @@
               <w14:ligatures w14:val="standardContextual"/>
             </w:rPr>
           </w:pPr>
-          <w:hyperlink w:anchor="_Toc239955774" w:history="1">
+          <w:hyperlink w:anchor="_Toc239966399" w:history="1">
             <w:r>
               <w:rPr>
                 <w:rStyle w:val="a5"/>
@@ -1381,7 +1381,7 @@
               <w:rPr>
                 <w:noProof/>
               </w:rPr>
-              <w:instrText xml:space="preserve"> PAGEREF _Toc239955774 \h </w:instrText>
+              <w:instrText xml:space="preserve"> PAGEREF _Toc239966399 \h </w:instrText>
             </w:r>
             <w:r>
               <w:rPr>
@@ -1398,7 +1398,7 @@
               <w:rPr>
                 <w:noProof/>
               </w:rPr>
-              <w:t>10</w:t>
+              <w:t>11</w:t>
             </w:r>
             <w:r>
               <w:rPr>
@@ -1423,7 +1423,7 @@
               <w14:ligatures w14:val="standardContextual"/>
             </w:rPr>
           </w:pPr>
-          <w:hyperlink w:anchor="_Toc239955775" w:history="1">
+          <w:hyperlink w:anchor="_Toc239966400" w:history="1">
             <w:r>
               <w:rPr>
                 <w:rStyle w:val="a5"/>
@@ -1447,7 +1447,7 @@
               <w:rPr>
                 <w:noProof/>
               </w:rPr>
-              <w:instrText xml:space="preserve"> PAGEREF _Toc239955775 \h </w:instrText>
+              <w:instrText xml:space="preserve"> PAGEREF _Toc239966400 \h </w:instrText>
             </w:r>
             <w:r>
               <w:rPr>
@@ -1464,7 +1464,7 @@
               <w:rPr>
                 <w:noProof/>
               </w:rPr>
-              <w:t>10</w:t>
+              <w:t>11</w:t>
             </w:r>
             <w:r>
               <w:rPr>
@@ -1490,7 +1490,7 @@
       <w:pPr>
         <w:pStyle w:val="1"/>
       </w:pPr>
-      <w:bookmarkStart w:id="0" w:name="_Toc239955755"/>
+      <w:bookmarkStart w:id="0" w:name="_Toc239966380"/>
       <w:r>
         <w:lastRenderedPageBreak/>
         <w:t>1. Purpose</w:t>
@@ -1517,7 +1517,7 @@
       <w:pPr>
         <w:pStyle w:val="1"/>
       </w:pPr>
-      <w:bookmarkStart w:id="1" w:name="_Toc239955756"/>
+      <w:bookmarkStart w:id="1" w:name="_Toc239966381"/>
       <w:r>
         <w:t>2. Scope and non-goals</w:t>
       </w:r>
@@ -1592,7 +1592,7 @@
       <w:pPr>
         <w:pStyle w:val="1"/>
       </w:pPr>
-      <w:bookmarkStart w:id="2" w:name="_Toc239955757"/>
+      <w:bookmarkStart w:id="2" w:name="_Toc239966382"/>
       <w:r>
         <w:t>3. Users and operating environment</w:t>
       </w:r>
@@ -1654,7 +1654,7 @@
       <w:pPr>
         <w:pStyle w:val="1"/>
       </w:pPr>
-      <w:bookmarkStart w:id="3" w:name="_Toc239955758"/>
+      <w:bookmarkStart w:id="3" w:name="_Toc239966383"/>
       <w:r>
         <w:t>4. Input</w:t>
       </w:r>
@@ -1886,7 +1886,6 @@
                 <w:sz w:val="18"/>
                 <w:szCs w:val="18"/>
               </w:rPr>
-              <w:lastRenderedPageBreak/>
               <w:t>SDHB c.574T&gt;C (p.Cys192Arg) / SDHB p.Cys192Arg (c.574T&gt;C)</w:t>
             </w:r>
           </w:p>
@@ -2474,7 +2473,7 @@
       <w:pPr>
         <w:pStyle w:val="1"/>
       </w:pPr>
-      <w:bookmarkStart w:id="4" w:name="_Toc239955759"/>
+      <w:bookmarkStart w:id="4" w:name="_Toc239966384"/>
       <w:r>
         <w:t>5. Data sources</w:t>
       </w:r>
@@ -2484,7 +2483,7 @@
       <w:pPr>
         <w:pStyle w:val="2"/>
       </w:pPr>
-      <w:bookmarkStart w:id="5" w:name="_Toc239955760"/>
+      <w:bookmarkStart w:id="5" w:name="_Toc239966385"/>
       <w:r>
         <w:t>5.1 Local index (offline)</w:t>
       </w:r>
@@ -2827,15 +2826,7 @@
                 <w:sz w:val="18"/>
                 <w:szCs w:val="18"/>
               </w:rPr>
-              <w:t xml:space="preserve">Comparison with a conventional </w:t>
-            </w:r>
-            <w:r>
-              <w:rPr>
-                <w:sz w:val="18"/>
-                <w:szCs w:val="18"/>
-              </w:rPr>
-              <w:lastRenderedPageBreak/>
-              <w:t>ensemble predictor</w:t>
+              <w:t>Comparison with a conventional ensemble predictor</w:t>
             </w:r>
           </w:p>
         </w:tc>
@@ -2866,7 +2857,6 @@
                 <w:sz w:val="18"/>
                 <w:szCs w:val="18"/>
               </w:rPr>
-              <w:lastRenderedPageBreak/>
               <w:t>ClinVar variant_summary</w:t>
             </w:r>
           </w:p>
@@ -3090,7 +3080,7 @@
       <w:pPr>
         <w:pStyle w:val="2"/>
       </w:pPr>
-      <w:bookmarkStart w:id="6" w:name="_Toc239955761"/>
+      <w:bookmarkStart w:id="6" w:name="_Toc239966386"/>
       <w:r>
         <w:t>5.2 Public API lookups (online, switchable)</w:t>
       </w:r>
@@ -3783,7 +3773,7 @@
                 <w:sz w:val="18"/>
                 <w:szCs w:val="18"/>
               </w:rPr>
-              <w:t>Per-condition classification, submission count and review status</w:t>
+              <w:t>Per-condition classification, submission count and review status; counts of the mode of inheritance optionally entered by submitters (AD/AR abbreviations, for reference)</w:t>
             </w:r>
           </w:p>
         </w:tc>
@@ -3952,7 +3942,7 @@
       <w:pPr>
         <w:pStyle w:val="1"/>
       </w:pPr>
-      <w:bookmarkStart w:id="7" w:name="_Toc239955762"/>
+      <w:bookmarkStart w:id="7" w:name="_Toc239966387"/>
       <w:r>
         <w:t>6. Processing pipeline</w:t>
       </w:r>
@@ -4053,7 +4043,7 @@
       <w:pPr>
         <w:pStyle w:val="1"/>
       </w:pPr>
-      <w:bookmarkStart w:id="8" w:name="_Toc239955763"/>
+      <w:bookmarkStart w:id="8" w:name="_Toc239966388"/>
       <w:r>
         <w:t>7. Mapping of evidence to ACMG criteria</w:t>
       </w:r>
@@ -5192,7 +5182,7 @@
                 <w:sz w:val="18"/>
                 <w:szCs w:val="18"/>
               </w:rPr>
-              <w:t>Germline significance, review stars (three stars or more emphasised as an expert-panel classification), conditions ordered by submission count, with a note that conditions are submitter-entered and unverified and that counts are submissions, not cases</w:t>
+              <w:t>Germline significance, review stars (three stars or more emphasised as an expert-panel classification), conditions ordered by submission count, with a note that conditions are submitter-entered and unverified and that counts are submissions, not cases. The mode of inheritance entered by submitters is summarised in one line as AD/AR counts (for reference; ClinGen remains the basis)</w:t>
             </w:r>
           </w:p>
         </w:tc>
@@ -5215,7 +5205,7 @@
       <w:pPr>
         <w:pStyle w:val="2"/>
       </w:pPr>
-      <w:bookmarkStart w:id="9" w:name="_Toc239955764"/>
+      <w:bookmarkStart w:id="9" w:name="_Toc239966389"/>
       <w:r>
         <w:t>7.1 Model adopted for PP3/BP4, and consistency with SpliceAI</w:t>
       </w:r>
@@ -5702,7 +5692,7 @@
       <w:pPr>
         <w:pStyle w:val="2"/>
       </w:pPr>
-      <w:bookmarkStart w:id="10" w:name="_Toc239955765"/>
+      <w:bookmarkStart w:id="10" w:name="_Toc239966390"/>
       <w:r>
         <w:t>7.2 Population-frequency retrieval states and PM2</w:t>
       </w:r>
@@ -6445,7 +6435,7 @@
       <w:pPr>
         <w:pStyle w:val="1"/>
       </w:pPr>
-      <w:bookmarkStart w:id="11" w:name="_Toc239955766"/>
+      <w:bookmarkStart w:id="11" w:name="_Toc239966391"/>
       <w:r>
         <w:t>8. Variants without a FuncVEP score</w:t>
       </w:r>
@@ -6534,7 +6524,7 @@
       <w:pPr>
         <w:pStyle w:val="1"/>
       </w:pPr>
-      <w:bookmarkStart w:id="12" w:name="_Toc239955767"/>
+      <w:bookmarkStart w:id="12" w:name="_Toc239966392"/>
       <w:r>
         <w:t>9. Report structure</w:t>
       </w:r>
@@ -6656,7 +6646,7 @@
       <w:pPr>
         <w:pStyle w:val="1"/>
       </w:pPr>
-      <w:bookmarkStart w:id="13" w:name="_Toc239955768"/>
+      <w:bookmarkStart w:id="13" w:name="_Toc239966393"/>
       <w:r>
         <w:t>10. Verification</w:t>
       </w:r>
@@ -7541,7 +7531,7 @@
       <w:pPr>
         <w:pStyle w:val="1"/>
       </w:pPr>
-      <w:bookmarkStart w:id="14" w:name="_Toc239955769"/>
+      <w:bookmarkStart w:id="14" w:name="_Toc239966394"/>
       <w:r>
         <w:t>11. Interpretation limits</w:t>
       </w:r>
@@ -7642,7 +7632,7 @@
       <w:pPr>
         <w:pStyle w:val="1"/>
       </w:pPr>
-      <w:bookmarkStart w:id="15" w:name="_Toc239955770"/>
+      <w:bookmarkStart w:id="15" w:name="_Toc239966395"/>
       <w:r>
         <w:t>12. Licensing and data governance</w:t>
       </w:r>
@@ -7691,7 +7681,7 @@
       <w:pPr>
         <w:pStyle w:val="1"/>
       </w:pPr>
-      <w:bookmarkStart w:id="16" w:name="_Toc239955771"/>
+      <w:bookmarkStart w:id="16" w:name="_Toc239966396"/>
       <w:r>
         <w:t>13. Acknowledgements</w:t>
       </w:r>
@@ -7714,7 +7704,7 @@
       <w:pPr>
         <w:pStyle w:val="1"/>
       </w:pPr>
-      <w:bookmarkStart w:id="17" w:name="_Toc239955772"/>
+      <w:bookmarkStart w:id="17" w:name="_Toc239966397"/>
       <w:r>
         <w:t>Appendix A. PP3/BP4 thresholds (Supplementary Table 13)</w:t>
       </w:r>
@@ -8990,7 +8980,7 @@
       <w:pPr>
         <w:pStyle w:val="1"/>
       </w:pPr>
-      <w:bookmarkStart w:id="18" w:name="_Toc239955773"/>
+      <w:bookmarkStart w:id="18" w:name="_Toc239966398"/>
       <w:r>
         <w:t>Appendix B. Components</w:t>
       </w:r>
@@ -9684,7 +9674,7 @@
       <w:pPr>
         <w:pStyle w:val="1"/>
       </w:pPr>
-      <w:bookmarkStart w:id="19" w:name="_Toc239955774"/>
+      <w:bookmarkStart w:id="19" w:name="_Toc239966399"/>
       <w:r>
         <w:t>Appendix C. Questions for the authors</w:t>
       </w:r>
@@ -9733,7 +9723,7 @@
       <w:pPr>
         <w:pStyle w:val="1"/>
       </w:pPr>
-      <w:bookmarkStart w:id="20" w:name="_Toc239955775"/>
+      <w:bookmarkStart w:id="20" w:name="_Toc239966400"/>
       <w:r>
         <w:t>Appendix D. Changes from version 1.0 (response to the design review)</w:t>
       </w:r>
@@ -9980,10 +9970,10 @@
 <file path=word/numbering.xml><?xml version="1.0" encoding="utf-8"?>
 <w:numbering xmlns:wpc="http://schemas.microsoft.com/office/word/2010/wordprocessingCanvas" xmlns:cx="http://schemas.microsoft.com/office/drawing/2014/chartex" xmlns:cx1="http://schemas.microsoft.com/office/drawing/2015/9/8/chartex" xmlns:cx2="http://schemas.microsoft.com/office/drawing/2015/10/21/chartex" xmlns:cx3="http://schemas.microsoft.com/office/drawing/2016/5/9/chartex" xmlns:cx4="http://schemas.microsoft.com/office/drawing/2016/5/10/chartex" xmlns:cx5="http://schemas.microsoft.com/office/drawing/2016/5/11/chartex" xmlns:cx6="http://schemas.microsoft.com/office/drawing/2016/5/12/chartex" xmlns:cx7="http://schemas.microsoft.com/office/drawing/2016/5/13/chartex" xmlns:cx8="http://schemas.microsoft.com/office/drawing/2016/5/14/chartex" xmlns:mc="http://schemas.openxmlformats.org/markup-compatibility/2006" xmlns:aink="http://schemas.microsoft.com/office/drawing/2016/ink" xmlns:am3d="http://schemas.microsoft.com/office/drawing/2017/model3d" xmlns:o="urn:schemas-microsoft-com:office:office" xmlns:oel="http://schemas.microsoft.com/office/2019/extlst" xmlns:r="http://schemas.openxmlformats.org/officeDocument/2006/relationships" xmlns:m="http://schemas.openxmlformats.org/officeDocument/2006/math" xmlns:v="urn:schemas-microsoft-com:vml" xmlns:wp14="http://schemas.microsoft.com/office/word/2010/wordprocessingDrawing" xmlns:wp="http://schemas.openxmlformats.org/drawingml/2006/wordprocessingDrawing" xmlns:w10="urn:schemas-microsoft-com:office:word" xmlns:w="http://schemas.openxmlformats.org/wordprocessingml/2006/main" xmlns:w14="http://schemas.microsoft.com/office/word/2010/wordml" xmlns:w15="http://schemas.microsoft.com/office/word/2012/wordml" xmlns:w16cex="http://schemas.microsoft.com/office/word/2018/wordml/cex" xmlns:w16cid="http://schemas.microsoft.com/office/word/2016/wordml/cid" xmlns:w16="http://schemas.microsoft.com/office/word/2018/wordml" xmlns:w16du="http://schemas.microsoft.com/office/word/2023/wordml/word16du" xmlns:w16sdtdh="http://schemas.microsoft.com/office/word/2020/wordml/sdtdatahash" xmlns:w16sdtfl="http://schemas.microsoft.com/office/word/2024/wordml/sdtformatlock" xmlns:w16se="http://schemas.microsoft.com/office/word/2015/wordml/symex" xmlns:wpg="http://schemas.microsoft.com/office/word/2010/wordprocessingGroup" xmlns:wpi="http://schemas.microsoft.com/office/word/2010/wordprocessingInk" xmlns:wne="http://schemas.microsoft.com/office/word/2006/wordml" xmlns:wps="http://schemas.microsoft.com/office/word/2010/wordprocessingShape" mc:Ignorable="w14 w15 w16se w16cid w16 w16cex w16sdtdh w16sdtfl w16du wp14">
   <w:abstractNum w:abstractNumId="0" w15:restartNumberingAfterBreak="0">
-    <w:nsid w:val="04612110"/>
+    <w:nsid w:val="074D547D"/>
     <w:multiLevelType w:val="hybridMultilevel"/>
-    <w:tmpl w:val="15DE50A0"/>
-    <w:lvl w:ilvl="0" w:tplc="95FEBF60">
+    <w:tmpl w:val="199A89C0"/>
+    <w:lvl w:ilvl="0" w:tplc="20CA31AC">
       <w:start w:val="1"/>
       <w:numFmt w:val="decimal"/>
       <w:lvlText w:val="%1."/>
@@ -9992,52 +9982,322 @@
         <w:ind w:left="540" w:hanging="360"/>
       </w:pPr>
     </w:lvl>
-    <w:lvl w:ilvl="1" w:tplc="5E4CE91E">
+    <w:lvl w:ilvl="1" w:tplc="21228084">
       <w:numFmt w:val="decimal"/>
       <w:lvlText w:val=""/>
       <w:lvlJc w:val="left"/>
     </w:lvl>
-    <w:lvl w:ilvl="2" w:tplc="C5CEEBF0">
+    <w:lvl w:ilvl="2" w:tplc="C44A0338">
       <w:numFmt w:val="decimal"/>
       <w:lvlText w:val=""/>
       <w:lvlJc w:val="left"/>
     </w:lvl>
-    <w:lvl w:ilvl="3" w:tplc="E4D69E7A">
+    <w:lvl w:ilvl="3" w:tplc="E9D8A338">
       <w:numFmt w:val="decimal"/>
       <w:lvlText w:val=""/>
       <w:lvlJc w:val="left"/>
     </w:lvl>
-    <w:lvl w:ilvl="4" w:tplc="2714733C">
+    <w:lvl w:ilvl="4" w:tplc="0CFA46FC">
       <w:numFmt w:val="decimal"/>
       <w:lvlText w:val=""/>
       <w:lvlJc w:val="left"/>
     </w:lvl>
-    <w:lvl w:ilvl="5" w:tplc="4754F6B8">
+    <w:lvl w:ilvl="5" w:tplc="BE844F00">
       <w:numFmt w:val="decimal"/>
       <w:lvlText w:val=""/>
       <w:lvlJc w:val="left"/>
     </w:lvl>
-    <w:lvl w:ilvl="6" w:tplc="B1E41348">
+    <w:lvl w:ilvl="6" w:tplc="02CCCA10">
       <w:numFmt w:val="decimal"/>
       <w:lvlText w:val=""/>
       <w:lvlJc w:val="left"/>
     </w:lvl>
-    <w:lvl w:ilvl="7" w:tplc="34783F06">
+    <w:lvl w:ilvl="7" w:tplc="802A40F2">
       <w:numFmt w:val="decimal"/>
       <w:lvlText w:val=""/>
       <w:lvlJc w:val="left"/>
     </w:lvl>
-    <w:lvl w:ilvl="8" w:tplc="1606340E">
+    <w:lvl w:ilvl="8" w:tplc="EE6E8C64">
       <w:numFmt w:val="decimal"/>
       <w:lvlText w:val=""/>
       <w:lvlJc w:val="left"/>
     </w:lvl>
   </w:abstractNum>
   <w:abstractNum w:abstractNumId="1" w15:restartNumberingAfterBreak="0">
-    <w:nsid w:val="101F28A2"/>
+    <w:nsid w:val="0FB838C5"/>
     <w:multiLevelType w:val="hybridMultilevel"/>
-    <w:tmpl w:val="04E4EEC2"/>
-    <w:lvl w:ilvl="0" w:tplc="3992E57E">
+    <w:tmpl w:val="591A965C"/>
+    <w:lvl w:ilvl="0" w:tplc="B950EA9C">
+      <w:start w:val="1"/>
+      <w:numFmt w:val="decimal"/>
+      <w:lvlText w:val="%1."/>
+      <w:lvlJc w:val="left"/>
+      <w:pPr>
+        <w:ind w:left="540" w:hanging="360"/>
+      </w:pPr>
+    </w:lvl>
+    <w:lvl w:ilvl="1" w:tplc="0CB6DCE4">
+      <w:numFmt w:val="decimal"/>
+      <w:lvlText w:val=""/>
+      <w:lvlJc w:val="left"/>
+    </w:lvl>
+    <w:lvl w:ilvl="2" w:tplc="B5786EA8">
+      <w:numFmt w:val="decimal"/>
+      <w:lvlText w:val=""/>
+      <w:lvlJc w:val="left"/>
+    </w:lvl>
+    <w:lvl w:ilvl="3" w:tplc="C50838C0">
+      <w:numFmt w:val="decimal"/>
+      <w:lvlText w:val=""/>
+      <w:lvlJc w:val="left"/>
+    </w:lvl>
+    <w:lvl w:ilvl="4" w:tplc="A8A083F8">
+      <w:numFmt w:val="decimal"/>
+      <w:lvlText w:val=""/>
+      <w:lvlJc w:val="left"/>
+    </w:lvl>
+    <w:lvl w:ilvl="5" w:tplc="6AF0FAD0">
+      <w:numFmt w:val="decimal"/>
+      <w:lvlText w:val=""/>
+      <w:lvlJc w:val="left"/>
+    </w:lvl>
+    <w:lvl w:ilvl="6" w:tplc="A0766274">
+      <w:numFmt w:val="decimal"/>
+      <w:lvlText w:val=""/>
+      <w:lvlJc w:val="left"/>
+    </w:lvl>
+    <w:lvl w:ilvl="7" w:tplc="8C4E283A">
+      <w:numFmt w:val="decimal"/>
+      <w:lvlText w:val=""/>
+      <w:lvlJc w:val="left"/>
+    </w:lvl>
+    <w:lvl w:ilvl="8" w:tplc="A2E0FE0C">
+      <w:numFmt w:val="decimal"/>
+      <w:lvlText w:val=""/>
+      <w:lvlJc w:val="left"/>
+    </w:lvl>
+  </w:abstractNum>
+  <w:abstractNum w:abstractNumId="2" w15:restartNumberingAfterBreak="0">
+    <w:nsid w:val="13042D9D"/>
+    <w:multiLevelType w:val="hybridMultilevel"/>
+    <w:tmpl w:val="4596E6F4"/>
+    <w:lvl w:ilvl="0" w:tplc="CA1C34C0">
+      <w:start w:val="1"/>
+      <w:numFmt w:val="decimal"/>
+      <w:lvlText w:val="%1."/>
+      <w:lvlJc w:val="left"/>
+      <w:pPr>
+        <w:ind w:left="540" w:hanging="360"/>
+      </w:pPr>
+    </w:lvl>
+    <w:lvl w:ilvl="1" w:tplc="2050EBE8">
+      <w:numFmt w:val="decimal"/>
+      <w:lvlText w:val=""/>
+      <w:lvlJc w:val="left"/>
+    </w:lvl>
+    <w:lvl w:ilvl="2" w:tplc="B8CE25A4">
+      <w:numFmt w:val="decimal"/>
+      <w:lvlText w:val=""/>
+      <w:lvlJc w:val="left"/>
+    </w:lvl>
+    <w:lvl w:ilvl="3" w:tplc="46A6D674">
+      <w:numFmt w:val="decimal"/>
+      <w:lvlText w:val=""/>
+      <w:lvlJc w:val="left"/>
+    </w:lvl>
+    <w:lvl w:ilvl="4" w:tplc="AFCA5706">
+      <w:numFmt w:val="decimal"/>
+      <w:lvlText w:val=""/>
+      <w:lvlJc w:val="left"/>
+    </w:lvl>
+    <w:lvl w:ilvl="5" w:tplc="03D2EDA0">
+      <w:numFmt w:val="decimal"/>
+      <w:lvlText w:val=""/>
+      <w:lvlJc w:val="left"/>
+    </w:lvl>
+    <w:lvl w:ilvl="6" w:tplc="A9A0D402">
+      <w:numFmt w:val="decimal"/>
+      <w:lvlText w:val=""/>
+      <w:lvlJc w:val="left"/>
+    </w:lvl>
+    <w:lvl w:ilvl="7" w:tplc="DBF010AA">
+      <w:numFmt w:val="decimal"/>
+      <w:lvlText w:val=""/>
+      <w:lvlJc w:val="left"/>
+    </w:lvl>
+    <w:lvl w:ilvl="8" w:tplc="C0D0A06E">
+      <w:numFmt w:val="decimal"/>
+      <w:lvlText w:val=""/>
+      <w:lvlJc w:val="left"/>
+    </w:lvl>
+  </w:abstractNum>
+  <w:abstractNum w:abstractNumId="3" w15:restartNumberingAfterBreak="0">
+    <w:nsid w:val="1388782A"/>
+    <w:multiLevelType w:val="hybridMultilevel"/>
+    <w:tmpl w:val="8FB0C084"/>
+    <w:lvl w:ilvl="0" w:tplc="FCA4E85E">
+      <w:start w:val="1"/>
+      <w:numFmt w:val="decimal"/>
+      <w:lvlText w:val="%1."/>
+      <w:lvlJc w:val="left"/>
+      <w:pPr>
+        <w:ind w:left="540" w:hanging="360"/>
+      </w:pPr>
+    </w:lvl>
+    <w:lvl w:ilvl="1" w:tplc="E028FD88">
+      <w:numFmt w:val="decimal"/>
+      <w:lvlText w:val=""/>
+      <w:lvlJc w:val="left"/>
+    </w:lvl>
+    <w:lvl w:ilvl="2" w:tplc="05723DC6">
+      <w:numFmt w:val="decimal"/>
+      <w:lvlText w:val=""/>
+      <w:lvlJc w:val="left"/>
+    </w:lvl>
+    <w:lvl w:ilvl="3" w:tplc="376C9DDE">
+      <w:numFmt w:val="decimal"/>
+      <w:lvlText w:val=""/>
+      <w:lvlJc w:val="left"/>
+    </w:lvl>
+    <w:lvl w:ilvl="4" w:tplc="FD949E0A">
+      <w:numFmt w:val="decimal"/>
+      <w:lvlText w:val=""/>
+      <w:lvlJc w:val="left"/>
+    </w:lvl>
+    <w:lvl w:ilvl="5" w:tplc="5E289FDA">
+      <w:numFmt w:val="decimal"/>
+      <w:lvlText w:val=""/>
+      <w:lvlJc w:val="left"/>
+    </w:lvl>
+    <w:lvl w:ilvl="6" w:tplc="D5A84EE8">
+      <w:numFmt w:val="decimal"/>
+      <w:lvlText w:val=""/>
+      <w:lvlJc w:val="left"/>
+    </w:lvl>
+    <w:lvl w:ilvl="7" w:tplc="6F462824">
+      <w:numFmt w:val="decimal"/>
+      <w:lvlText w:val=""/>
+      <w:lvlJc w:val="left"/>
+    </w:lvl>
+    <w:lvl w:ilvl="8" w:tplc="5E58E634">
+      <w:numFmt w:val="decimal"/>
+      <w:lvlText w:val=""/>
+      <w:lvlJc w:val="left"/>
+    </w:lvl>
+  </w:abstractNum>
+  <w:abstractNum w:abstractNumId="4" w15:restartNumberingAfterBreak="0">
+    <w:nsid w:val="15C44217"/>
+    <w:multiLevelType w:val="hybridMultilevel"/>
+    <w:tmpl w:val="80640F70"/>
+    <w:lvl w:ilvl="0" w:tplc="A1C8102C">
+      <w:start w:val="1"/>
+      <w:numFmt w:val="decimal"/>
+      <w:lvlText w:val="%1."/>
+      <w:lvlJc w:val="left"/>
+      <w:pPr>
+        <w:ind w:left="540" w:hanging="360"/>
+      </w:pPr>
+    </w:lvl>
+    <w:lvl w:ilvl="1" w:tplc="E62CBDC6">
+      <w:numFmt w:val="decimal"/>
+      <w:lvlText w:val=""/>
+      <w:lvlJc w:val="left"/>
+    </w:lvl>
+    <w:lvl w:ilvl="2" w:tplc="C6FA1AF8">
+      <w:numFmt w:val="decimal"/>
+      <w:lvlText w:val=""/>
+      <w:lvlJc w:val="left"/>
+    </w:lvl>
+    <w:lvl w:ilvl="3" w:tplc="18CC9A04">
+      <w:numFmt w:val="decimal"/>
+      <w:lvlText w:val=""/>
+      <w:lvlJc w:val="left"/>
+    </w:lvl>
+    <w:lvl w:ilvl="4" w:tplc="F8382904">
+      <w:numFmt w:val="decimal"/>
+      <w:lvlText w:val=""/>
+      <w:lvlJc w:val="left"/>
+    </w:lvl>
+    <w:lvl w:ilvl="5" w:tplc="D3B8D7F4">
+      <w:numFmt w:val="decimal"/>
+      <w:lvlText w:val=""/>
+      <w:lvlJc w:val="left"/>
+    </w:lvl>
+    <w:lvl w:ilvl="6" w:tplc="43C42E0E">
+      <w:numFmt w:val="decimal"/>
+      <w:lvlText w:val=""/>
+      <w:lvlJc w:val="left"/>
+    </w:lvl>
+    <w:lvl w:ilvl="7" w:tplc="44280CAC">
+      <w:numFmt w:val="decimal"/>
+      <w:lvlText w:val=""/>
+      <w:lvlJc w:val="left"/>
+    </w:lvl>
+    <w:lvl w:ilvl="8" w:tplc="64769EF0">
+      <w:numFmt w:val="decimal"/>
+      <w:lvlText w:val=""/>
+      <w:lvlJc w:val="left"/>
+    </w:lvl>
+  </w:abstractNum>
+  <w:abstractNum w:abstractNumId="5" w15:restartNumberingAfterBreak="0">
+    <w:nsid w:val="1ECC248A"/>
+    <w:multiLevelType w:val="hybridMultilevel"/>
+    <w:tmpl w:val="15886738"/>
+    <w:lvl w:ilvl="0" w:tplc="2F762D08">
+      <w:start w:val="1"/>
+      <w:numFmt w:val="decimal"/>
+      <w:lvlText w:val="%1."/>
+      <w:lvlJc w:val="left"/>
+      <w:pPr>
+        <w:ind w:left="540" w:hanging="360"/>
+      </w:pPr>
+    </w:lvl>
+    <w:lvl w:ilvl="1" w:tplc="E006ED9C">
+      <w:numFmt w:val="decimal"/>
+      <w:lvlText w:val=""/>
+      <w:lvlJc w:val="left"/>
+    </w:lvl>
+    <w:lvl w:ilvl="2" w:tplc="42A4D87C">
+      <w:numFmt w:val="decimal"/>
+      <w:lvlText w:val=""/>
+      <w:lvlJc w:val="left"/>
+    </w:lvl>
+    <w:lvl w:ilvl="3" w:tplc="88E41338">
+      <w:numFmt w:val="decimal"/>
+      <w:lvlText w:val=""/>
+      <w:lvlJc w:val="left"/>
+    </w:lvl>
+    <w:lvl w:ilvl="4" w:tplc="C324F068">
+      <w:numFmt w:val="decimal"/>
+      <w:lvlText w:val=""/>
+      <w:lvlJc w:val="left"/>
+    </w:lvl>
+    <w:lvl w:ilvl="5" w:tplc="6F3CC8FE">
+      <w:numFmt w:val="decimal"/>
+      <w:lvlText w:val=""/>
+      <w:lvlJc w:val="left"/>
+    </w:lvl>
+    <w:lvl w:ilvl="6" w:tplc="48E87B0E">
+      <w:numFmt w:val="decimal"/>
+      <w:lvlText w:val=""/>
+      <w:lvlJc w:val="left"/>
+    </w:lvl>
+    <w:lvl w:ilvl="7" w:tplc="43F230A8">
+      <w:numFmt w:val="decimal"/>
+      <w:lvlText w:val=""/>
+      <w:lvlJc w:val="left"/>
+    </w:lvl>
+    <w:lvl w:ilvl="8" w:tplc="1A08F868">
+      <w:numFmt w:val="decimal"/>
+      <w:lvlText w:val=""/>
+      <w:lvlJc w:val="left"/>
+    </w:lvl>
+  </w:abstractNum>
+  <w:abstractNum w:abstractNumId="6" w15:restartNumberingAfterBreak="0">
+    <w:nsid w:val="26886F1C"/>
+    <w:multiLevelType w:val="hybridMultilevel"/>
+    <w:tmpl w:val="A48ADF92"/>
+    <w:lvl w:ilvl="0" w:tplc="8A486378">
       <w:start w:val="1"/>
       <w:numFmt w:val="bullet"/>
       <w:lvlText w:val="•"/>
@@ -10046,52 +10306,52 @@
         <w:ind w:left="540" w:hanging="300"/>
       </w:pPr>
     </w:lvl>
-    <w:lvl w:ilvl="1" w:tplc="BEDED56A">
+    <w:lvl w:ilvl="1" w:tplc="8F1495D2">
       <w:numFmt w:val="decimal"/>
       <w:lvlText w:val=""/>
       <w:lvlJc w:val="left"/>
     </w:lvl>
-    <w:lvl w:ilvl="2" w:tplc="F662C5B6">
+    <w:lvl w:ilvl="2" w:tplc="FDF405BE">
       <w:numFmt w:val="decimal"/>
       <w:lvlText w:val=""/>
       <w:lvlJc w:val="left"/>
     </w:lvl>
-    <w:lvl w:ilvl="3" w:tplc="557CF4FA">
+    <w:lvl w:ilvl="3" w:tplc="896A35A8">
       <w:numFmt w:val="decimal"/>
       <w:lvlText w:val=""/>
       <w:lvlJc w:val="left"/>
     </w:lvl>
-    <w:lvl w:ilvl="4" w:tplc="B22E1706">
+    <w:lvl w:ilvl="4" w:tplc="C4A22DF2">
       <w:numFmt w:val="decimal"/>
       <w:lvlText w:val=""/>
       <w:lvlJc w:val="left"/>
     </w:lvl>
-    <w:lvl w:ilvl="5" w:tplc="91FAC286">
+    <w:lvl w:ilvl="5" w:tplc="227448AE">
       <w:numFmt w:val="decimal"/>
       <w:lvlText w:val=""/>
       <w:lvlJc w:val="left"/>
     </w:lvl>
-    <w:lvl w:ilvl="6" w:tplc="1DACD336">
+    <w:lvl w:ilvl="6" w:tplc="B448ACAE">
       <w:numFmt w:val="decimal"/>
       <w:lvlText w:val=""/>
       <w:lvlJc w:val="left"/>
     </w:lvl>
-    <w:lvl w:ilvl="7" w:tplc="3738EBEE">
+    <w:lvl w:ilvl="7" w:tplc="421CA1DC">
       <w:numFmt w:val="decimal"/>
       <w:lvlText w:val=""/>
       <w:lvlJc w:val="left"/>
     </w:lvl>
-    <w:lvl w:ilvl="8" w:tplc="957E91FC">
+    <w:lvl w:ilvl="8" w:tplc="E530F2F0">
       <w:numFmt w:val="decimal"/>
       <w:lvlText w:val=""/>
       <w:lvlJc w:val="left"/>
     </w:lvl>
   </w:abstractNum>
-  <w:abstractNum w:abstractNumId="2" w15:restartNumberingAfterBreak="0">
-    <w:nsid w:val="120C19DC"/>
+  <w:abstractNum w:abstractNumId="7" w15:restartNumberingAfterBreak="0">
+    <w:nsid w:val="37684119"/>
     <w:multiLevelType w:val="hybridMultilevel"/>
-    <w:tmpl w:val="6C708102"/>
-    <w:lvl w:ilvl="0" w:tplc="B28C1E8E">
+    <w:tmpl w:val="4E184C38"/>
+    <w:lvl w:ilvl="0" w:tplc="900A7AF4">
       <w:start w:val="1"/>
       <w:numFmt w:val="decimal"/>
       <w:lvlText w:val="%1."/>
@@ -10100,52 +10360,52 @@
         <w:ind w:left="540" w:hanging="360"/>
       </w:pPr>
     </w:lvl>
-    <w:lvl w:ilvl="1" w:tplc="9D845D64">
+    <w:lvl w:ilvl="1" w:tplc="3FFE6488">
       <w:numFmt w:val="decimal"/>
       <w:lvlText w:val=""/>
       <w:lvlJc w:val="left"/>
     </w:lvl>
-    <w:lvl w:ilvl="2" w:tplc="50122766">
+    <w:lvl w:ilvl="2" w:tplc="2F24D2FC">
       <w:numFmt w:val="decimal"/>
       <w:lvlText w:val=""/>
       <w:lvlJc w:val="left"/>
     </w:lvl>
-    <w:lvl w:ilvl="3" w:tplc="00AC0CAC">
+    <w:lvl w:ilvl="3" w:tplc="BDE20F9C">
       <w:numFmt w:val="decimal"/>
       <w:lvlText w:val=""/>
       <w:lvlJc w:val="left"/>
     </w:lvl>
-    <w:lvl w:ilvl="4" w:tplc="71D09C62">
+    <w:lvl w:ilvl="4" w:tplc="23943664">
       <w:numFmt w:val="decimal"/>
       <w:lvlText w:val=""/>
       <w:lvlJc w:val="left"/>
     </w:lvl>
-    <w:lvl w:ilvl="5" w:tplc="D6DE8E8C">
+    <w:lvl w:ilvl="5" w:tplc="E5FEDCBA">
       <w:numFmt w:val="decimal"/>
       <w:lvlText w:val=""/>
       <w:lvlJc w:val="left"/>
     </w:lvl>
-    <w:lvl w:ilvl="6" w:tplc="05F62304">
+    <w:lvl w:ilvl="6" w:tplc="7B52883C">
       <w:numFmt w:val="decimal"/>
       <w:lvlText w:val=""/>
       <w:lvlJc w:val="left"/>
     </w:lvl>
-    <w:lvl w:ilvl="7" w:tplc="C25AA58E">
+    <w:lvl w:ilvl="7" w:tplc="CC3EECA0">
       <w:numFmt w:val="decimal"/>
       <w:lvlText w:val=""/>
       <w:lvlJc w:val="left"/>
     </w:lvl>
-    <w:lvl w:ilvl="8" w:tplc="B8F2B094">
+    <w:lvl w:ilvl="8" w:tplc="375885F8">
       <w:numFmt w:val="decimal"/>
       <w:lvlText w:val=""/>
       <w:lvlJc w:val="left"/>
     </w:lvl>
   </w:abstractNum>
-  <w:abstractNum w:abstractNumId="3" w15:restartNumberingAfterBreak="0">
-    <w:nsid w:val="1906282A"/>
+  <w:abstractNum w:abstractNumId="8" w15:restartNumberingAfterBreak="0">
+    <w:nsid w:val="45644912"/>
     <w:multiLevelType w:val="hybridMultilevel"/>
-    <w:tmpl w:val="39A4A32C"/>
-    <w:lvl w:ilvl="0" w:tplc="511617AE">
+    <w:tmpl w:val="E6921B0E"/>
+    <w:lvl w:ilvl="0" w:tplc="31B680F6">
       <w:start w:val="1"/>
       <w:numFmt w:val="decimal"/>
       <w:lvlText w:val="%1."/>
@@ -10154,52 +10414,52 @@
         <w:ind w:left="540" w:hanging="360"/>
       </w:pPr>
     </w:lvl>
-    <w:lvl w:ilvl="1" w:tplc="D1C05F60">
+    <w:lvl w:ilvl="1" w:tplc="C13A8908">
       <w:numFmt w:val="decimal"/>
       <w:lvlText w:val=""/>
       <w:lvlJc w:val="left"/>
     </w:lvl>
-    <w:lvl w:ilvl="2" w:tplc="505C3E48">
+    <w:lvl w:ilvl="2" w:tplc="6534FC62">
       <w:numFmt w:val="decimal"/>
       <w:lvlText w:val=""/>
       <w:lvlJc w:val="left"/>
     </w:lvl>
-    <w:lvl w:ilvl="3" w:tplc="B726D0AE">
+    <w:lvl w:ilvl="3" w:tplc="FA702F7E">
       <w:numFmt w:val="decimal"/>
       <w:lvlText w:val=""/>
       <w:lvlJc w:val="left"/>
     </w:lvl>
-    <w:lvl w:ilvl="4" w:tplc="4B987C22">
+    <w:lvl w:ilvl="4" w:tplc="6D0E2A18">
       <w:numFmt w:val="decimal"/>
       <w:lvlText w:val=""/>
       <w:lvlJc w:val="left"/>
     </w:lvl>
-    <w:lvl w:ilvl="5" w:tplc="8F9A88CC">
+    <w:lvl w:ilvl="5" w:tplc="5B88E4B2">
       <w:numFmt w:val="decimal"/>
       <w:lvlText w:val=""/>
       <w:lvlJc w:val="left"/>
     </w:lvl>
-    <w:lvl w:ilvl="6" w:tplc="83A6E5CE">
+    <w:lvl w:ilvl="6" w:tplc="0512BDC0">
       <w:numFmt w:val="decimal"/>
       <w:lvlText w:val=""/>
       <w:lvlJc w:val="left"/>
     </w:lvl>
-    <w:lvl w:ilvl="7" w:tplc="BFD83D66">
+    <w:lvl w:ilvl="7" w:tplc="FABCABDC">
       <w:numFmt w:val="decimal"/>
       <w:lvlText w:val=""/>
       <w:lvlJc w:val="left"/>
     </w:lvl>
-    <w:lvl w:ilvl="8" w:tplc="0708F67E">
+    <w:lvl w:ilvl="8" w:tplc="C1ECF6FA">
       <w:numFmt w:val="decimal"/>
       <w:lvlText w:val=""/>
       <w:lvlJc w:val="left"/>
     </w:lvl>
   </w:abstractNum>
-  <w:abstractNum w:abstractNumId="4" w15:restartNumberingAfterBreak="0">
-    <w:nsid w:val="21B43E93"/>
+  <w:abstractNum w:abstractNumId="9" w15:restartNumberingAfterBreak="0">
+    <w:nsid w:val="514B67A1"/>
     <w:multiLevelType w:val="hybridMultilevel"/>
-    <w:tmpl w:val="7D98AFC8"/>
-    <w:lvl w:ilvl="0" w:tplc="2C8C740A">
+    <w:tmpl w:val="91FE5FE8"/>
+    <w:lvl w:ilvl="0" w:tplc="9D58CE56">
       <w:start w:val="1"/>
       <w:numFmt w:val="decimal"/>
       <w:lvlText w:val="%1."/>
@@ -10208,52 +10468,52 @@
         <w:ind w:left="540" w:hanging="360"/>
       </w:pPr>
     </w:lvl>
-    <w:lvl w:ilvl="1" w:tplc="3A505EDA">
+    <w:lvl w:ilvl="1" w:tplc="5C801CF6">
       <w:numFmt w:val="decimal"/>
       <w:lvlText w:val=""/>
       <w:lvlJc w:val="left"/>
     </w:lvl>
-    <w:lvl w:ilvl="2" w:tplc="4CCA4F40">
+    <w:lvl w:ilvl="2" w:tplc="8F22A686">
       <w:numFmt w:val="decimal"/>
       <w:lvlText w:val=""/>
       <w:lvlJc w:val="left"/>
     </w:lvl>
-    <w:lvl w:ilvl="3" w:tplc="CD72226A">
+    <w:lvl w:ilvl="3" w:tplc="DB222D88">
       <w:numFmt w:val="decimal"/>
       <w:lvlText w:val=""/>
       <w:lvlJc w:val="left"/>
     </w:lvl>
-    <w:lvl w:ilvl="4" w:tplc="9940C2B0">
+    <w:lvl w:ilvl="4" w:tplc="FE8E47A0">
       <w:numFmt w:val="decimal"/>
       <w:lvlText w:val=""/>
       <w:lvlJc w:val="left"/>
     </w:lvl>
-    <w:lvl w:ilvl="5" w:tplc="86C811F4">
+    <w:lvl w:ilvl="5" w:tplc="12A6A846">
       <w:numFmt w:val="decimal"/>
       <w:lvlText w:val=""/>
       <w:lvlJc w:val="left"/>
     </w:lvl>
-    <w:lvl w:ilvl="6" w:tplc="24B6D9CA">
+    <w:lvl w:ilvl="6" w:tplc="271472DE">
       <w:numFmt w:val="decimal"/>
       <w:lvlText w:val=""/>
       <w:lvlJc w:val="left"/>
     </w:lvl>
-    <w:lvl w:ilvl="7" w:tplc="DA1E4C2C">
+    <w:lvl w:ilvl="7" w:tplc="4FC6DBDC">
       <w:numFmt w:val="decimal"/>
       <w:lvlText w:val=""/>
       <w:lvlJc w:val="left"/>
     </w:lvl>
-    <w:lvl w:ilvl="8" w:tplc="9858E5A6">
+    <w:lvl w:ilvl="8" w:tplc="38823652">
       <w:numFmt w:val="decimal"/>
       <w:lvlText w:val=""/>
       <w:lvlJc w:val="left"/>
     </w:lvl>
   </w:abstractNum>
-  <w:abstractNum w:abstractNumId="5" w15:restartNumberingAfterBreak="0">
-    <w:nsid w:val="3C513CEE"/>
+  <w:abstractNum w:abstractNumId="10" w15:restartNumberingAfterBreak="0">
+    <w:nsid w:val="521C378A"/>
     <w:multiLevelType w:val="hybridMultilevel"/>
-    <w:tmpl w:val="7AE876FC"/>
-    <w:lvl w:ilvl="0" w:tplc="1F3CB25A">
+    <w:tmpl w:val="D3F29458"/>
+    <w:lvl w:ilvl="0" w:tplc="7F9623DC">
       <w:start w:val="1"/>
       <w:numFmt w:val="decimal"/>
       <w:lvlText w:val="%1."/>
@@ -10262,52 +10522,52 @@
         <w:ind w:left="540" w:hanging="360"/>
       </w:pPr>
     </w:lvl>
-    <w:lvl w:ilvl="1" w:tplc="94D2B7AC">
+    <w:lvl w:ilvl="1" w:tplc="F36645C6">
       <w:numFmt w:val="decimal"/>
       <w:lvlText w:val=""/>
       <w:lvlJc w:val="left"/>
     </w:lvl>
-    <w:lvl w:ilvl="2" w:tplc="E632986C">
+    <w:lvl w:ilvl="2" w:tplc="2F4C02EE">
       <w:numFmt w:val="decimal"/>
       <w:lvlText w:val=""/>
       <w:lvlJc w:val="left"/>
     </w:lvl>
-    <w:lvl w:ilvl="3" w:tplc="FFC03818">
+    <w:lvl w:ilvl="3" w:tplc="DB6A0342">
       <w:numFmt w:val="decimal"/>
       <w:lvlText w:val=""/>
       <w:lvlJc w:val="left"/>
     </w:lvl>
-    <w:lvl w:ilvl="4" w:tplc="6464A95A">
+    <w:lvl w:ilvl="4" w:tplc="492C6D28">
       <w:numFmt w:val="decimal"/>
       <w:lvlText w:val=""/>
       <w:lvlJc w:val="left"/>
     </w:lvl>
-    <w:lvl w:ilvl="5" w:tplc="51F49222">
+    <w:lvl w:ilvl="5" w:tplc="0B86960A">
       <w:numFmt w:val="decimal"/>
       <w:lvlText w:val=""/>
       <w:lvlJc w:val="left"/>
     </w:lvl>
-    <w:lvl w:ilvl="6" w:tplc="C62C328C">
+    <w:lvl w:ilvl="6" w:tplc="9D3810BC">
       <w:numFmt w:val="decimal"/>
       <w:lvlText w:val=""/>
       <w:lvlJc w:val="left"/>
     </w:lvl>
-    <w:lvl w:ilvl="7" w:tplc="AD064B92">
+    <w:lvl w:ilvl="7" w:tplc="59F22736">
       <w:numFmt w:val="decimal"/>
       <w:lvlText w:val=""/>
       <w:lvlJc w:val="left"/>
     </w:lvl>
-    <w:lvl w:ilvl="8" w:tplc="81A077F6">
+    <w:lvl w:ilvl="8" w:tplc="D0362B16">
       <w:numFmt w:val="decimal"/>
       <w:lvlText w:val=""/>
       <w:lvlJc w:val="left"/>
     </w:lvl>
   </w:abstractNum>
-  <w:abstractNum w:abstractNumId="6" w15:restartNumberingAfterBreak="0">
-    <w:nsid w:val="4A1842D2"/>
+  <w:abstractNum w:abstractNumId="11" w15:restartNumberingAfterBreak="0">
+    <w:nsid w:val="5BCD0320"/>
     <w:multiLevelType w:val="hybridMultilevel"/>
-    <w:tmpl w:val="778EDEA0"/>
-    <w:lvl w:ilvl="0" w:tplc="2CB0D3FA">
+    <w:tmpl w:val="307C6252"/>
+    <w:lvl w:ilvl="0" w:tplc="6F3CB82C">
       <w:start w:val="1"/>
       <w:numFmt w:val="decimal"/>
       <w:lvlText w:val="%1."/>
@@ -10316,52 +10576,138 @@
         <w:ind w:left="540" w:hanging="360"/>
       </w:pPr>
     </w:lvl>
-    <w:lvl w:ilvl="1" w:tplc="B6DA5E2E">
+    <w:lvl w:ilvl="1" w:tplc="F160BAEE">
       <w:numFmt w:val="decimal"/>
       <w:lvlText w:val=""/>
       <w:lvlJc w:val="left"/>
     </w:lvl>
-    <w:lvl w:ilvl="2" w:tplc="9340AAE4">
+    <w:lvl w:ilvl="2" w:tplc="B366CF46">
       <w:numFmt w:val="decimal"/>
       <w:lvlText w:val=""/>
       <w:lvlJc w:val="left"/>
     </w:lvl>
-    <w:lvl w:ilvl="3" w:tplc="6590E1F8">
+    <w:lvl w:ilvl="3" w:tplc="54745004">
       <w:numFmt w:val="decimal"/>
       <w:lvlText w:val=""/>
       <w:lvlJc w:val="left"/>
     </w:lvl>
-    <w:lvl w:ilvl="4" w:tplc="9D0EAC44">
+    <w:lvl w:ilvl="4" w:tplc="27FA0CAE">
       <w:numFmt w:val="decimal"/>
       <w:lvlText w:val=""/>
       <w:lvlJc w:val="left"/>
     </w:lvl>
-    <w:lvl w:ilvl="5" w:tplc="3F749766">
+    <w:lvl w:ilvl="5" w:tplc="C7CA0514">
       <w:numFmt w:val="decimal"/>
       <w:lvlText w:val=""/>
       <w:lvlJc w:val="left"/>
     </w:lvl>
-    <w:lvl w:ilvl="6" w:tplc="A8DC8ACE">
+    <w:lvl w:ilvl="6" w:tplc="10EA1CF2">
       <w:numFmt w:val="decimal"/>
       <w:lvlText w:val=""/>
       <w:lvlJc w:val="left"/>
     </w:lvl>
-    <w:lvl w:ilvl="7" w:tplc="A2A06574">
+    <w:lvl w:ilvl="7" w:tplc="EA204EAC">
       <w:numFmt w:val="decimal"/>
       <w:lvlText w:val=""/>
       <w:lvlJc w:val="left"/>
     </w:lvl>
-    <w:lvl w:ilvl="8" w:tplc="74AC8EF0">
+    <w:lvl w:ilvl="8" w:tplc="AFD28C92">
       <w:numFmt w:val="decimal"/>
       <w:lvlText w:val=""/>
       <w:lvlJc w:val="left"/>
     </w:lvl>
   </w:abstractNum>
-  <w:abstractNum w:abstractNumId="7" w15:restartNumberingAfterBreak="0">
-    <w:nsid w:val="4B9C6F12"/>
+  <w:abstractNum w:abstractNumId="12" w15:restartNumberingAfterBreak="0">
+    <w:nsid w:val="5D182875"/>
     <w:multiLevelType w:val="hybridMultilevel"/>
-    <w:tmpl w:val="B4B2BFAA"/>
-    <w:lvl w:ilvl="0" w:tplc="6574A764">
+    <w:tmpl w:val="A40031C8"/>
+    <w:lvl w:ilvl="0" w:tplc="2E5CDEFE">
+      <w:start w:val="1"/>
+      <w:numFmt w:val="bullet"/>
+      <w:lvlText w:val="●"/>
+      <w:lvlJc w:val="left"/>
+      <w:pPr>
+        <w:ind w:left="720" w:hanging="360"/>
+      </w:pPr>
+    </w:lvl>
+    <w:lvl w:ilvl="1" w:tplc="752CBE80">
+      <w:start w:val="1"/>
+      <w:numFmt w:val="bullet"/>
+      <w:lvlText w:val="○"/>
+      <w:lvlJc w:val="left"/>
+      <w:pPr>
+        <w:ind w:left="1440" w:hanging="360"/>
+      </w:pPr>
+    </w:lvl>
+    <w:lvl w:ilvl="2" w:tplc="BB763D6C">
+      <w:start w:val="1"/>
+      <w:numFmt w:val="bullet"/>
+      <w:lvlText w:val="■"/>
+      <w:lvlJc w:val="left"/>
+      <w:pPr>
+        <w:ind w:left="2160" w:hanging="360"/>
+      </w:pPr>
+    </w:lvl>
+    <w:lvl w:ilvl="3" w:tplc="CCC8BBC6">
+      <w:start w:val="1"/>
+      <w:numFmt w:val="bullet"/>
+      <w:lvlText w:val="●"/>
+      <w:lvlJc w:val="left"/>
+      <w:pPr>
+        <w:ind w:left="2880" w:hanging="360"/>
+      </w:pPr>
+    </w:lvl>
+    <w:lvl w:ilvl="4" w:tplc="491413AC">
+      <w:start w:val="1"/>
+      <w:numFmt w:val="bullet"/>
+      <w:lvlText w:val="○"/>
+      <w:lvlJc w:val="left"/>
+      <w:pPr>
+        <w:ind w:left="3600" w:hanging="360"/>
+      </w:pPr>
+    </w:lvl>
+    <w:lvl w:ilvl="5" w:tplc="EA16131A">
+      <w:start w:val="1"/>
+      <w:numFmt w:val="bullet"/>
+      <w:lvlText w:val="■"/>
+      <w:lvlJc w:val="left"/>
+      <w:pPr>
+        <w:ind w:left="4320" w:hanging="360"/>
+      </w:pPr>
+    </w:lvl>
+    <w:lvl w:ilvl="6" w:tplc="152A6392">
+      <w:start w:val="1"/>
+      <w:numFmt w:val="bullet"/>
+      <w:lvlText w:val="●"/>
+      <w:lvlJc w:val="left"/>
+      <w:pPr>
+        <w:ind w:left="5040" w:hanging="360"/>
+      </w:pPr>
+    </w:lvl>
+    <w:lvl w:ilvl="7" w:tplc="3C18D9D0">
+      <w:start w:val="1"/>
+      <w:numFmt w:val="bullet"/>
+      <w:lvlText w:val="●"/>
+      <w:lvlJc w:val="left"/>
+      <w:pPr>
+        <w:ind w:left="5760" w:hanging="360"/>
+      </w:pPr>
+    </w:lvl>
+    <w:lvl w:ilvl="8" w:tplc="8E386F32">
+      <w:start w:val="1"/>
+      <w:numFmt w:val="bullet"/>
+      <w:lvlText w:val="●"/>
+      <w:lvlJc w:val="left"/>
+      <w:pPr>
+        <w:ind w:left="6480" w:hanging="360"/>
+      </w:pPr>
+    </w:lvl>
+  </w:abstractNum>
+  <w:abstractNum w:abstractNumId="13" w15:restartNumberingAfterBreak="0">
+    <w:nsid w:val="65FE0F8D"/>
+    <w:multiLevelType w:val="hybridMultilevel"/>
+    <w:tmpl w:val="9D462F8A"/>
+    <w:lvl w:ilvl="0" w:tplc="27E4D04C">
       <w:start w:val="1"/>
       <w:numFmt w:val="decimal"/>
       <w:lvlText w:val="%1."/>
@@ -10370,429 +10716,73 @@
         <w:ind w:left="540" w:hanging="360"/>
       </w:pPr>
     </w:lvl>
-    <w:lvl w:ilvl="1" w:tplc="35740C1E">
+    <w:lvl w:ilvl="1" w:tplc="72AA7C90">
       <w:numFmt w:val="decimal"/>
       <w:lvlText w:val=""/>
       <w:lvlJc w:val="left"/>
     </w:lvl>
-    <w:lvl w:ilvl="2" w:tplc="2854AD56">
+    <w:lvl w:ilvl="2" w:tplc="306AB7AA">
       <w:numFmt w:val="decimal"/>
       <w:lvlText w:val=""/>
       <w:lvlJc w:val="left"/>
     </w:lvl>
-    <w:lvl w:ilvl="3" w:tplc="4C1AEC8A">
+    <w:lvl w:ilvl="3" w:tplc="74C0821C">
       <w:numFmt w:val="decimal"/>
       <w:lvlText w:val=""/>
       <w:lvlJc w:val="left"/>
     </w:lvl>
-    <w:lvl w:ilvl="4" w:tplc="19DEC57A">
+    <w:lvl w:ilvl="4" w:tplc="CD84EDBA">
       <w:numFmt w:val="decimal"/>
       <w:lvlText w:val=""/>
       <w:lvlJc w:val="left"/>
     </w:lvl>
-    <w:lvl w:ilvl="5" w:tplc="6FF0BB80">
+    <w:lvl w:ilvl="5" w:tplc="765627D0">
       <w:numFmt w:val="decimal"/>
       <w:lvlText w:val=""/>
       <w:lvlJc w:val="left"/>
     </w:lvl>
-    <w:lvl w:ilvl="6" w:tplc="9D380DF2">
+    <w:lvl w:ilvl="6" w:tplc="E082900A">
       <w:numFmt w:val="decimal"/>
       <w:lvlText w:val=""/>
       <w:lvlJc w:val="left"/>
     </w:lvl>
-    <w:lvl w:ilvl="7" w:tplc="5C4E7256">
+    <w:lvl w:ilvl="7" w:tplc="52E214A4">
       <w:numFmt w:val="decimal"/>
       <w:lvlText w:val=""/>
       <w:lvlJc w:val="left"/>
     </w:lvl>
-    <w:lvl w:ilvl="8" w:tplc="DA687DA4">
+    <w:lvl w:ilvl="8" w:tplc="2F02E2BE">
       <w:numFmt w:val="decimal"/>
       <w:lvlText w:val=""/>
       <w:lvlJc w:val="left"/>
     </w:lvl>
   </w:abstractNum>
-  <w:abstractNum w:abstractNumId="8" w15:restartNumberingAfterBreak="0">
-    <w:nsid w:val="4D7370B4"/>
-    <w:multiLevelType w:val="hybridMultilevel"/>
-    <w:tmpl w:val="EFAEA838"/>
-    <w:lvl w:ilvl="0" w:tplc="EAEAD7B2">
-      <w:start w:val="1"/>
-      <w:numFmt w:val="decimal"/>
-      <w:lvlText w:val="%1."/>
-      <w:lvlJc w:val="left"/>
-      <w:pPr>
-        <w:ind w:left="540" w:hanging="360"/>
-      </w:pPr>
-    </w:lvl>
-    <w:lvl w:ilvl="1" w:tplc="766A3A6A">
-      <w:numFmt w:val="decimal"/>
-      <w:lvlText w:val=""/>
-      <w:lvlJc w:val="left"/>
-    </w:lvl>
-    <w:lvl w:ilvl="2" w:tplc="5432993A">
-      <w:numFmt w:val="decimal"/>
-      <w:lvlText w:val=""/>
-      <w:lvlJc w:val="left"/>
-    </w:lvl>
-    <w:lvl w:ilvl="3" w:tplc="CF4AFFB8">
-      <w:numFmt w:val="decimal"/>
-      <w:lvlText w:val=""/>
-      <w:lvlJc w:val="left"/>
-    </w:lvl>
-    <w:lvl w:ilvl="4" w:tplc="F234635E">
-      <w:numFmt w:val="decimal"/>
-      <w:lvlText w:val=""/>
-      <w:lvlJc w:val="left"/>
-    </w:lvl>
-    <w:lvl w:ilvl="5" w:tplc="A70E325A">
-      <w:numFmt w:val="decimal"/>
-      <w:lvlText w:val=""/>
-      <w:lvlJc w:val="left"/>
-    </w:lvl>
-    <w:lvl w:ilvl="6" w:tplc="170A4A10">
-      <w:numFmt w:val="decimal"/>
-      <w:lvlText w:val=""/>
-      <w:lvlJc w:val="left"/>
-    </w:lvl>
-    <w:lvl w:ilvl="7" w:tplc="B99AE21E">
-      <w:numFmt w:val="decimal"/>
-      <w:lvlText w:val=""/>
-      <w:lvlJc w:val="left"/>
-    </w:lvl>
-    <w:lvl w:ilvl="8" w:tplc="31308F3E">
-      <w:numFmt w:val="decimal"/>
-      <w:lvlText w:val=""/>
-      <w:lvlJc w:val="left"/>
-    </w:lvl>
-  </w:abstractNum>
-  <w:abstractNum w:abstractNumId="9" w15:restartNumberingAfterBreak="0">
-    <w:nsid w:val="592F2828"/>
-    <w:multiLevelType w:val="hybridMultilevel"/>
-    <w:tmpl w:val="79E2416C"/>
-    <w:lvl w:ilvl="0" w:tplc="6076F39E">
-      <w:start w:val="1"/>
-      <w:numFmt w:val="bullet"/>
-      <w:lvlText w:val="●"/>
-      <w:lvlJc w:val="left"/>
-      <w:pPr>
-        <w:ind w:left="720" w:hanging="360"/>
-      </w:pPr>
-    </w:lvl>
-    <w:lvl w:ilvl="1" w:tplc="8C12F492">
-      <w:start w:val="1"/>
-      <w:numFmt w:val="bullet"/>
-      <w:lvlText w:val="○"/>
-      <w:lvlJc w:val="left"/>
-      <w:pPr>
-        <w:ind w:left="1440" w:hanging="360"/>
-      </w:pPr>
-    </w:lvl>
-    <w:lvl w:ilvl="2" w:tplc="477AA75E">
-      <w:start w:val="1"/>
-      <w:numFmt w:val="bullet"/>
-      <w:lvlText w:val="■"/>
-      <w:lvlJc w:val="left"/>
-      <w:pPr>
-        <w:ind w:left="2160" w:hanging="360"/>
-      </w:pPr>
-    </w:lvl>
-    <w:lvl w:ilvl="3" w:tplc="3634CD3E">
-      <w:start w:val="1"/>
-      <w:numFmt w:val="bullet"/>
-      <w:lvlText w:val="●"/>
-      <w:lvlJc w:val="left"/>
-      <w:pPr>
-        <w:ind w:left="2880" w:hanging="360"/>
-      </w:pPr>
-    </w:lvl>
-    <w:lvl w:ilvl="4" w:tplc="767282B4">
-      <w:start w:val="1"/>
-      <w:numFmt w:val="bullet"/>
-      <w:lvlText w:val="○"/>
-      <w:lvlJc w:val="left"/>
-      <w:pPr>
-        <w:ind w:left="3600" w:hanging="360"/>
-      </w:pPr>
-    </w:lvl>
-    <w:lvl w:ilvl="5" w:tplc="C9B6F332">
-      <w:start w:val="1"/>
-      <w:numFmt w:val="bullet"/>
-      <w:lvlText w:val="■"/>
-      <w:lvlJc w:val="left"/>
-      <w:pPr>
-        <w:ind w:left="4320" w:hanging="360"/>
-      </w:pPr>
-    </w:lvl>
-    <w:lvl w:ilvl="6" w:tplc="6030717E">
-      <w:start w:val="1"/>
-      <w:numFmt w:val="bullet"/>
-      <w:lvlText w:val="●"/>
-      <w:lvlJc w:val="left"/>
-      <w:pPr>
-        <w:ind w:left="5040" w:hanging="360"/>
-      </w:pPr>
-    </w:lvl>
-    <w:lvl w:ilvl="7" w:tplc="55B67D64">
-      <w:start w:val="1"/>
-      <w:numFmt w:val="bullet"/>
-      <w:lvlText w:val="●"/>
-      <w:lvlJc w:val="left"/>
-      <w:pPr>
-        <w:ind w:left="5760" w:hanging="360"/>
-      </w:pPr>
-    </w:lvl>
-    <w:lvl w:ilvl="8" w:tplc="DA20BE18">
-      <w:start w:val="1"/>
-      <w:numFmt w:val="bullet"/>
-      <w:lvlText w:val="●"/>
-      <w:lvlJc w:val="left"/>
-      <w:pPr>
-        <w:ind w:left="6480" w:hanging="360"/>
-      </w:pPr>
-    </w:lvl>
-  </w:abstractNum>
-  <w:abstractNum w:abstractNumId="10" w15:restartNumberingAfterBreak="0">
-    <w:nsid w:val="64347397"/>
-    <w:multiLevelType w:val="hybridMultilevel"/>
-    <w:tmpl w:val="8FAADE26"/>
-    <w:lvl w:ilvl="0" w:tplc="EB4AF39A">
-      <w:start w:val="1"/>
-      <w:numFmt w:val="decimal"/>
-      <w:lvlText w:val="%1."/>
-      <w:lvlJc w:val="left"/>
-      <w:pPr>
-        <w:ind w:left="540" w:hanging="360"/>
-      </w:pPr>
-    </w:lvl>
-    <w:lvl w:ilvl="1" w:tplc="1B8AF07E">
-      <w:numFmt w:val="decimal"/>
-      <w:lvlText w:val=""/>
-      <w:lvlJc w:val="left"/>
-    </w:lvl>
-    <w:lvl w:ilvl="2" w:tplc="BC2EB102">
-      <w:numFmt w:val="decimal"/>
-      <w:lvlText w:val=""/>
-      <w:lvlJc w:val="left"/>
-    </w:lvl>
-    <w:lvl w:ilvl="3" w:tplc="2A208168">
-      <w:numFmt w:val="decimal"/>
-      <w:lvlText w:val=""/>
-      <w:lvlJc w:val="left"/>
-    </w:lvl>
-    <w:lvl w:ilvl="4" w:tplc="E5FA3E3C">
-      <w:numFmt w:val="decimal"/>
-      <w:lvlText w:val=""/>
-      <w:lvlJc w:val="left"/>
-    </w:lvl>
-    <w:lvl w:ilvl="5" w:tplc="E3280126">
-      <w:numFmt w:val="decimal"/>
-      <w:lvlText w:val=""/>
-      <w:lvlJc w:val="left"/>
-    </w:lvl>
-    <w:lvl w:ilvl="6" w:tplc="7B341198">
-      <w:numFmt w:val="decimal"/>
-      <w:lvlText w:val=""/>
-      <w:lvlJc w:val="left"/>
-    </w:lvl>
-    <w:lvl w:ilvl="7" w:tplc="3D7C19E4">
-      <w:numFmt w:val="decimal"/>
-      <w:lvlText w:val=""/>
-      <w:lvlJc w:val="left"/>
-    </w:lvl>
-    <w:lvl w:ilvl="8" w:tplc="C45A2558">
-      <w:numFmt w:val="decimal"/>
-      <w:lvlText w:val=""/>
-      <w:lvlJc w:val="left"/>
-    </w:lvl>
-  </w:abstractNum>
-  <w:abstractNum w:abstractNumId="11" w15:restartNumberingAfterBreak="0">
-    <w:nsid w:val="7A380442"/>
-    <w:multiLevelType w:val="hybridMultilevel"/>
-    <w:tmpl w:val="2CF62904"/>
-    <w:lvl w:ilvl="0" w:tplc="F9F26F4A">
-      <w:start w:val="1"/>
-      <w:numFmt w:val="decimal"/>
-      <w:lvlText w:val="%1."/>
-      <w:lvlJc w:val="left"/>
-      <w:pPr>
-        <w:ind w:left="540" w:hanging="360"/>
-      </w:pPr>
-    </w:lvl>
-    <w:lvl w:ilvl="1" w:tplc="FB06D71C">
-      <w:numFmt w:val="decimal"/>
-      <w:lvlText w:val=""/>
-      <w:lvlJc w:val="left"/>
-    </w:lvl>
-    <w:lvl w:ilvl="2" w:tplc="CBAE67DA">
-      <w:numFmt w:val="decimal"/>
-      <w:lvlText w:val=""/>
-      <w:lvlJc w:val="left"/>
-    </w:lvl>
-    <w:lvl w:ilvl="3" w:tplc="945ADA26">
-      <w:numFmt w:val="decimal"/>
-      <w:lvlText w:val=""/>
-      <w:lvlJc w:val="left"/>
-    </w:lvl>
-    <w:lvl w:ilvl="4" w:tplc="98547A7C">
-      <w:numFmt w:val="decimal"/>
-      <w:lvlText w:val=""/>
-      <w:lvlJc w:val="left"/>
-    </w:lvl>
-    <w:lvl w:ilvl="5" w:tplc="58FE9888">
-      <w:numFmt w:val="decimal"/>
-      <w:lvlText w:val=""/>
-      <w:lvlJc w:val="left"/>
-    </w:lvl>
-    <w:lvl w:ilvl="6" w:tplc="22CAFC1A">
-      <w:numFmt w:val="decimal"/>
-      <w:lvlText w:val=""/>
-      <w:lvlJc w:val="left"/>
-    </w:lvl>
-    <w:lvl w:ilvl="7" w:tplc="F4F2A652">
-      <w:numFmt w:val="decimal"/>
-      <w:lvlText w:val=""/>
-      <w:lvlJc w:val="left"/>
-    </w:lvl>
-    <w:lvl w:ilvl="8" w:tplc="2CC0478E">
-      <w:numFmt w:val="decimal"/>
-      <w:lvlText w:val=""/>
-      <w:lvlJc w:val="left"/>
-    </w:lvl>
-  </w:abstractNum>
-  <w:abstractNum w:abstractNumId="12" w15:restartNumberingAfterBreak="0">
-    <w:nsid w:val="7B3D1558"/>
-    <w:multiLevelType w:val="hybridMultilevel"/>
-    <w:tmpl w:val="08B0910A"/>
-    <w:lvl w:ilvl="0" w:tplc="959022F0">
-      <w:start w:val="1"/>
-      <w:numFmt w:val="decimal"/>
-      <w:lvlText w:val="%1."/>
-      <w:lvlJc w:val="left"/>
-      <w:pPr>
-        <w:ind w:left="540" w:hanging="360"/>
-      </w:pPr>
-    </w:lvl>
-    <w:lvl w:ilvl="1" w:tplc="D6EE2876">
-      <w:numFmt w:val="decimal"/>
-      <w:lvlText w:val=""/>
-      <w:lvlJc w:val="left"/>
-    </w:lvl>
-    <w:lvl w:ilvl="2" w:tplc="909ACB5C">
-      <w:numFmt w:val="decimal"/>
-      <w:lvlText w:val=""/>
-      <w:lvlJc w:val="left"/>
-    </w:lvl>
-    <w:lvl w:ilvl="3" w:tplc="43EAFE5C">
-      <w:numFmt w:val="decimal"/>
-      <w:lvlText w:val=""/>
-      <w:lvlJc w:val="left"/>
-    </w:lvl>
-    <w:lvl w:ilvl="4" w:tplc="9658500A">
-      <w:numFmt w:val="decimal"/>
-      <w:lvlText w:val=""/>
-      <w:lvlJc w:val="left"/>
-    </w:lvl>
-    <w:lvl w:ilvl="5" w:tplc="0040F6DE">
-      <w:numFmt w:val="decimal"/>
-      <w:lvlText w:val=""/>
-      <w:lvlJc w:val="left"/>
-    </w:lvl>
-    <w:lvl w:ilvl="6" w:tplc="2D0EF6FC">
-      <w:numFmt w:val="decimal"/>
-      <w:lvlText w:val=""/>
-      <w:lvlJc w:val="left"/>
-    </w:lvl>
-    <w:lvl w:ilvl="7" w:tplc="CF022BE4">
-      <w:numFmt w:val="decimal"/>
-      <w:lvlText w:val=""/>
-      <w:lvlJc w:val="left"/>
-    </w:lvl>
-    <w:lvl w:ilvl="8" w:tplc="3F4EEBA4">
-      <w:numFmt w:val="decimal"/>
-      <w:lvlText w:val=""/>
-      <w:lvlJc w:val="left"/>
-    </w:lvl>
-  </w:abstractNum>
-  <w:abstractNum w:abstractNumId="13" w15:restartNumberingAfterBreak="0">
-    <w:nsid w:val="7C6D2E83"/>
-    <w:multiLevelType w:val="hybridMultilevel"/>
-    <w:tmpl w:val="27B0EA64"/>
-    <w:lvl w:ilvl="0" w:tplc="7F0694F0">
-      <w:start w:val="1"/>
-      <w:numFmt w:val="decimal"/>
-      <w:lvlText w:val="%1."/>
-      <w:lvlJc w:val="left"/>
-      <w:pPr>
-        <w:ind w:left="540" w:hanging="360"/>
-      </w:pPr>
-    </w:lvl>
-    <w:lvl w:ilvl="1" w:tplc="350698D8">
-      <w:numFmt w:val="decimal"/>
-      <w:lvlText w:val=""/>
-      <w:lvlJc w:val="left"/>
-    </w:lvl>
-    <w:lvl w:ilvl="2" w:tplc="1AB6F72A">
-      <w:numFmt w:val="decimal"/>
-      <w:lvlText w:val=""/>
-      <w:lvlJc w:val="left"/>
-    </w:lvl>
-    <w:lvl w:ilvl="3" w:tplc="CCB0068A">
-      <w:numFmt w:val="decimal"/>
-      <w:lvlText w:val=""/>
-      <w:lvlJc w:val="left"/>
-    </w:lvl>
-    <w:lvl w:ilvl="4" w:tplc="294210B0">
-      <w:numFmt w:val="decimal"/>
-      <w:lvlText w:val=""/>
-      <w:lvlJc w:val="left"/>
-    </w:lvl>
-    <w:lvl w:ilvl="5" w:tplc="A5FAF3E8">
-      <w:numFmt w:val="decimal"/>
-      <w:lvlText w:val=""/>
-      <w:lvlJc w:val="left"/>
-    </w:lvl>
-    <w:lvl w:ilvl="6" w:tplc="BEA44B9E">
-      <w:numFmt w:val="decimal"/>
-      <w:lvlText w:val=""/>
-      <w:lvlJc w:val="left"/>
-    </w:lvl>
-    <w:lvl w:ilvl="7" w:tplc="7DF48558">
-      <w:numFmt w:val="decimal"/>
-      <w:lvlText w:val=""/>
-      <w:lvlJc w:val="left"/>
-    </w:lvl>
-    <w:lvl w:ilvl="8" w:tplc="E21AA206">
-      <w:numFmt w:val="decimal"/>
-      <w:lvlText w:val=""/>
-      <w:lvlJc w:val="left"/>
-    </w:lvl>
-  </w:abstractNum>
-  <w:num w:numId="1" w16cid:durableId="778330266">
-    <w:abstractNumId w:val="9"/>
+  <w:num w:numId="1" w16cid:durableId="1393895040">
+    <w:abstractNumId w:val="12"/>
     <w:lvlOverride w:ilvl="0">
       <w:startOverride w:val="1"/>
     </w:lvlOverride>
   </w:num>
-  <w:num w:numId="2" w16cid:durableId="1976787937">
-    <w:abstractNumId w:val="1"/>
+  <w:num w:numId="2" w16cid:durableId="255329804">
+    <w:abstractNumId w:val="6"/>
     <w:lvlOverride w:ilvl="0">
       <w:startOverride w:val="1"/>
     </w:lvlOverride>
   </w:num>
-  <w:num w:numId="3" w16cid:durableId="1479835170">
-    <w:abstractNumId w:val="10"/>
+  <w:num w:numId="3" w16cid:durableId="657266398">
+    <w:abstractNumId w:val="13"/>
     <w:lvlOverride w:ilvl="0">
       <w:startOverride w:val="1"/>
     </w:lvlOverride>
   </w:num>
-  <w:num w:numId="4" w16cid:durableId="1292134847">
-    <w:abstractNumId w:val="4"/>
+  <w:num w:numId="4" w16cid:durableId="496307227">
+    <w:abstractNumId w:val="5"/>
     <w:lvlOverride w:ilvl="0">
       <w:startOverride w:val="1"/>
     </w:lvlOverride>
   </w:num>
-  <w:num w:numId="5" w16cid:durableId="1880391402">
-    <w:abstractNumId w:val="6"/>
+  <w:num w:numId="5" w16cid:durableId="138574329">
+    <w:abstractNumId w:val="8"/>
     <w:lvlOverride w:ilvl="0">
       <w:startOverride w:val="1"/>
     </w:lvlOverride>
@@ -11403,7 +11393,7 @@
     <w:autoRedefine/>
     <w:uiPriority w:val="39"/>
     <w:unhideWhenUsed/>
-    <w:rsid w:val="00A3761B"/>
+    <w:rsid w:val="006C437F"/>
   </w:style>
   <w:style w:type="paragraph" w:styleId="20">
     <w:name w:val="toc 2"/>
@@ -11412,7 +11402,7 @@
     <w:autoRedefine/>
     <w:uiPriority w:val="39"/>
     <w:unhideWhenUsed/>
-    <w:rsid w:val="00A3761B"/>
+    <w:rsid w:val="006C437F"/>
     <w:pPr>
       <w:ind w:leftChars="100" w:left="200"/>
     </w:pPr>
@@ -11423,7 +11413,7 @@
     <w:link w:val="ad"/>
     <w:uiPriority w:val="99"/>
     <w:unhideWhenUsed/>
-    <w:rsid w:val="00A3761B"/>
+    <w:rsid w:val="006C437F"/>
     <w:pPr>
       <w:tabs>
         <w:tab w:val="center" w:pos="4252"/>
@@ -11437,7 +11427,7 @@
     <w:basedOn w:val="a0"/>
     <w:link w:val="ac"/>
     <w:uiPriority w:val="99"/>
-    <w:rsid w:val="00A3761B"/>
+    <w:rsid w:val="006C437F"/>
   </w:style>
   <w:style w:type="paragraph" w:styleId="ae">
     <w:name w:val="footer"/>
@@ -11445,7 +11435,7 @@
     <w:link w:val="af"/>
     <w:uiPriority w:val="99"/>
     <w:unhideWhenUsed/>
-    <w:rsid w:val="00A3761B"/>
+    <w:rsid w:val="006C437F"/>
     <w:pPr>
       <w:tabs>
         <w:tab w:val="center" w:pos="4252"/>
@@ -11459,7 +11449,7 @@
     <w:basedOn w:val="a0"/>
     <w:link w:val="ae"/>
     <w:uiPriority w:val="99"/>
-    <w:rsid w:val="00A3761B"/>
+    <w:rsid w:val="006C437F"/>
   </w:style>
 </w:styles>
 </file>

</xml_diff>

<commit_message>
Heading: ClinVar (other variants registered at the same amino-acid position)
Co-Authored-By: Claude Fable 5.1 <noreply@anthropic.com>
</commit_message>
<xml_diff>
--- a/docs/Missense_Variant_Evaluation_Report_Requirements_and_Design.docx
+++ b/docs/Missense_Variant_Evaluation_Report_Requirements_and_Design.docx
@@ -75,7 +75,7 @@
     <w:sdt>
       <w:sdtPr>
         <w:alias w:val="Contents"/>
-        <w:id w:val="-1358034016"/>
+        <w:id w:val="1713228400"/>
       </w:sdtPr>
       <w:sdtEndPr/>
       <w:sdtContent>
@@ -103,7 +103,7 @@
           <w:r>
             <w:fldChar w:fldCharType="separate"/>
           </w:r>
-          <w:hyperlink w:anchor="_Toc239966380" w:history="1">
+          <w:hyperlink w:anchor="_Toc240014600" w:history="1">
             <w:r>
               <w:rPr>
                 <w:rStyle w:val="a5"/>
@@ -127,7 +127,7 @@
               <w:rPr>
                 <w:noProof/>
               </w:rPr>
-              <w:instrText xml:space="preserve"> PAGEREF _Toc239966380 \h </w:instrText>
+              <w:instrText xml:space="preserve"> PAGEREF _Toc240014600 \h </w:instrText>
             </w:r>
             <w:r>
               <w:rPr>
@@ -169,7 +169,7 @@
               <w14:ligatures w14:val="standardContextual"/>
             </w:rPr>
           </w:pPr>
-          <w:hyperlink w:anchor="_Toc239966381" w:history="1">
+          <w:hyperlink w:anchor="_Toc240014601" w:history="1">
             <w:r>
               <w:rPr>
                 <w:rStyle w:val="a5"/>
@@ -193,7 +193,7 @@
               <w:rPr>
                 <w:noProof/>
               </w:rPr>
-              <w:instrText xml:space="preserve"> PAGEREF _Toc239966381 \h </w:instrText>
+              <w:instrText xml:space="preserve"> PAGEREF _Toc240014601 \h </w:instrText>
             </w:r>
             <w:r>
               <w:rPr>
@@ -235,7 +235,7 @@
               <w14:ligatures w14:val="standardContextual"/>
             </w:rPr>
           </w:pPr>
-          <w:hyperlink w:anchor="_Toc239966382" w:history="1">
+          <w:hyperlink w:anchor="_Toc240014602" w:history="1">
             <w:r>
               <w:rPr>
                 <w:rStyle w:val="a5"/>
@@ -259,7 +259,7 @@
               <w:rPr>
                 <w:noProof/>
               </w:rPr>
-              <w:instrText xml:space="preserve"> PAGEREF _Toc239966382 \h </w:instrText>
+              <w:instrText xml:space="preserve"> PAGEREF _Toc240014602 \h </w:instrText>
             </w:r>
             <w:r>
               <w:rPr>
@@ -301,7 +301,7 @@
               <w14:ligatures w14:val="standardContextual"/>
             </w:rPr>
           </w:pPr>
-          <w:hyperlink w:anchor="_Toc239966383" w:history="1">
+          <w:hyperlink w:anchor="_Toc240014603" w:history="1">
             <w:r>
               <w:rPr>
                 <w:rStyle w:val="a5"/>
@@ -325,7 +325,7 @@
               <w:rPr>
                 <w:noProof/>
               </w:rPr>
-              <w:instrText xml:space="preserve"> PAGEREF _Toc239966383 \h </w:instrText>
+              <w:instrText xml:space="preserve"> PAGEREF _Toc240014603 \h </w:instrText>
             </w:r>
             <w:r>
               <w:rPr>
@@ -367,7 +367,7 @@
               <w14:ligatures w14:val="standardContextual"/>
             </w:rPr>
           </w:pPr>
-          <w:hyperlink w:anchor="_Toc239966384" w:history="1">
+          <w:hyperlink w:anchor="_Toc240014604" w:history="1">
             <w:r>
               <w:rPr>
                 <w:rStyle w:val="a5"/>
@@ -391,7 +391,7 @@
               <w:rPr>
                 <w:noProof/>
               </w:rPr>
-              <w:instrText xml:space="preserve"> PAGEREF _Toc239966384 \h </w:instrText>
+              <w:instrText xml:space="preserve"> PAGEREF _Toc240014604 \h </w:instrText>
             </w:r>
             <w:r>
               <w:rPr>
@@ -433,7 +433,7 @@
               <w14:ligatures w14:val="standardContextual"/>
             </w:rPr>
           </w:pPr>
-          <w:hyperlink w:anchor="_Toc239966385" w:history="1">
+          <w:hyperlink w:anchor="_Toc240014605" w:history="1">
             <w:r>
               <w:rPr>
                 <w:rStyle w:val="a5"/>
@@ -457,7 +457,7 @@
               <w:rPr>
                 <w:noProof/>
               </w:rPr>
-              <w:instrText xml:space="preserve"> PAGEREF _Toc239966385 \h </w:instrText>
+              <w:instrText xml:space="preserve"> PAGEREF _Toc240014605 \h </w:instrText>
             </w:r>
             <w:r>
               <w:rPr>
@@ -499,7 +499,7 @@
               <w14:ligatures w14:val="standardContextual"/>
             </w:rPr>
           </w:pPr>
-          <w:hyperlink w:anchor="_Toc239966386" w:history="1">
+          <w:hyperlink w:anchor="_Toc240014606" w:history="1">
             <w:r>
               <w:rPr>
                 <w:rStyle w:val="a5"/>
@@ -523,7 +523,7 @@
               <w:rPr>
                 <w:noProof/>
               </w:rPr>
-              <w:instrText xml:space="preserve"> PAGEREF _Toc239966386 \h </w:instrText>
+              <w:instrText xml:space="preserve"> PAGEREF _Toc240014606 \h </w:instrText>
             </w:r>
             <w:r>
               <w:rPr>
@@ -565,7 +565,7 @@
               <w14:ligatures w14:val="standardContextual"/>
             </w:rPr>
           </w:pPr>
-          <w:hyperlink w:anchor="_Toc239966387" w:history="1">
+          <w:hyperlink w:anchor="_Toc240014607" w:history="1">
             <w:r>
               <w:rPr>
                 <w:rStyle w:val="a5"/>
@@ -589,7 +589,7 @@
               <w:rPr>
                 <w:noProof/>
               </w:rPr>
-              <w:instrText xml:space="preserve"> PAGEREF _Toc239966387 \h </w:instrText>
+              <w:instrText xml:space="preserve"> PAGEREF _Toc240014607 \h </w:instrText>
             </w:r>
             <w:r>
               <w:rPr>
@@ -631,7 +631,7 @@
               <w14:ligatures w14:val="standardContextual"/>
             </w:rPr>
           </w:pPr>
-          <w:hyperlink w:anchor="_Toc239966388" w:history="1">
+          <w:hyperlink w:anchor="_Toc240014608" w:history="1">
             <w:r>
               <w:rPr>
                 <w:rStyle w:val="a5"/>
@@ -655,7 +655,7 @@
               <w:rPr>
                 <w:noProof/>
               </w:rPr>
-              <w:instrText xml:space="preserve"> PAGEREF _Toc239966388 \h </w:instrText>
+              <w:instrText xml:space="preserve"> PAGEREF _Toc240014608 \h </w:instrText>
             </w:r>
             <w:r>
               <w:rPr>
@@ -697,7 +697,7 @@
               <w14:ligatures w14:val="standardContextual"/>
             </w:rPr>
           </w:pPr>
-          <w:hyperlink w:anchor="_Toc239966389" w:history="1">
+          <w:hyperlink w:anchor="_Toc240014609" w:history="1">
             <w:r>
               <w:rPr>
                 <w:rStyle w:val="a5"/>
@@ -721,7 +721,7 @@
               <w:rPr>
                 <w:noProof/>
               </w:rPr>
-              <w:instrText xml:space="preserve"> PAGEREF _Toc239966389 \h </w:instrText>
+              <w:instrText xml:space="preserve"> PAGEREF _Toc240014609 \h </w:instrText>
             </w:r>
             <w:r>
               <w:rPr>
@@ -763,7 +763,7 @@
               <w14:ligatures w14:val="standardContextual"/>
             </w:rPr>
           </w:pPr>
-          <w:hyperlink w:anchor="_Toc239966390" w:history="1">
+          <w:hyperlink w:anchor="_Toc240014610" w:history="1">
             <w:r>
               <w:rPr>
                 <w:rStyle w:val="a5"/>
@@ -787,7 +787,7 @@
               <w:rPr>
                 <w:noProof/>
               </w:rPr>
-              <w:instrText xml:space="preserve"> PAGEREF _Toc239966390 \h </w:instrText>
+              <w:instrText xml:space="preserve"> PAGEREF _Toc240014610 \h </w:instrText>
             </w:r>
             <w:r>
               <w:rPr>
@@ -829,7 +829,7 @@
               <w14:ligatures w14:val="standardContextual"/>
             </w:rPr>
           </w:pPr>
-          <w:hyperlink w:anchor="_Toc239966391" w:history="1">
+          <w:hyperlink w:anchor="_Toc240014611" w:history="1">
             <w:r>
               <w:rPr>
                 <w:rStyle w:val="a5"/>
@@ -853,7 +853,7 @@
               <w:rPr>
                 <w:noProof/>
               </w:rPr>
-              <w:instrText xml:space="preserve"> PAGEREF _Toc239966391 \h </w:instrText>
+              <w:instrText xml:space="preserve"> PAGEREF _Toc240014611 \h </w:instrText>
             </w:r>
             <w:r>
               <w:rPr>
@@ -895,7 +895,7 @@
               <w14:ligatures w14:val="standardContextual"/>
             </w:rPr>
           </w:pPr>
-          <w:hyperlink w:anchor="_Toc239966392" w:history="1">
+          <w:hyperlink w:anchor="_Toc240014612" w:history="1">
             <w:r>
               <w:rPr>
                 <w:rStyle w:val="a5"/>
@@ -919,7 +919,7 @@
               <w:rPr>
                 <w:noProof/>
               </w:rPr>
-              <w:instrText xml:space="preserve"> PAGEREF _Toc239966392 \h </w:instrText>
+              <w:instrText xml:space="preserve"> PAGEREF _Toc240014612 \h </w:instrText>
             </w:r>
             <w:r>
               <w:rPr>
@@ -961,7 +961,7 @@
               <w14:ligatures w14:val="standardContextual"/>
             </w:rPr>
           </w:pPr>
-          <w:hyperlink w:anchor="_Toc239966393" w:history="1">
+          <w:hyperlink w:anchor="_Toc240014613" w:history="1">
             <w:r>
               <w:rPr>
                 <w:rStyle w:val="a5"/>
@@ -985,7 +985,7 @@
               <w:rPr>
                 <w:noProof/>
               </w:rPr>
-              <w:instrText xml:space="preserve"> PAGEREF _Toc239966393 \h </w:instrText>
+              <w:instrText xml:space="preserve"> PAGEREF _Toc240014613 \h </w:instrText>
             </w:r>
             <w:r>
               <w:rPr>
@@ -1027,7 +1027,7 @@
               <w14:ligatures w14:val="standardContextual"/>
             </w:rPr>
           </w:pPr>
-          <w:hyperlink w:anchor="_Toc239966394" w:history="1">
+          <w:hyperlink w:anchor="_Toc240014614" w:history="1">
             <w:r>
               <w:rPr>
                 <w:rStyle w:val="a5"/>
@@ -1051,7 +1051,7 @@
               <w:rPr>
                 <w:noProof/>
               </w:rPr>
-              <w:instrText xml:space="preserve"> PAGEREF _Toc239966394 \h </w:instrText>
+              <w:instrText xml:space="preserve"> PAGEREF _Toc240014614 \h </w:instrText>
             </w:r>
             <w:r>
               <w:rPr>
@@ -1093,7 +1093,7 @@
               <w14:ligatures w14:val="standardContextual"/>
             </w:rPr>
           </w:pPr>
-          <w:hyperlink w:anchor="_Toc239966395" w:history="1">
+          <w:hyperlink w:anchor="_Toc240014615" w:history="1">
             <w:r>
               <w:rPr>
                 <w:rStyle w:val="a5"/>
@@ -1117,7 +1117,7 @@
               <w:rPr>
                 <w:noProof/>
               </w:rPr>
-              <w:instrText xml:space="preserve"> PAGEREF _Toc239966395 \h </w:instrText>
+              <w:instrText xml:space="preserve"> PAGEREF _Toc240014615 \h </w:instrText>
             </w:r>
             <w:r>
               <w:rPr>
@@ -1159,7 +1159,7 @@
               <w14:ligatures w14:val="standardContextual"/>
             </w:rPr>
           </w:pPr>
-          <w:hyperlink w:anchor="_Toc239966396" w:history="1">
+          <w:hyperlink w:anchor="_Toc240014616" w:history="1">
             <w:r>
               <w:rPr>
                 <w:rStyle w:val="a5"/>
@@ -1183,7 +1183,7 @@
               <w:rPr>
                 <w:noProof/>
               </w:rPr>
-              <w:instrText xml:space="preserve"> PAGEREF _Toc239966396 \h </w:instrText>
+              <w:instrText xml:space="preserve"> PAGEREF _Toc240014616 \h </w:instrText>
             </w:r>
             <w:r>
               <w:rPr>
@@ -1225,7 +1225,7 @@
               <w14:ligatures w14:val="standardContextual"/>
             </w:rPr>
           </w:pPr>
-          <w:hyperlink w:anchor="_Toc239966397" w:history="1">
+          <w:hyperlink w:anchor="_Toc240014617" w:history="1">
             <w:r>
               <w:rPr>
                 <w:rStyle w:val="a5"/>
@@ -1249,7 +1249,7 @@
               <w:rPr>
                 <w:noProof/>
               </w:rPr>
-              <w:instrText xml:space="preserve"> PAGEREF _Toc239966397 \h </w:instrText>
+              <w:instrText xml:space="preserve"> PAGEREF _Toc240014617 \h </w:instrText>
             </w:r>
             <w:r>
               <w:rPr>
@@ -1291,7 +1291,7 @@
               <w14:ligatures w14:val="standardContextual"/>
             </w:rPr>
           </w:pPr>
-          <w:hyperlink w:anchor="_Toc239966398" w:history="1">
+          <w:hyperlink w:anchor="_Toc240014618" w:history="1">
             <w:r>
               <w:rPr>
                 <w:rStyle w:val="a5"/>
@@ -1315,7 +1315,7 @@
               <w:rPr>
                 <w:noProof/>
               </w:rPr>
-              <w:instrText xml:space="preserve"> PAGEREF _Toc239966398 \h </w:instrText>
+              <w:instrText xml:space="preserve"> PAGEREF _Toc240014618 \h </w:instrText>
             </w:r>
             <w:r>
               <w:rPr>
@@ -1357,7 +1357,7 @@
               <w14:ligatures w14:val="standardContextual"/>
             </w:rPr>
           </w:pPr>
-          <w:hyperlink w:anchor="_Toc239966399" w:history="1">
+          <w:hyperlink w:anchor="_Toc240014619" w:history="1">
             <w:r>
               <w:rPr>
                 <w:rStyle w:val="a5"/>
@@ -1381,7 +1381,7 @@
               <w:rPr>
                 <w:noProof/>
               </w:rPr>
-              <w:instrText xml:space="preserve"> PAGEREF _Toc239966399 \h </w:instrText>
+              <w:instrText xml:space="preserve"> PAGEREF _Toc240014619 \h </w:instrText>
             </w:r>
             <w:r>
               <w:rPr>
@@ -1423,7 +1423,7 @@
               <w14:ligatures w14:val="standardContextual"/>
             </w:rPr>
           </w:pPr>
-          <w:hyperlink w:anchor="_Toc239966400" w:history="1">
+          <w:hyperlink w:anchor="_Toc240014620" w:history="1">
             <w:r>
               <w:rPr>
                 <w:rStyle w:val="a5"/>
@@ -1447,7 +1447,7 @@
               <w:rPr>
                 <w:noProof/>
               </w:rPr>
-              <w:instrText xml:space="preserve"> PAGEREF _Toc239966400 \h </w:instrText>
+              <w:instrText xml:space="preserve"> PAGEREF _Toc240014620 \h </w:instrText>
             </w:r>
             <w:r>
               <w:rPr>
@@ -1490,7 +1490,7 @@
       <w:pPr>
         <w:pStyle w:val="1"/>
       </w:pPr>
-      <w:bookmarkStart w:id="0" w:name="_Toc239966380"/>
+      <w:bookmarkStart w:id="0" w:name="_Toc240014600"/>
       <w:r>
         <w:lastRenderedPageBreak/>
         <w:t>1. Purpose</w:t>
@@ -1517,7 +1517,7 @@
       <w:pPr>
         <w:pStyle w:val="1"/>
       </w:pPr>
-      <w:bookmarkStart w:id="1" w:name="_Toc239966381"/>
+      <w:bookmarkStart w:id="1" w:name="_Toc240014601"/>
       <w:r>
         <w:t>2. Scope and non-goals</w:t>
       </w:r>
@@ -1592,7 +1592,7 @@
       <w:pPr>
         <w:pStyle w:val="1"/>
       </w:pPr>
-      <w:bookmarkStart w:id="2" w:name="_Toc239966382"/>
+      <w:bookmarkStart w:id="2" w:name="_Toc240014602"/>
       <w:r>
         <w:t>3. Users and operating environment</w:t>
       </w:r>
@@ -1654,7 +1654,7 @@
       <w:pPr>
         <w:pStyle w:val="1"/>
       </w:pPr>
-      <w:bookmarkStart w:id="3" w:name="_Toc239966383"/>
+      <w:bookmarkStart w:id="3" w:name="_Toc240014603"/>
       <w:r>
         <w:t>4. Input</w:t>
       </w:r>
@@ -2473,7 +2473,7 @@
       <w:pPr>
         <w:pStyle w:val="1"/>
       </w:pPr>
-      <w:bookmarkStart w:id="4" w:name="_Toc239966384"/>
+      <w:bookmarkStart w:id="4" w:name="_Toc240014604"/>
       <w:r>
         <w:t>5. Data sources</w:t>
       </w:r>
@@ -2483,7 +2483,7 @@
       <w:pPr>
         <w:pStyle w:val="2"/>
       </w:pPr>
-      <w:bookmarkStart w:id="5" w:name="_Toc239966385"/>
+      <w:bookmarkStart w:id="5" w:name="_Toc240014605"/>
       <w:r>
         <w:t>5.1 Local index (offline)</w:t>
       </w:r>
@@ -3080,7 +3080,7 @@
       <w:pPr>
         <w:pStyle w:val="2"/>
       </w:pPr>
-      <w:bookmarkStart w:id="6" w:name="_Toc239966386"/>
+      <w:bookmarkStart w:id="6" w:name="_Toc240014606"/>
       <w:r>
         <w:t>5.2 Public API lookups (online, switchable)</w:t>
       </w:r>
@@ -3942,7 +3942,7 @@
       <w:pPr>
         <w:pStyle w:val="1"/>
       </w:pPr>
-      <w:bookmarkStart w:id="7" w:name="_Toc239966387"/>
+      <w:bookmarkStart w:id="7" w:name="_Toc240014607"/>
       <w:r>
         <w:t>6. Processing pipeline</w:t>
       </w:r>
@@ -4043,7 +4043,7 @@
       <w:pPr>
         <w:pStyle w:val="1"/>
       </w:pPr>
-      <w:bookmarkStart w:id="8" w:name="_Toc239966388"/>
+      <w:bookmarkStart w:id="8" w:name="_Toc240014608"/>
       <w:r>
         <w:t>7. Mapping of evidence to ACMG criteria</w:t>
       </w:r>
@@ -5205,7 +5205,7 @@
       <w:pPr>
         <w:pStyle w:val="2"/>
       </w:pPr>
-      <w:bookmarkStart w:id="9" w:name="_Toc239966389"/>
+      <w:bookmarkStart w:id="9" w:name="_Toc240014609"/>
       <w:r>
         <w:t>7.1 Model adopted for PP3/BP4, and consistency with SpliceAI</w:t>
       </w:r>
@@ -5692,7 +5692,7 @@
       <w:pPr>
         <w:pStyle w:val="2"/>
       </w:pPr>
-      <w:bookmarkStart w:id="10" w:name="_Toc239966390"/>
+      <w:bookmarkStart w:id="10" w:name="_Toc240014610"/>
       <w:r>
         <w:t>7.2 Population-frequency retrieval states and PM2</w:t>
       </w:r>
@@ -6435,7 +6435,7 @@
       <w:pPr>
         <w:pStyle w:val="1"/>
       </w:pPr>
-      <w:bookmarkStart w:id="11" w:name="_Toc239966391"/>
+      <w:bookmarkStart w:id="11" w:name="_Toc240014611"/>
       <w:r>
         <w:t>8. Variants without a FuncVEP score</w:t>
       </w:r>
@@ -6524,7 +6524,7 @@
       <w:pPr>
         <w:pStyle w:val="1"/>
       </w:pPr>
-      <w:bookmarkStart w:id="12" w:name="_Toc239966392"/>
+      <w:bookmarkStart w:id="12" w:name="_Toc240014612"/>
       <w:r>
         <w:t>9. Report structure</w:t>
       </w:r>
@@ -6592,7 +6592,7 @@
         <w:spacing w:after="80" w:line="280" w:lineRule="auto"/>
       </w:pPr>
       <w:r>
-        <w:t>Per variant (banded heading; page break before the second candidate): population frequency (gnomAD), FuncVEP, other predictors (ClinVEP, AlphaMissense, REVEL, SpliceAI), functional-assay data (MaveDB, when available), summary of predictor calls (tinted box), ClinVar (this variant), ClinVar (other variants at the same amino-acid position)</w:t>
+        <w:t>Per variant (banded heading; page break before the second candidate): population frequency (gnomAD), FuncVEP, other predictors (ClinVEP, AlphaMissense, REVEL, SpliceAI), functional-assay data (MaveDB, when available), summary of predictor calls (tinted box), ClinVar (this variant), ClinVar (other variants registered at the same amino-acid position)</w:t>
       </w:r>
     </w:p>
     <w:p>
@@ -6646,7 +6646,7 @@
       <w:pPr>
         <w:pStyle w:val="1"/>
       </w:pPr>
-      <w:bookmarkStart w:id="13" w:name="_Toc239966393"/>
+      <w:bookmarkStart w:id="13" w:name="_Toc240014613"/>
       <w:r>
         <w:t>10. Verification</w:t>
       </w:r>
@@ -7531,7 +7531,7 @@
       <w:pPr>
         <w:pStyle w:val="1"/>
       </w:pPr>
-      <w:bookmarkStart w:id="14" w:name="_Toc239966394"/>
+      <w:bookmarkStart w:id="14" w:name="_Toc240014614"/>
       <w:r>
         <w:t>11. Interpretation limits</w:t>
       </w:r>
@@ -7632,7 +7632,7 @@
       <w:pPr>
         <w:pStyle w:val="1"/>
       </w:pPr>
-      <w:bookmarkStart w:id="15" w:name="_Toc239966395"/>
+      <w:bookmarkStart w:id="15" w:name="_Toc240014615"/>
       <w:r>
         <w:t>12. Licensing and data governance</w:t>
       </w:r>
@@ -7681,7 +7681,7 @@
       <w:pPr>
         <w:pStyle w:val="1"/>
       </w:pPr>
-      <w:bookmarkStart w:id="16" w:name="_Toc239966396"/>
+      <w:bookmarkStart w:id="16" w:name="_Toc240014616"/>
       <w:r>
         <w:t>13. Acknowledgements</w:t>
       </w:r>
@@ -7704,7 +7704,7 @@
       <w:pPr>
         <w:pStyle w:val="1"/>
       </w:pPr>
-      <w:bookmarkStart w:id="17" w:name="_Toc239966397"/>
+      <w:bookmarkStart w:id="17" w:name="_Toc240014617"/>
       <w:r>
         <w:t>Appendix A. PP3/BP4 thresholds (Supplementary Table 13)</w:t>
       </w:r>
@@ -8980,7 +8980,7 @@
       <w:pPr>
         <w:pStyle w:val="1"/>
       </w:pPr>
-      <w:bookmarkStart w:id="18" w:name="_Toc239966398"/>
+      <w:bookmarkStart w:id="18" w:name="_Toc240014618"/>
       <w:r>
         <w:t>Appendix B. Components</w:t>
       </w:r>
@@ -9674,7 +9674,7 @@
       <w:pPr>
         <w:pStyle w:val="1"/>
       </w:pPr>
-      <w:bookmarkStart w:id="19" w:name="_Toc239966399"/>
+      <w:bookmarkStart w:id="19" w:name="_Toc240014619"/>
       <w:r>
         <w:t>Appendix C. Questions for the authors</w:t>
       </w:r>
@@ -9723,7 +9723,7 @@
       <w:pPr>
         <w:pStyle w:val="1"/>
       </w:pPr>
-      <w:bookmarkStart w:id="20" w:name="_Toc239966400"/>
+      <w:bookmarkStart w:id="20" w:name="_Toc240014620"/>
       <w:r>
         <w:t>Appendix D. Changes from version 1.0 (response to the design review)</w:t>
       </w:r>
@@ -9970,10 +9970,10 @@
 <file path=word/numbering.xml><?xml version="1.0" encoding="utf-8"?>
 <w:numbering xmlns:wpc="http://schemas.microsoft.com/office/word/2010/wordprocessingCanvas" xmlns:cx="http://schemas.microsoft.com/office/drawing/2014/chartex" xmlns:cx1="http://schemas.microsoft.com/office/drawing/2015/9/8/chartex" xmlns:cx2="http://schemas.microsoft.com/office/drawing/2015/10/21/chartex" xmlns:cx3="http://schemas.microsoft.com/office/drawing/2016/5/9/chartex" xmlns:cx4="http://schemas.microsoft.com/office/drawing/2016/5/10/chartex" xmlns:cx5="http://schemas.microsoft.com/office/drawing/2016/5/11/chartex" xmlns:cx6="http://schemas.microsoft.com/office/drawing/2016/5/12/chartex" xmlns:cx7="http://schemas.microsoft.com/office/drawing/2016/5/13/chartex" xmlns:cx8="http://schemas.microsoft.com/office/drawing/2016/5/14/chartex" xmlns:mc="http://schemas.openxmlformats.org/markup-compatibility/2006" xmlns:aink="http://schemas.microsoft.com/office/drawing/2016/ink" xmlns:am3d="http://schemas.microsoft.com/office/drawing/2017/model3d" xmlns:o="urn:schemas-microsoft-com:office:office" xmlns:oel="http://schemas.microsoft.com/office/2019/extlst" xmlns:r="http://schemas.openxmlformats.org/officeDocument/2006/relationships" xmlns:m="http://schemas.openxmlformats.org/officeDocument/2006/math" xmlns:v="urn:schemas-microsoft-com:vml" xmlns:wp14="http://schemas.microsoft.com/office/word/2010/wordprocessingDrawing" xmlns:wp="http://schemas.openxmlformats.org/drawingml/2006/wordprocessingDrawing" xmlns:w10="urn:schemas-microsoft-com:office:word" xmlns:w="http://schemas.openxmlformats.org/wordprocessingml/2006/main" xmlns:w14="http://schemas.microsoft.com/office/word/2010/wordml" xmlns:w15="http://schemas.microsoft.com/office/word/2012/wordml" xmlns:w16cex="http://schemas.microsoft.com/office/word/2018/wordml/cex" xmlns:w16cid="http://schemas.microsoft.com/office/word/2016/wordml/cid" xmlns:w16="http://schemas.microsoft.com/office/word/2018/wordml" xmlns:w16du="http://schemas.microsoft.com/office/word/2023/wordml/word16du" xmlns:w16sdtdh="http://schemas.microsoft.com/office/word/2020/wordml/sdtdatahash" xmlns:w16sdtfl="http://schemas.microsoft.com/office/word/2024/wordml/sdtformatlock" xmlns:w16se="http://schemas.microsoft.com/office/word/2015/wordml/symex" xmlns:wpg="http://schemas.microsoft.com/office/word/2010/wordprocessingGroup" xmlns:wpi="http://schemas.microsoft.com/office/word/2010/wordprocessingInk" xmlns:wne="http://schemas.microsoft.com/office/word/2006/wordml" xmlns:wps="http://schemas.microsoft.com/office/word/2010/wordprocessingShape" mc:Ignorable="w14 w15 w16se w16cid w16 w16cex w16sdtdh w16sdtfl w16du wp14">
   <w:abstractNum w:abstractNumId="0" w15:restartNumberingAfterBreak="0">
-    <w:nsid w:val="074D547D"/>
+    <w:nsid w:val="08C10939"/>
     <w:multiLevelType w:val="hybridMultilevel"/>
-    <w:tmpl w:val="199A89C0"/>
-    <w:lvl w:ilvl="0" w:tplc="20CA31AC">
+    <w:tmpl w:val="E3FCD430"/>
+    <w:lvl w:ilvl="0" w:tplc="BE6855A0">
       <w:start w:val="1"/>
       <w:numFmt w:val="decimal"/>
       <w:lvlText w:val="%1."/>
@@ -9982,52 +9982,52 @@
         <w:ind w:left="540" w:hanging="360"/>
       </w:pPr>
     </w:lvl>
-    <w:lvl w:ilvl="1" w:tplc="21228084">
+    <w:lvl w:ilvl="1" w:tplc="5F3C0574">
       <w:numFmt w:val="decimal"/>
       <w:lvlText w:val=""/>
       <w:lvlJc w:val="left"/>
     </w:lvl>
-    <w:lvl w:ilvl="2" w:tplc="C44A0338">
+    <w:lvl w:ilvl="2" w:tplc="9216E714">
       <w:numFmt w:val="decimal"/>
       <w:lvlText w:val=""/>
       <w:lvlJc w:val="left"/>
     </w:lvl>
-    <w:lvl w:ilvl="3" w:tplc="E9D8A338">
+    <w:lvl w:ilvl="3" w:tplc="983CC72A">
       <w:numFmt w:val="decimal"/>
       <w:lvlText w:val=""/>
       <w:lvlJc w:val="left"/>
     </w:lvl>
-    <w:lvl w:ilvl="4" w:tplc="0CFA46FC">
+    <w:lvl w:ilvl="4" w:tplc="3E8E4DD8">
       <w:numFmt w:val="decimal"/>
       <w:lvlText w:val=""/>
       <w:lvlJc w:val="left"/>
     </w:lvl>
-    <w:lvl w:ilvl="5" w:tplc="BE844F00">
+    <w:lvl w:ilvl="5" w:tplc="C2F827FC">
       <w:numFmt w:val="decimal"/>
       <w:lvlText w:val=""/>
       <w:lvlJc w:val="left"/>
     </w:lvl>
-    <w:lvl w:ilvl="6" w:tplc="02CCCA10">
+    <w:lvl w:ilvl="6" w:tplc="75F6BE86">
       <w:numFmt w:val="decimal"/>
       <w:lvlText w:val=""/>
       <w:lvlJc w:val="left"/>
     </w:lvl>
-    <w:lvl w:ilvl="7" w:tplc="802A40F2">
+    <w:lvl w:ilvl="7" w:tplc="CE04F340">
       <w:numFmt w:val="decimal"/>
       <w:lvlText w:val=""/>
       <w:lvlJc w:val="left"/>
     </w:lvl>
-    <w:lvl w:ilvl="8" w:tplc="EE6E8C64">
+    <w:lvl w:ilvl="8" w:tplc="63C27D30">
       <w:numFmt w:val="decimal"/>
       <w:lvlText w:val=""/>
       <w:lvlJc w:val="left"/>
     </w:lvl>
   </w:abstractNum>
   <w:abstractNum w:abstractNumId="1" w15:restartNumberingAfterBreak="0">
-    <w:nsid w:val="0FB838C5"/>
+    <w:nsid w:val="114405AC"/>
     <w:multiLevelType w:val="hybridMultilevel"/>
-    <w:tmpl w:val="591A965C"/>
-    <w:lvl w:ilvl="0" w:tplc="B950EA9C">
+    <w:tmpl w:val="953ED474"/>
+    <w:lvl w:ilvl="0" w:tplc="178CA02C">
       <w:start w:val="1"/>
       <w:numFmt w:val="decimal"/>
       <w:lvlText w:val="%1."/>
@@ -10036,52 +10036,52 @@
         <w:ind w:left="540" w:hanging="360"/>
       </w:pPr>
     </w:lvl>
-    <w:lvl w:ilvl="1" w:tplc="0CB6DCE4">
+    <w:lvl w:ilvl="1" w:tplc="463CED12">
       <w:numFmt w:val="decimal"/>
       <w:lvlText w:val=""/>
       <w:lvlJc w:val="left"/>
     </w:lvl>
-    <w:lvl w:ilvl="2" w:tplc="B5786EA8">
+    <w:lvl w:ilvl="2" w:tplc="7F94AD70">
       <w:numFmt w:val="decimal"/>
       <w:lvlText w:val=""/>
       <w:lvlJc w:val="left"/>
     </w:lvl>
-    <w:lvl w:ilvl="3" w:tplc="C50838C0">
+    <w:lvl w:ilvl="3" w:tplc="50AAF216">
       <w:numFmt w:val="decimal"/>
       <w:lvlText w:val=""/>
       <w:lvlJc w:val="left"/>
     </w:lvl>
-    <w:lvl w:ilvl="4" w:tplc="A8A083F8">
+    <w:lvl w:ilvl="4" w:tplc="DFCE7E6C">
       <w:numFmt w:val="decimal"/>
       <w:lvlText w:val=""/>
       <w:lvlJc w:val="left"/>
     </w:lvl>
-    <w:lvl w:ilvl="5" w:tplc="6AF0FAD0">
+    <w:lvl w:ilvl="5" w:tplc="756C26C6">
       <w:numFmt w:val="decimal"/>
       <w:lvlText w:val=""/>
       <w:lvlJc w:val="left"/>
     </w:lvl>
-    <w:lvl w:ilvl="6" w:tplc="A0766274">
+    <w:lvl w:ilvl="6" w:tplc="DA324874">
       <w:numFmt w:val="decimal"/>
       <w:lvlText w:val=""/>
       <w:lvlJc w:val="left"/>
     </w:lvl>
-    <w:lvl w:ilvl="7" w:tplc="8C4E283A">
+    <w:lvl w:ilvl="7" w:tplc="09AEDD12">
       <w:numFmt w:val="decimal"/>
       <w:lvlText w:val=""/>
       <w:lvlJc w:val="left"/>
     </w:lvl>
-    <w:lvl w:ilvl="8" w:tplc="A2E0FE0C">
+    <w:lvl w:ilvl="8" w:tplc="7D3618D8">
       <w:numFmt w:val="decimal"/>
       <w:lvlText w:val=""/>
       <w:lvlJc w:val="left"/>
     </w:lvl>
   </w:abstractNum>
   <w:abstractNum w:abstractNumId="2" w15:restartNumberingAfterBreak="0">
-    <w:nsid w:val="13042D9D"/>
+    <w:nsid w:val="1A346B0D"/>
     <w:multiLevelType w:val="hybridMultilevel"/>
-    <w:tmpl w:val="4596E6F4"/>
-    <w:lvl w:ilvl="0" w:tplc="CA1C34C0">
+    <w:tmpl w:val="4C8AACE0"/>
+    <w:lvl w:ilvl="0" w:tplc="8B1C53C2">
       <w:start w:val="1"/>
       <w:numFmt w:val="decimal"/>
       <w:lvlText w:val="%1."/>
@@ -10090,52 +10090,52 @@
         <w:ind w:left="540" w:hanging="360"/>
       </w:pPr>
     </w:lvl>
-    <w:lvl w:ilvl="1" w:tplc="2050EBE8">
+    <w:lvl w:ilvl="1" w:tplc="B456E85C">
       <w:numFmt w:val="decimal"/>
       <w:lvlText w:val=""/>
       <w:lvlJc w:val="left"/>
     </w:lvl>
-    <w:lvl w:ilvl="2" w:tplc="B8CE25A4">
+    <w:lvl w:ilvl="2" w:tplc="D51C1586">
       <w:numFmt w:val="decimal"/>
       <w:lvlText w:val=""/>
       <w:lvlJc w:val="left"/>
     </w:lvl>
-    <w:lvl w:ilvl="3" w:tplc="46A6D674">
+    <w:lvl w:ilvl="3" w:tplc="16B2285A">
       <w:numFmt w:val="decimal"/>
       <w:lvlText w:val=""/>
       <w:lvlJc w:val="left"/>
     </w:lvl>
-    <w:lvl w:ilvl="4" w:tplc="AFCA5706">
+    <w:lvl w:ilvl="4" w:tplc="7332B88E">
       <w:numFmt w:val="decimal"/>
       <w:lvlText w:val=""/>
       <w:lvlJc w:val="left"/>
     </w:lvl>
-    <w:lvl w:ilvl="5" w:tplc="03D2EDA0">
+    <w:lvl w:ilvl="5" w:tplc="D42E5ECC">
       <w:numFmt w:val="decimal"/>
       <w:lvlText w:val=""/>
       <w:lvlJc w:val="left"/>
     </w:lvl>
-    <w:lvl w:ilvl="6" w:tplc="A9A0D402">
+    <w:lvl w:ilvl="6" w:tplc="248C7DA4">
       <w:numFmt w:val="decimal"/>
       <w:lvlText w:val=""/>
       <w:lvlJc w:val="left"/>
     </w:lvl>
-    <w:lvl w:ilvl="7" w:tplc="DBF010AA">
+    <w:lvl w:ilvl="7" w:tplc="78E68D8C">
       <w:numFmt w:val="decimal"/>
       <w:lvlText w:val=""/>
       <w:lvlJc w:val="left"/>
     </w:lvl>
-    <w:lvl w:ilvl="8" w:tplc="C0D0A06E">
+    <w:lvl w:ilvl="8" w:tplc="D36A299A">
       <w:numFmt w:val="decimal"/>
       <w:lvlText w:val=""/>
       <w:lvlJc w:val="left"/>
     </w:lvl>
   </w:abstractNum>
   <w:abstractNum w:abstractNumId="3" w15:restartNumberingAfterBreak="0">
-    <w:nsid w:val="1388782A"/>
+    <w:nsid w:val="1C3E2168"/>
     <w:multiLevelType w:val="hybridMultilevel"/>
-    <w:tmpl w:val="8FB0C084"/>
-    <w:lvl w:ilvl="0" w:tplc="FCA4E85E">
+    <w:tmpl w:val="79B2FC72"/>
+    <w:lvl w:ilvl="0" w:tplc="58E837BE">
       <w:start w:val="1"/>
       <w:numFmt w:val="decimal"/>
       <w:lvlText w:val="%1."/>
@@ -10144,52 +10144,138 @@
         <w:ind w:left="540" w:hanging="360"/>
       </w:pPr>
     </w:lvl>
-    <w:lvl w:ilvl="1" w:tplc="E028FD88">
+    <w:lvl w:ilvl="1" w:tplc="CFF43CE6">
       <w:numFmt w:val="decimal"/>
       <w:lvlText w:val=""/>
       <w:lvlJc w:val="left"/>
     </w:lvl>
-    <w:lvl w:ilvl="2" w:tplc="05723DC6">
+    <w:lvl w:ilvl="2" w:tplc="C3204FF8">
       <w:numFmt w:val="decimal"/>
       <w:lvlText w:val=""/>
       <w:lvlJc w:val="left"/>
     </w:lvl>
-    <w:lvl w:ilvl="3" w:tplc="376C9DDE">
+    <w:lvl w:ilvl="3" w:tplc="3D0A1C7E">
       <w:numFmt w:val="decimal"/>
       <w:lvlText w:val=""/>
       <w:lvlJc w:val="left"/>
     </w:lvl>
-    <w:lvl w:ilvl="4" w:tplc="FD949E0A">
+    <w:lvl w:ilvl="4" w:tplc="63EA6FE8">
       <w:numFmt w:val="decimal"/>
       <w:lvlText w:val=""/>
       <w:lvlJc w:val="left"/>
     </w:lvl>
-    <w:lvl w:ilvl="5" w:tplc="5E289FDA">
+    <w:lvl w:ilvl="5" w:tplc="786895CE">
       <w:numFmt w:val="decimal"/>
       <w:lvlText w:val=""/>
       <w:lvlJc w:val="left"/>
     </w:lvl>
-    <w:lvl w:ilvl="6" w:tplc="D5A84EE8">
+    <w:lvl w:ilvl="6" w:tplc="AD808F28">
       <w:numFmt w:val="decimal"/>
       <w:lvlText w:val=""/>
       <w:lvlJc w:val="left"/>
     </w:lvl>
-    <w:lvl w:ilvl="7" w:tplc="6F462824">
+    <w:lvl w:ilvl="7" w:tplc="75F25600">
       <w:numFmt w:val="decimal"/>
       <w:lvlText w:val=""/>
       <w:lvlJc w:val="left"/>
     </w:lvl>
-    <w:lvl w:ilvl="8" w:tplc="5E58E634">
+    <w:lvl w:ilvl="8" w:tplc="B28C28F4">
       <w:numFmt w:val="decimal"/>
       <w:lvlText w:val=""/>
       <w:lvlJc w:val="left"/>
     </w:lvl>
   </w:abstractNum>
   <w:abstractNum w:abstractNumId="4" w15:restartNumberingAfterBreak="0">
-    <w:nsid w:val="15C44217"/>
+    <w:nsid w:val="1D091C93"/>
     <w:multiLevelType w:val="hybridMultilevel"/>
-    <w:tmpl w:val="80640F70"/>
-    <w:lvl w:ilvl="0" w:tplc="A1C8102C">
+    <w:tmpl w:val="B9B25CF0"/>
+    <w:lvl w:ilvl="0" w:tplc="C0B8E044">
+      <w:start w:val="1"/>
+      <w:numFmt w:val="bullet"/>
+      <w:lvlText w:val="●"/>
+      <w:lvlJc w:val="left"/>
+      <w:pPr>
+        <w:ind w:left="720" w:hanging="360"/>
+      </w:pPr>
+    </w:lvl>
+    <w:lvl w:ilvl="1" w:tplc="175ECBC0">
+      <w:start w:val="1"/>
+      <w:numFmt w:val="bullet"/>
+      <w:lvlText w:val="○"/>
+      <w:lvlJc w:val="left"/>
+      <w:pPr>
+        <w:ind w:left="1440" w:hanging="360"/>
+      </w:pPr>
+    </w:lvl>
+    <w:lvl w:ilvl="2" w:tplc="33EEA416">
+      <w:start w:val="1"/>
+      <w:numFmt w:val="bullet"/>
+      <w:lvlText w:val="■"/>
+      <w:lvlJc w:val="left"/>
+      <w:pPr>
+        <w:ind w:left="2160" w:hanging="360"/>
+      </w:pPr>
+    </w:lvl>
+    <w:lvl w:ilvl="3" w:tplc="6E621C38">
+      <w:start w:val="1"/>
+      <w:numFmt w:val="bullet"/>
+      <w:lvlText w:val="●"/>
+      <w:lvlJc w:val="left"/>
+      <w:pPr>
+        <w:ind w:left="2880" w:hanging="360"/>
+      </w:pPr>
+    </w:lvl>
+    <w:lvl w:ilvl="4" w:tplc="04DA63D8">
+      <w:start w:val="1"/>
+      <w:numFmt w:val="bullet"/>
+      <w:lvlText w:val="○"/>
+      <w:lvlJc w:val="left"/>
+      <w:pPr>
+        <w:ind w:left="3600" w:hanging="360"/>
+      </w:pPr>
+    </w:lvl>
+    <w:lvl w:ilvl="5" w:tplc="D160E50A">
+      <w:start w:val="1"/>
+      <w:numFmt w:val="bullet"/>
+      <w:lvlText w:val="■"/>
+      <w:lvlJc w:val="left"/>
+      <w:pPr>
+        <w:ind w:left="4320" w:hanging="360"/>
+      </w:pPr>
+    </w:lvl>
+    <w:lvl w:ilvl="6" w:tplc="53C052C2">
+      <w:start w:val="1"/>
+      <w:numFmt w:val="bullet"/>
+      <w:lvlText w:val="●"/>
+      <w:lvlJc w:val="left"/>
+      <w:pPr>
+        <w:ind w:left="5040" w:hanging="360"/>
+      </w:pPr>
+    </w:lvl>
+    <w:lvl w:ilvl="7" w:tplc="38B03716">
+      <w:start w:val="1"/>
+      <w:numFmt w:val="bullet"/>
+      <w:lvlText w:val="●"/>
+      <w:lvlJc w:val="left"/>
+      <w:pPr>
+        <w:ind w:left="5760" w:hanging="360"/>
+      </w:pPr>
+    </w:lvl>
+    <w:lvl w:ilvl="8" w:tplc="D856F18A">
+      <w:start w:val="1"/>
+      <w:numFmt w:val="bullet"/>
+      <w:lvlText w:val="●"/>
+      <w:lvlJc w:val="left"/>
+      <w:pPr>
+        <w:ind w:left="6480" w:hanging="360"/>
+      </w:pPr>
+    </w:lvl>
+  </w:abstractNum>
+  <w:abstractNum w:abstractNumId="5" w15:restartNumberingAfterBreak="0">
+    <w:nsid w:val="237573D7"/>
+    <w:multiLevelType w:val="hybridMultilevel"/>
+    <w:tmpl w:val="9DD8E9FC"/>
+    <w:lvl w:ilvl="0" w:tplc="0A0023E0">
       <w:start w:val="1"/>
       <w:numFmt w:val="decimal"/>
       <w:lvlText w:val="%1."/>
@@ -10198,52 +10284,52 @@
         <w:ind w:left="540" w:hanging="360"/>
       </w:pPr>
     </w:lvl>
-    <w:lvl w:ilvl="1" w:tplc="E62CBDC6">
+    <w:lvl w:ilvl="1" w:tplc="9BC0998A">
       <w:numFmt w:val="decimal"/>
       <w:lvlText w:val=""/>
       <w:lvlJc w:val="left"/>
     </w:lvl>
-    <w:lvl w:ilvl="2" w:tplc="C6FA1AF8">
+    <w:lvl w:ilvl="2" w:tplc="AC1C56D8">
       <w:numFmt w:val="decimal"/>
       <w:lvlText w:val=""/>
       <w:lvlJc w:val="left"/>
     </w:lvl>
-    <w:lvl w:ilvl="3" w:tplc="18CC9A04">
+    <w:lvl w:ilvl="3" w:tplc="30DA8C6A">
       <w:numFmt w:val="decimal"/>
       <w:lvlText w:val=""/>
       <w:lvlJc w:val="left"/>
     </w:lvl>
-    <w:lvl w:ilvl="4" w:tplc="F8382904">
+    <w:lvl w:ilvl="4" w:tplc="225EDE02">
       <w:numFmt w:val="decimal"/>
       <w:lvlText w:val=""/>
       <w:lvlJc w:val="left"/>
     </w:lvl>
-    <w:lvl w:ilvl="5" w:tplc="D3B8D7F4">
+    <w:lvl w:ilvl="5" w:tplc="A1F48D58">
       <w:numFmt w:val="decimal"/>
       <w:lvlText w:val=""/>
       <w:lvlJc w:val="left"/>
     </w:lvl>
-    <w:lvl w:ilvl="6" w:tplc="43C42E0E">
+    <w:lvl w:ilvl="6" w:tplc="FF0E803C">
       <w:numFmt w:val="decimal"/>
       <w:lvlText w:val=""/>
       <w:lvlJc w:val="left"/>
     </w:lvl>
-    <w:lvl w:ilvl="7" w:tplc="44280CAC">
+    <w:lvl w:ilvl="7" w:tplc="24345196">
       <w:numFmt w:val="decimal"/>
       <w:lvlText w:val=""/>
       <w:lvlJc w:val="left"/>
     </w:lvl>
-    <w:lvl w:ilvl="8" w:tplc="64769EF0">
+    <w:lvl w:ilvl="8" w:tplc="82A0D544">
       <w:numFmt w:val="decimal"/>
       <w:lvlText w:val=""/>
       <w:lvlJc w:val="left"/>
     </w:lvl>
   </w:abstractNum>
-  <w:abstractNum w:abstractNumId="5" w15:restartNumberingAfterBreak="0">
-    <w:nsid w:val="1ECC248A"/>
+  <w:abstractNum w:abstractNumId="6" w15:restartNumberingAfterBreak="0">
+    <w:nsid w:val="273603B2"/>
     <w:multiLevelType w:val="hybridMultilevel"/>
-    <w:tmpl w:val="15886738"/>
-    <w:lvl w:ilvl="0" w:tplc="2F762D08">
+    <w:tmpl w:val="F56E3C46"/>
+    <w:lvl w:ilvl="0" w:tplc="DCDEE214">
       <w:start w:val="1"/>
       <w:numFmt w:val="decimal"/>
       <w:lvlText w:val="%1."/>
@@ -10252,52 +10338,376 @@
         <w:ind w:left="540" w:hanging="360"/>
       </w:pPr>
     </w:lvl>
-    <w:lvl w:ilvl="1" w:tplc="E006ED9C">
+    <w:lvl w:ilvl="1" w:tplc="CBD4107E">
       <w:numFmt w:val="decimal"/>
       <w:lvlText w:val=""/>
       <w:lvlJc w:val="left"/>
     </w:lvl>
-    <w:lvl w:ilvl="2" w:tplc="42A4D87C">
+    <w:lvl w:ilvl="2" w:tplc="28362724">
       <w:numFmt w:val="decimal"/>
       <w:lvlText w:val=""/>
       <w:lvlJc w:val="left"/>
     </w:lvl>
-    <w:lvl w:ilvl="3" w:tplc="88E41338">
+    <w:lvl w:ilvl="3" w:tplc="DFDC7AD2">
       <w:numFmt w:val="decimal"/>
       <w:lvlText w:val=""/>
       <w:lvlJc w:val="left"/>
     </w:lvl>
-    <w:lvl w:ilvl="4" w:tplc="C324F068">
+    <w:lvl w:ilvl="4" w:tplc="254C59D0">
       <w:numFmt w:val="decimal"/>
       <w:lvlText w:val=""/>
       <w:lvlJc w:val="left"/>
     </w:lvl>
-    <w:lvl w:ilvl="5" w:tplc="6F3CC8FE">
+    <w:lvl w:ilvl="5" w:tplc="EEC6E00A">
       <w:numFmt w:val="decimal"/>
       <w:lvlText w:val=""/>
       <w:lvlJc w:val="left"/>
     </w:lvl>
-    <w:lvl w:ilvl="6" w:tplc="48E87B0E">
+    <w:lvl w:ilvl="6" w:tplc="9886B7F4">
       <w:numFmt w:val="decimal"/>
       <w:lvlText w:val=""/>
       <w:lvlJc w:val="left"/>
     </w:lvl>
-    <w:lvl w:ilvl="7" w:tplc="43F230A8">
+    <w:lvl w:ilvl="7" w:tplc="B7107E70">
       <w:numFmt w:val="decimal"/>
       <w:lvlText w:val=""/>
       <w:lvlJc w:val="left"/>
     </w:lvl>
-    <w:lvl w:ilvl="8" w:tplc="1A08F868">
+    <w:lvl w:ilvl="8" w:tplc="1C0A1A36">
       <w:numFmt w:val="decimal"/>
       <w:lvlText w:val=""/>
       <w:lvlJc w:val="left"/>
     </w:lvl>
   </w:abstractNum>
-  <w:abstractNum w:abstractNumId="6" w15:restartNumberingAfterBreak="0">
-    <w:nsid w:val="26886F1C"/>
+  <w:abstractNum w:abstractNumId="7" w15:restartNumberingAfterBreak="0">
+    <w:nsid w:val="3CF77DE4"/>
     <w:multiLevelType w:val="hybridMultilevel"/>
-    <w:tmpl w:val="A48ADF92"/>
-    <w:lvl w:ilvl="0" w:tplc="8A486378">
+    <w:tmpl w:val="BFF24D04"/>
+    <w:lvl w:ilvl="0" w:tplc="F18E5CE6">
+      <w:start w:val="1"/>
+      <w:numFmt w:val="decimal"/>
+      <w:lvlText w:val="%1."/>
+      <w:lvlJc w:val="left"/>
+      <w:pPr>
+        <w:ind w:left="540" w:hanging="360"/>
+      </w:pPr>
+    </w:lvl>
+    <w:lvl w:ilvl="1" w:tplc="48D6B51E">
+      <w:numFmt w:val="decimal"/>
+      <w:lvlText w:val=""/>
+      <w:lvlJc w:val="left"/>
+    </w:lvl>
+    <w:lvl w:ilvl="2" w:tplc="D7543FAE">
+      <w:numFmt w:val="decimal"/>
+      <w:lvlText w:val=""/>
+      <w:lvlJc w:val="left"/>
+    </w:lvl>
+    <w:lvl w:ilvl="3" w:tplc="4D784374">
+      <w:numFmt w:val="decimal"/>
+      <w:lvlText w:val=""/>
+      <w:lvlJc w:val="left"/>
+    </w:lvl>
+    <w:lvl w:ilvl="4" w:tplc="36B8AFE0">
+      <w:numFmt w:val="decimal"/>
+      <w:lvlText w:val=""/>
+      <w:lvlJc w:val="left"/>
+    </w:lvl>
+    <w:lvl w:ilvl="5" w:tplc="D488EE0A">
+      <w:numFmt w:val="decimal"/>
+      <w:lvlText w:val=""/>
+      <w:lvlJc w:val="left"/>
+    </w:lvl>
+    <w:lvl w:ilvl="6" w:tplc="7ADCA9B4">
+      <w:numFmt w:val="decimal"/>
+      <w:lvlText w:val=""/>
+      <w:lvlJc w:val="left"/>
+    </w:lvl>
+    <w:lvl w:ilvl="7" w:tplc="E4A653DC">
+      <w:numFmt w:val="decimal"/>
+      <w:lvlText w:val=""/>
+      <w:lvlJc w:val="left"/>
+    </w:lvl>
+    <w:lvl w:ilvl="8" w:tplc="9A58AA12">
+      <w:numFmt w:val="decimal"/>
+      <w:lvlText w:val=""/>
+      <w:lvlJc w:val="left"/>
+    </w:lvl>
+  </w:abstractNum>
+  <w:abstractNum w:abstractNumId="8" w15:restartNumberingAfterBreak="0">
+    <w:nsid w:val="496D2D9F"/>
+    <w:multiLevelType w:val="hybridMultilevel"/>
+    <w:tmpl w:val="B868E994"/>
+    <w:lvl w:ilvl="0" w:tplc="539E5D20">
+      <w:start w:val="1"/>
+      <w:numFmt w:val="decimal"/>
+      <w:lvlText w:val="%1."/>
+      <w:lvlJc w:val="left"/>
+      <w:pPr>
+        <w:ind w:left="540" w:hanging="360"/>
+      </w:pPr>
+    </w:lvl>
+    <w:lvl w:ilvl="1" w:tplc="088E935E">
+      <w:numFmt w:val="decimal"/>
+      <w:lvlText w:val=""/>
+      <w:lvlJc w:val="left"/>
+    </w:lvl>
+    <w:lvl w:ilvl="2" w:tplc="0E067956">
+      <w:numFmt w:val="decimal"/>
+      <w:lvlText w:val=""/>
+      <w:lvlJc w:val="left"/>
+    </w:lvl>
+    <w:lvl w:ilvl="3" w:tplc="3886DB48">
+      <w:numFmt w:val="decimal"/>
+      <w:lvlText w:val=""/>
+      <w:lvlJc w:val="left"/>
+    </w:lvl>
+    <w:lvl w:ilvl="4" w:tplc="F45E71E8">
+      <w:numFmt w:val="decimal"/>
+      <w:lvlText w:val=""/>
+      <w:lvlJc w:val="left"/>
+    </w:lvl>
+    <w:lvl w:ilvl="5" w:tplc="667C4122">
+      <w:numFmt w:val="decimal"/>
+      <w:lvlText w:val=""/>
+      <w:lvlJc w:val="left"/>
+    </w:lvl>
+    <w:lvl w:ilvl="6" w:tplc="23A864FE">
+      <w:numFmt w:val="decimal"/>
+      <w:lvlText w:val=""/>
+      <w:lvlJc w:val="left"/>
+    </w:lvl>
+    <w:lvl w:ilvl="7" w:tplc="DD00CBF6">
+      <w:numFmt w:val="decimal"/>
+      <w:lvlText w:val=""/>
+      <w:lvlJc w:val="left"/>
+    </w:lvl>
+    <w:lvl w:ilvl="8" w:tplc="26888C48">
+      <w:numFmt w:val="decimal"/>
+      <w:lvlText w:val=""/>
+      <w:lvlJc w:val="left"/>
+    </w:lvl>
+  </w:abstractNum>
+  <w:abstractNum w:abstractNumId="9" w15:restartNumberingAfterBreak="0">
+    <w:nsid w:val="581D1FD3"/>
+    <w:multiLevelType w:val="hybridMultilevel"/>
+    <w:tmpl w:val="28D01E4A"/>
+    <w:lvl w:ilvl="0" w:tplc="868E7C80">
+      <w:start w:val="1"/>
+      <w:numFmt w:val="decimal"/>
+      <w:lvlText w:val="%1."/>
+      <w:lvlJc w:val="left"/>
+      <w:pPr>
+        <w:ind w:left="540" w:hanging="360"/>
+      </w:pPr>
+    </w:lvl>
+    <w:lvl w:ilvl="1" w:tplc="9C8E8DAE">
+      <w:numFmt w:val="decimal"/>
+      <w:lvlText w:val=""/>
+      <w:lvlJc w:val="left"/>
+    </w:lvl>
+    <w:lvl w:ilvl="2" w:tplc="EEC46DCE">
+      <w:numFmt w:val="decimal"/>
+      <w:lvlText w:val=""/>
+      <w:lvlJc w:val="left"/>
+    </w:lvl>
+    <w:lvl w:ilvl="3" w:tplc="17CEAA08">
+      <w:numFmt w:val="decimal"/>
+      <w:lvlText w:val=""/>
+      <w:lvlJc w:val="left"/>
+    </w:lvl>
+    <w:lvl w:ilvl="4" w:tplc="921012BA">
+      <w:numFmt w:val="decimal"/>
+      <w:lvlText w:val=""/>
+      <w:lvlJc w:val="left"/>
+    </w:lvl>
+    <w:lvl w:ilvl="5" w:tplc="B784B58E">
+      <w:numFmt w:val="decimal"/>
+      <w:lvlText w:val=""/>
+      <w:lvlJc w:val="left"/>
+    </w:lvl>
+    <w:lvl w:ilvl="6" w:tplc="8C7CEAA6">
+      <w:numFmt w:val="decimal"/>
+      <w:lvlText w:val=""/>
+      <w:lvlJc w:val="left"/>
+    </w:lvl>
+    <w:lvl w:ilvl="7" w:tplc="A8DA6706">
+      <w:numFmt w:val="decimal"/>
+      <w:lvlText w:val=""/>
+      <w:lvlJc w:val="left"/>
+    </w:lvl>
+    <w:lvl w:ilvl="8" w:tplc="C90EAF84">
+      <w:numFmt w:val="decimal"/>
+      <w:lvlText w:val=""/>
+      <w:lvlJc w:val="left"/>
+    </w:lvl>
+  </w:abstractNum>
+  <w:abstractNum w:abstractNumId="10" w15:restartNumberingAfterBreak="0">
+    <w:nsid w:val="59F25BDB"/>
+    <w:multiLevelType w:val="hybridMultilevel"/>
+    <w:tmpl w:val="42204D52"/>
+    <w:lvl w:ilvl="0" w:tplc="A3CA0714">
+      <w:start w:val="1"/>
+      <w:numFmt w:val="decimal"/>
+      <w:lvlText w:val="%1."/>
+      <w:lvlJc w:val="left"/>
+      <w:pPr>
+        <w:ind w:left="540" w:hanging="360"/>
+      </w:pPr>
+    </w:lvl>
+    <w:lvl w:ilvl="1" w:tplc="F1CE357E">
+      <w:numFmt w:val="decimal"/>
+      <w:lvlText w:val=""/>
+      <w:lvlJc w:val="left"/>
+    </w:lvl>
+    <w:lvl w:ilvl="2" w:tplc="716E2D50">
+      <w:numFmt w:val="decimal"/>
+      <w:lvlText w:val=""/>
+      <w:lvlJc w:val="left"/>
+    </w:lvl>
+    <w:lvl w:ilvl="3" w:tplc="DEF849A4">
+      <w:numFmt w:val="decimal"/>
+      <w:lvlText w:val=""/>
+      <w:lvlJc w:val="left"/>
+    </w:lvl>
+    <w:lvl w:ilvl="4" w:tplc="89D89DD6">
+      <w:numFmt w:val="decimal"/>
+      <w:lvlText w:val=""/>
+      <w:lvlJc w:val="left"/>
+    </w:lvl>
+    <w:lvl w:ilvl="5" w:tplc="A6582C50">
+      <w:numFmt w:val="decimal"/>
+      <w:lvlText w:val=""/>
+      <w:lvlJc w:val="left"/>
+    </w:lvl>
+    <w:lvl w:ilvl="6" w:tplc="4B2E850E">
+      <w:numFmt w:val="decimal"/>
+      <w:lvlText w:val=""/>
+      <w:lvlJc w:val="left"/>
+    </w:lvl>
+    <w:lvl w:ilvl="7" w:tplc="D77C3B4A">
+      <w:numFmt w:val="decimal"/>
+      <w:lvlText w:val=""/>
+      <w:lvlJc w:val="left"/>
+    </w:lvl>
+    <w:lvl w:ilvl="8" w:tplc="D70A1C16">
+      <w:numFmt w:val="decimal"/>
+      <w:lvlText w:val=""/>
+      <w:lvlJc w:val="left"/>
+    </w:lvl>
+  </w:abstractNum>
+  <w:abstractNum w:abstractNumId="11" w15:restartNumberingAfterBreak="0">
+    <w:nsid w:val="63975DF0"/>
+    <w:multiLevelType w:val="hybridMultilevel"/>
+    <w:tmpl w:val="F370D99E"/>
+    <w:lvl w:ilvl="0" w:tplc="162A9072">
+      <w:start w:val="1"/>
+      <w:numFmt w:val="decimal"/>
+      <w:lvlText w:val="%1."/>
+      <w:lvlJc w:val="left"/>
+      <w:pPr>
+        <w:ind w:left="540" w:hanging="360"/>
+      </w:pPr>
+    </w:lvl>
+    <w:lvl w:ilvl="1" w:tplc="D6A649D8">
+      <w:numFmt w:val="decimal"/>
+      <w:lvlText w:val=""/>
+      <w:lvlJc w:val="left"/>
+    </w:lvl>
+    <w:lvl w:ilvl="2" w:tplc="42CE23F4">
+      <w:numFmt w:val="decimal"/>
+      <w:lvlText w:val=""/>
+      <w:lvlJc w:val="left"/>
+    </w:lvl>
+    <w:lvl w:ilvl="3" w:tplc="AAC0349A">
+      <w:numFmt w:val="decimal"/>
+      <w:lvlText w:val=""/>
+      <w:lvlJc w:val="left"/>
+    </w:lvl>
+    <w:lvl w:ilvl="4" w:tplc="530ED81C">
+      <w:numFmt w:val="decimal"/>
+      <w:lvlText w:val=""/>
+      <w:lvlJc w:val="left"/>
+    </w:lvl>
+    <w:lvl w:ilvl="5" w:tplc="36360CA8">
+      <w:numFmt w:val="decimal"/>
+      <w:lvlText w:val=""/>
+      <w:lvlJc w:val="left"/>
+    </w:lvl>
+    <w:lvl w:ilvl="6" w:tplc="DFA2D338">
+      <w:numFmt w:val="decimal"/>
+      <w:lvlText w:val=""/>
+      <w:lvlJc w:val="left"/>
+    </w:lvl>
+    <w:lvl w:ilvl="7" w:tplc="9F5AEFF6">
+      <w:numFmt w:val="decimal"/>
+      <w:lvlText w:val=""/>
+      <w:lvlJc w:val="left"/>
+    </w:lvl>
+    <w:lvl w:ilvl="8" w:tplc="651EC5E4">
+      <w:numFmt w:val="decimal"/>
+      <w:lvlText w:val=""/>
+      <w:lvlJc w:val="left"/>
+    </w:lvl>
+  </w:abstractNum>
+  <w:abstractNum w:abstractNumId="12" w15:restartNumberingAfterBreak="0">
+    <w:nsid w:val="74FB083A"/>
+    <w:multiLevelType w:val="hybridMultilevel"/>
+    <w:tmpl w:val="7B9A63EA"/>
+    <w:lvl w:ilvl="0" w:tplc="733AE042">
+      <w:start w:val="1"/>
+      <w:numFmt w:val="decimal"/>
+      <w:lvlText w:val="%1."/>
+      <w:lvlJc w:val="left"/>
+      <w:pPr>
+        <w:ind w:left="540" w:hanging="360"/>
+      </w:pPr>
+    </w:lvl>
+    <w:lvl w:ilvl="1" w:tplc="FC060502">
+      <w:numFmt w:val="decimal"/>
+      <w:lvlText w:val=""/>
+      <w:lvlJc w:val="left"/>
+    </w:lvl>
+    <w:lvl w:ilvl="2" w:tplc="5770F558">
+      <w:numFmt w:val="decimal"/>
+      <w:lvlText w:val=""/>
+      <w:lvlJc w:val="left"/>
+    </w:lvl>
+    <w:lvl w:ilvl="3" w:tplc="BEC8A158">
+      <w:numFmt w:val="decimal"/>
+      <w:lvlText w:val=""/>
+      <w:lvlJc w:val="left"/>
+    </w:lvl>
+    <w:lvl w:ilvl="4" w:tplc="201E5F06">
+      <w:numFmt w:val="decimal"/>
+      <w:lvlText w:val=""/>
+      <w:lvlJc w:val="left"/>
+    </w:lvl>
+    <w:lvl w:ilvl="5" w:tplc="CC266F6C">
+      <w:numFmt w:val="decimal"/>
+      <w:lvlText w:val=""/>
+      <w:lvlJc w:val="left"/>
+    </w:lvl>
+    <w:lvl w:ilvl="6" w:tplc="EC5AD226">
+      <w:numFmt w:val="decimal"/>
+      <w:lvlText w:val=""/>
+      <w:lvlJc w:val="left"/>
+    </w:lvl>
+    <w:lvl w:ilvl="7" w:tplc="97A08564">
+      <w:numFmt w:val="decimal"/>
+      <w:lvlText w:val=""/>
+      <w:lvlJc w:val="left"/>
+    </w:lvl>
+    <w:lvl w:ilvl="8" w:tplc="B5BA20E6">
+      <w:numFmt w:val="decimal"/>
+      <w:lvlText w:val=""/>
+      <w:lvlJc w:val="left"/>
+    </w:lvl>
+  </w:abstractNum>
+  <w:abstractNum w:abstractNumId="13" w15:restartNumberingAfterBreak="0">
+    <w:nsid w:val="74FF27C8"/>
+    <w:multiLevelType w:val="hybridMultilevel"/>
+    <w:tmpl w:val="D5A244B4"/>
+    <w:lvl w:ilvl="0" w:tplc="FF4808BE">
       <w:start w:val="1"/>
       <w:numFmt w:val="bullet"/>
       <w:lvlText w:val="•"/>
@@ -10306,482 +10716,72 @@
         <w:ind w:left="540" w:hanging="300"/>
       </w:pPr>
     </w:lvl>
-    <w:lvl w:ilvl="1" w:tplc="8F1495D2">
+    <w:lvl w:ilvl="1" w:tplc="BAC23B0E">
       <w:numFmt w:val="decimal"/>
       <w:lvlText w:val=""/>
       <w:lvlJc w:val="left"/>
     </w:lvl>
-    <w:lvl w:ilvl="2" w:tplc="FDF405BE">
+    <w:lvl w:ilvl="2" w:tplc="188C2D28">
       <w:numFmt w:val="decimal"/>
       <w:lvlText w:val=""/>
       <w:lvlJc w:val="left"/>
     </w:lvl>
-    <w:lvl w:ilvl="3" w:tplc="896A35A8">
+    <w:lvl w:ilvl="3" w:tplc="D7CE84CC">
       <w:numFmt w:val="decimal"/>
       <w:lvlText w:val=""/>
       <w:lvlJc w:val="left"/>
     </w:lvl>
-    <w:lvl w:ilvl="4" w:tplc="C4A22DF2">
+    <w:lvl w:ilvl="4" w:tplc="EA9260D2">
       <w:numFmt w:val="decimal"/>
       <w:lvlText w:val=""/>
       <w:lvlJc w:val="left"/>
     </w:lvl>
-    <w:lvl w:ilvl="5" w:tplc="227448AE">
+    <w:lvl w:ilvl="5" w:tplc="D6D09A92">
       <w:numFmt w:val="decimal"/>
       <w:lvlText w:val=""/>
       <w:lvlJc w:val="left"/>
     </w:lvl>
-    <w:lvl w:ilvl="6" w:tplc="B448ACAE">
+    <w:lvl w:ilvl="6" w:tplc="72581DD2">
       <w:numFmt w:val="decimal"/>
       <w:lvlText w:val=""/>
       <w:lvlJc w:val="left"/>
     </w:lvl>
-    <w:lvl w:ilvl="7" w:tplc="421CA1DC">
+    <w:lvl w:ilvl="7" w:tplc="66402E12">
       <w:numFmt w:val="decimal"/>
       <w:lvlText w:val=""/>
       <w:lvlJc w:val="left"/>
     </w:lvl>
-    <w:lvl w:ilvl="8" w:tplc="E530F2F0">
+    <w:lvl w:ilvl="8" w:tplc="E9FAC184">
       <w:numFmt w:val="decimal"/>
       <w:lvlText w:val=""/>
       <w:lvlJc w:val="left"/>
     </w:lvl>
   </w:abstractNum>
-  <w:abstractNum w:abstractNumId="7" w15:restartNumberingAfterBreak="0">
-    <w:nsid w:val="37684119"/>
-    <w:multiLevelType w:val="hybridMultilevel"/>
-    <w:tmpl w:val="4E184C38"/>
-    <w:lvl w:ilvl="0" w:tplc="900A7AF4">
-      <w:start w:val="1"/>
-      <w:numFmt w:val="decimal"/>
-      <w:lvlText w:val="%1."/>
-      <w:lvlJc w:val="left"/>
-      <w:pPr>
-        <w:ind w:left="540" w:hanging="360"/>
-      </w:pPr>
-    </w:lvl>
-    <w:lvl w:ilvl="1" w:tplc="3FFE6488">
-      <w:numFmt w:val="decimal"/>
-      <w:lvlText w:val=""/>
-      <w:lvlJc w:val="left"/>
-    </w:lvl>
-    <w:lvl w:ilvl="2" w:tplc="2F24D2FC">
-      <w:numFmt w:val="decimal"/>
-      <w:lvlText w:val=""/>
-      <w:lvlJc w:val="left"/>
-    </w:lvl>
-    <w:lvl w:ilvl="3" w:tplc="BDE20F9C">
-      <w:numFmt w:val="decimal"/>
-      <w:lvlText w:val=""/>
-      <w:lvlJc w:val="left"/>
-    </w:lvl>
-    <w:lvl w:ilvl="4" w:tplc="23943664">
-      <w:numFmt w:val="decimal"/>
-      <w:lvlText w:val=""/>
-      <w:lvlJc w:val="left"/>
-    </w:lvl>
-    <w:lvl w:ilvl="5" w:tplc="E5FEDCBA">
-      <w:numFmt w:val="decimal"/>
-      <w:lvlText w:val=""/>
-      <w:lvlJc w:val="left"/>
-    </w:lvl>
-    <w:lvl w:ilvl="6" w:tplc="7B52883C">
-      <w:numFmt w:val="decimal"/>
-      <w:lvlText w:val=""/>
-      <w:lvlJc w:val="left"/>
-    </w:lvl>
-    <w:lvl w:ilvl="7" w:tplc="CC3EECA0">
-      <w:numFmt w:val="decimal"/>
-      <w:lvlText w:val=""/>
-      <w:lvlJc w:val="left"/>
-    </w:lvl>
-    <w:lvl w:ilvl="8" w:tplc="375885F8">
-      <w:numFmt w:val="decimal"/>
-      <w:lvlText w:val=""/>
-      <w:lvlJc w:val="left"/>
-    </w:lvl>
-  </w:abstractNum>
-  <w:abstractNum w:abstractNumId="8" w15:restartNumberingAfterBreak="0">
-    <w:nsid w:val="45644912"/>
-    <w:multiLevelType w:val="hybridMultilevel"/>
-    <w:tmpl w:val="E6921B0E"/>
-    <w:lvl w:ilvl="0" w:tplc="31B680F6">
-      <w:start w:val="1"/>
-      <w:numFmt w:val="decimal"/>
-      <w:lvlText w:val="%1."/>
-      <w:lvlJc w:val="left"/>
-      <w:pPr>
-        <w:ind w:left="540" w:hanging="360"/>
-      </w:pPr>
-    </w:lvl>
-    <w:lvl w:ilvl="1" w:tplc="C13A8908">
-      <w:numFmt w:val="decimal"/>
-      <w:lvlText w:val=""/>
-      <w:lvlJc w:val="left"/>
-    </w:lvl>
-    <w:lvl w:ilvl="2" w:tplc="6534FC62">
-      <w:numFmt w:val="decimal"/>
-      <w:lvlText w:val=""/>
-      <w:lvlJc w:val="left"/>
-    </w:lvl>
-    <w:lvl w:ilvl="3" w:tplc="FA702F7E">
-      <w:numFmt w:val="decimal"/>
-      <w:lvlText w:val=""/>
-      <w:lvlJc w:val="left"/>
-    </w:lvl>
-    <w:lvl w:ilvl="4" w:tplc="6D0E2A18">
-      <w:numFmt w:val="decimal"/>
-      <w:lvlText w:val=""/>
-      <w:lvlJc w:val="left"/>
-    </w:lvl>
-    <w:lvl w:ilvl="5" w:tplc="5B88E4B2">
-      <w:numFmt w:val="decimal"/>
-      <w:lvlText w:val=""/>
-      <w:lvlJc w:val="left"/>
-    </w:lvl>
-    <w:lvl w:ilvl="6" w:tplc="0512BDC0">
-      <w:numFmt w:val="decimal"/>
-      <w:lvlText w:val=""/>
-      <w:lvlJc w:val="left"/>
-    </w:lvl>
-    <w:lvl w:ilvl="7" w:tplc="FABCABDC">
-      <w:numFmt w:val="decimal"/>
-      <w:lvlText w:val=""/>
-      <w:lvlJc w:val="left"/>
-    </w:lvl>
-    <w:lvl w:ilvl="8" w:tplc="C1ECF6FA">
-      <w:numFmt w:val="decimal"/>
-      <w:lvlText w:val=""/>
-      <w:lvlJc w:val="left"/>
-    </w:lvl>
-  </w:abstractNum>
-  <w:abstractNum w:abstractNumId="9" w15:restartNumberingAfterBreak="0">
-    <w:nsid w:val="514B67A1"/>
-    <w:multiLevelType w:val="hybridMultilevel"/>
-    <w:tmpl w:val="91FE5FE8"/>
-    <w:lvl w:ilvl="0" w:tplc="9D58CE56">
-      <w:start w:val="1"/>
-      <w:numFmt w:val="decimal"/>
-      <w:lvlText w:val="%1."/>
-      <w:lvlJc w:val="left"/>
-      <w:pPr>
-        <w:ind w:left="540" w:hanging="360"/>
-      </w:pPr>
-    </w:lvl>
-    <w:lvl w:ilvl="1" w:tplc="5C801CF6">
-      <w:numFmt w:val="decimal"/>
-      <w:lvlText w:val=""/>
-      <w:lvlJc w:val="left"/>
-    </w:lvl>
-    <w:lvl w:ilvl="2" w:tplc="8F22A686">
-      <w:numFmt w:val="decimal"/>
-      <w:lvlText w:val=""/>
-      <w:lvlJc w:val="left"/>
-    </w:lvl>
-    <w:lvl w:ilvl="3" w:tplc="DB222D88">
-      <w:numFmt w:val="decimal"/>
-      <w:lvlText w:val=""/>
-      <w:lvlJc w:val="left"/>
-    </w:lvl>
-    <w:lvl w:ilvl="4" w:tplc="FE8E47A0">
-      <w:numFmt w:val="decimal"/>
-      <w:lvlText w:val=""/>
-      <w:lvlJc w:val="left"/>
-    </w:lvl>
-    <w:lvl w:ilvl="5" w:tplc="12A6A846">
-      <w:numFmt w:val="decimal"/>
-      <w:lvlText w:val=""/>
-      <w:lvlJc w:val="left"/>
-    </w:lvl>
-    <w:lvl w:ilvl="6" w:tplc="271472DE">
-      <w:numFmt w:val="decimal"/>
-      <w:lvlText w:val=""/>
-      <w:lvlJc w:val="left"/>
-    </w:lvl>
-    <w:lvl w:ilvl="7" w:tplc="4FC6DBDC">
-      <w:numFmt w:val="decimal"/>
-      <w:lvlText w:val=""/>
-      <w:lvlJc w:val="left"/>
-    </w:lvl>
-    <w:lvl w:ilvl="8" w:tplc="38823652">
-      <w:numFmt w:val="decimal"/>
-      <w:lvlText w:val=""/>
-      <w:lvlJc w:val="left"/>
-    </w:lvl>
-  </w:abstractNum>
-  <w:abstractNum w:abstractNumId="10" w15:restartNumberingAfterBreak="0">
-    <w:nsid w:val="521C378A"/>
-    <w:multiLevelType w:val="hybridMultilevel"/>
-    <w:tmpl w:val="D3F29458"/>
-    <w:lvl w:ilvl="0" w:tplc="7F9623DC">
-      <w:start w:val="1"/>
-      <w:numFmt w:val="decimal"/>
-      <w:lvlText w:val="%1."/>
-      <w:lvlJc w:val="left"/>
-      <w:pPr>
-        <w:ind w:left="540" w:hanging="360"/>
-      </w:pPr>
-    </w:lvl>
-    <w:lvl w:ilvl="1" w:tplc="F36645C6">
-      <w:numFmt w:val="decimal"/>
-      <w:lvlText w:val=""/>
-      <w:lvlJc w:val="left"/>
-    </w:lvl>
-    <w:lvl w:ilvl="2" w:tplc="2F4C02EE">
-      <w:numFmt w:val="decimal"/>
-      <w:lvlText w:val=""/>
-      <w:lvlJc w:val="left"/>
-    </w:lvl>
-    <w:lvl w:ilvl="3" w:tplc="DB6A0342">
-      <w:numFmt w:val="decimal"/>
-      <w:lvlText w:val=""/>
-      <w:lvlJc w:val="left"/>
-    </w:lvl>
-    <w:lvl w:ilvl="4" w:tplc="492C6D28">
-      <w:numFmt w:val="decimal"/>
-      <w:lvlText w:val=""/>
-      <w:lvlJc w:val="left"/>
-    </w:lvl>
-    <w:lvl w:ilvl="5" w:tplc="0B86960A">
-      <w:numFmt w:val="decimal"/>
-      <w:lvlText w:val=""/>
-      <w:lvlJc w:val="left"/>
-    </w:lvl>
-    <w:lvl w:ilvl="6" w:tplc="9D3810BC">
-      <w:numFmt w:val="decimal"/>
-      <w:lvlText w:val=""/>
-      <w:lvlJc w:val="left"/>
-    </w:lvl>
-    <w:lvl w:ilvl="7" w:tplc="59F22736">
-      <w:numFmt w:val="decimal"/>
-      <w:lvlText w:val=""/>
-      <w:lvlJc w:val="left"/>
-    </w:lvl>
-    <w:lvl w:ilvl="8" w:tplc="D0362B16">
-      <w:numFmt w:val="decimal"/>
-      <w:lvlText w:val=""/>
-      <w:lvlJc w:val="left"/>
-    </w:lvl>
-  </w:abstractNum>
-  <w:abstractNum w:abstractNumId="11" w15:restartNumberingAfterBreak="0">
-    <w:nsid w:val="5BCD0320"/>
-    <w:multiLevelType w:val="hybridMultilevel"/>
-    <w:tmpl w:val="307C6252"/>
-    <w:lvl w:ilvl="0" w:tplc="6F3CB82C">
-      <w:start w:val="1"/>
-      <w:numFmt w:val="decimal"/>
-      <w:lvlText w:val="%1."/>
-      <w:lvlJc w:val="left"/>
-      <w:pPr>
-        <w:ind w:left="540" w:hanging="360"/>
-      </w:pPr>
-    </w:lvl>
-    <w:lvl w:ilvl="1" w:tplc="F160BAEE">
-      <w:numFmt w:val="decimal"/>
-      <w:lvlText w:val=""/>
-      <w:lvlJc w:val="left"/>
-    </w:lvl>
-    <w:lvl w:ilvl="2" w:tplc="B366CF46">
-      <w:numFmt w:val="decimal"/>
-      <w:lvlText w:val=""/>
-      <w:lvlJc w:val="left"/>
-    </w:lvl>
-    <w:lvl w:ilvl="3" w:tplc="54745004">
-      <w:numFmt w:val="decimal"/>
-      <w:lvlText w:val=""/>
-      <w:lvlJc w:val="left"/>
-    </w:lvl>
-    <w:lvl w:ilvl="4" w:tplc="27FA0CAE">
-      <w:numFmt w:val="decimal"/>
-      <w:lvlText w:val=""/>
-      <w:lvlJc w:val="left"/>
-    </w:lvl>
-    <w:lvl w:ilvl="5" w:tplc="C7CA0514">
-      <w:numFmt w:val="decimal"/>
-      <w:lvlText w:val=""/>
-      <w:lvlJc w:val="left"/>
-    </w:lvl>
-    <w:lvl w:ilvl="6" w:tplc="10EA1CF2">
-      <w:numFmt w:val="decimal"/>
-      <w:lvlText w:val=""/>
-      <w:lvlJc w:val="left"/>
-    </w:lvl>
-    <w:lvl w:ilvl="7" w:tplc="EA204EAC">
-      <w:numFmt w:val="decimal"/>
-      <w:lvlText w:val=""/>
-      <w:lvlJc w:val="left"/>
-    </w:lvl>
-    <w:lvl w:ilvl="8" w:tplc="AFD28C92">
-      <w:numFmt w:val="decimal"/>
-      <w:lvlText w:val=""/>
-      <w:lvlJc w:val="left"/>
-    </w:lvl>
-  </w:abstractNum>
-  <w:abstractNum w:abstractNumId="12" w15:restartNumberingAfterBreak="0">
-    <w:nsid w:val="5D182875"/>
-    <w:multiLevelType w:val="hybridMultilevel"/>
-    <w:tmpl w:val="A40031C8"/>
-    <w:lvl w:ilvl="0" w:tplc="2E5CDEFE">
-      <w:start w:val="1"/>
-      <w:numFmt w:val="bullet"/>
-      <w:lvlText w:val="●"/>
-      <w:lvlJc w:val="left"/>
-      <w:pPr>
-        <w:ind w:left="720" w:hanging="360"/>
-      </w:pPr>
-    </w:lvl>
-    <w:lvl w:ilvl="1" w:tplc="752CBE80">
-      <w:start w:val="1"/>
-      <w:numFmt w:val="bullet"/>
-      <w:lvlText w:val="○"/>
-      <w:lvlJc w:val="left"/>
-      <w:pPr>
-        <w:ind w:left="1440" w:hanging="360"/>
-      </w:pPr>
-    </w:lvl>
-    <w:lvl w:ilvl="2" w:tplc="BB763D6C">
-      <w:start w:val="1"/>
-      <w:numFmt w:val="bullet"/>
-      <w:lvlText w:val="■"/>
-      <w:lvlJc w:val="left"/>
-      <w:pPr>
-        <w:ind w:left="2160" w:hanging="360"/>
-      </w:pPr>
-    </w:lvl>
-    <w:lvl w:ilvl="3" w:tplc="CCC8BBC6">
-      <w:start w:val="1"/>
-      <w:numFmt w:val="bullet"/>
-      <w:lvlText w:val="●"/>
-      <w:lvlJc w:val="left"/>
-      <w:pPr>
-        <w:ind w:left="2880" w:hanging="360"/>
-      </w:pPr>
-    </w:lvl>
-    <w:lvl w:ilvl="4" w:tplc="491413AC">
-      <w:start w:val="1"/>
-      <w:numFmt w:val="bullet"/>
-      <w:lvlText w:val="○"/>
-      <w:lvlJc w:val="left"/>
-      <w:pPr>
-        <w:ind w:left="3600" w:hanging="360"/>
-      </w:pPr>
-    </w:lvl>
-    <w:lvl w:ilvl="5" w:tplc="EA16131A">
-      <w:start w:val="1"/>
-      <w:numFmt w:val="bullet"/>
-      <w:lvlText w:val="■"/>
-      <w:lvlJc w:val="left"/>
-      <w:pPr>
-        <w:ind w:left="4320" w:hanging="360"/>
-      </w:pPr>
-    </w:lvl>
-    <w:lvl w:ilvl="6" w:tplc="152A6392">
-      <w:start w:val="1"/>
-      <w:numFmt w:val="bullet"/>
-      <w:lvlText w:val="●"/>
-      <w:lvlJc w:val="left"/>
-      <w:pPr>
-        <w:ind w:left="5040" w:hanging="360"/>
-      </w:pPr>
-    </w:lvl>
-    <w:lvl w:ilvl="7" w:tplc="3C18D9D0">
-      <w:start w:val="1"/>
-      <w:numFmt w:val="bullet"/>
-      <w:lvlText w:val="●"/>
-      <w:lvlJc w:val="left"/>
-      <w:pPr>
-        <w:ind w:left="5760" w:hanging="360"/>
-      </w:pPr>
-    </w:lvl>
-    <w:lvl w:ilvl="8" w:tplc="8E386F32">
-      <w:start w:val="1"/>
-      <w:numFmt w:val="bullet"/>
-      <w:lvlText w:val="●"/>
-      <w:lvlJc w:val="left"/>
-      <w:pPr>
-        <w:ind w:left="6480" w:hanging="360"/>
-      </w:pPr>
-    </w:lvl>
-  </w:abstractNum>
-  <w:abstractNum w:abstractNumId="13" w15:restartNumberingAfterBreak="0">
-    <w:nsid w:val="65FE0F8D"/>
-    <w:multiLevelType w:val="hybridMultilevel"/>
-    <w:tmpl w:val="9D462F8A"/>
-    <w:lvl w:ilvl="0" w:tplc="27E4D04C">
-      <w:start w:val="1"/>
-      <w:numFmt w:val="decimal"/>
-      <w:lvlText w:val="%1."/>
-      <w:lvlJc w:val="left"/>
-      <w:pPr>
-        <w:ind w:left="540" w:hanging="360"/>
-      </w:pPr>
-    </w:lvl>
-    <w:lvl w:ilvl="1" w:tplc="72AA7C90">
-      <w:numFmt w:val="decimal"/>
-      <w:lvlText w:val=""/>
-      <w:lvlJc w:val="left"/>
-    </w:lvl>
-    <w:lvl w:ilvl="2" w:tplc="306AB7AA">
-      <w:numFmt w:val="decimal"/>
-      <w:lvlText w:val=""/>
-      <w:lvlJc w:val="left"/>
-    </w:lvl>
-    <w:lvl w:ilvl="3" w:tplc="74C0821C">
-      <w:numFmt w:val="decimal"/>
-      <w:lvlText w:val=""/>
-      <w:lvlJc w:val="left"/>
-    </w:lvl>
-    <w:lvl w:ilvl="4" w:tplc="CD84EDBA">
-      <w:numFmt w:val="decimal"/>
-      <w:lvlText w:val=""/>
-      <w:lvlJc w:val="left"/>
-    </w:lvl>
-    <w:lvl w:ilvl="5" w:tplc="765627D0">
-      <w:numFmt w:val="decimal"/>
-      <w:lvlText w:val=""/>
-      <w:lvlJc w:val="left"/>
-    </w:lvl>
-    <w:lvl w:ilvl="6" w:tplc="E082900A">
-      <w:numFmt w:val="decimal"/>
-      <w:lvlText w:val=""/>
-      <w:lvlJc w:val="left"/>
-    </w:lvl>
-    <w:lvl w:ilvl="7" w:tplc="52E214A4">
-      <w:numFmt w:val="decimal"/>
-      <w:lvlText w:val=""/>
-      <w:lvlJc w:val="left"/>
-    </w:lvl>
-    <w:lvl w:ilvl="8" w:tplc="2F02E2BE">
-      <w:numFmt w:val="decimal"/>
-      <w:lvlText w:val=""/>
-      <w:lvlJc w:val="left"/>
-    </w:lvl>
-  </w:abstractNum>
-  <w:num w:numId="1" w16cid:durableId="1393895040">
-    <w:abstractNumId w:val="12"/>
+  <w:num w:numId="1" w16cid:durableId="1559509371">
+    <w:abstractNumId w:val="4"/>
     <w:lvlOverride w:ilvl="0">
       <w:startOverride w:val="1"/>
     </w:lvlOverride>
   </w:num>
-  <w:num w:numId="2" w16cid:durableId="255329804">
-    <w:abstractNumId w:val="6"/>
-    <w:lvlOverride w:ilvl="0">
-      <w:startOverride w:val="1"/>
-    </w:lvlOverride>
-  </w:num>
-  <w:num w:numId="3" w16cid:durableId="657266398">
+  <w:num w:numId="2" w16cid:durableId="1997686225">
     <w:abstractNumId w:val="13"/>
     <w:lvlOverride w:ilvl="0">
       <w:startOverride w:val="1"/>
     </w:lvlOverride>
   </w:num>
-  <w:num w:numId="4" w16cid:durableId="496307227">
-    <w:abstractNumId w:val="5"/>
+  <w:num w:numId="3" w16cid:durableId="325058920">
+    <w:abstractNumId w:val="11"/>
     <w:lvlOverride w:ilvl="0">
       <w:startOverride w:val="1"/>
     </w:lvlOverride>
   </w:num>
-  <w:num w:numId="5" w16cid:durableId="138574329">
+  <w:num w:numId="4" w16cid:durableId="871962863">
+    <w:abstractNumId w:val="3"/>
+    <w:lvlOverride w:ilvl="0">
+      <w:startOverride w:val="1"/>
+    </w:lvlOverride>
+  </w:num>
+  <w:num w:numId="5" w16cid:durableId="72313562">
     <w:abstractNumId w:val="8"/>
     <w:lvlOverride w:ilvl="0">
       <w:startOverride w:val="1"/>
@@ -11393,7 +11393,7 @@
     <w:autoRedefine/>
     <w:uiPriority w:val="39"/>
     <w:unhideWhenUsed/>
-    <w:rsid w:val="006C437F"/>
+    <w:rsid w:val="00B32B22"/>
   </w:style>
   <w:style w:type="paragraph" w:styleId="20">
     <w:name w:val="toc 2"/>
@@ -11402,7 +11402,7 @@
     <w:autoRedefine/>
     <w:uiPriority w:val="39"/>
     <w:unhideWhenUsed/>
-    <w:rsid w:val="006C437F"/>
+    <w:rsid w:val="00B32B22"/>
     <w:pPr>
       <w:ind w:leftChars="100" w:left="200"/>
     </w:pPr>
@@ -11413,7 +11413,7 @@
     <w:link w:val="ad"/>
     <w:uiPriority w:val="99"/>
     <w:unhideWhenUsed/>
-    <w:rsid w:val="006C437F"/>
+    <w:rsid w:val="00B32B22"/>
     <w:pPr>
       <w:tabs>
         <w:tab w:val="center" w:pos="4252"/>
@@ -11427,7 +11427,7 @@
     <w:basedOn w:val="a0"/>
     <w:link w:val="ac"/>
     <w:uiPriority w:val="99"/>
-    <w:rsid w:val="006C437F"/>
+    <w:rsid w:val="00B32B22"/>
   </w:style>
   <w:style w:type="paragraph" w:styleId="ae">
     <w:name w:val="footer"/>
@@ -11435,7 +11435,7 @@
     <w:link w:val="af"/>
     <w:uiPriority w:val="99"/>
     <w:unhideWhenUsed/>
-    <w:rsid w:val="006C437F"/>
+    <w:rsid w:val="00B32B22"/>
     <w:pPr>
       <w:tabs>
         <w:tab w:val="center" w:pos="4252"/>
@@ -11449,7 +11449,7 @@
     <w:basedOn w:val="a0"/>
     <w:link w:val="ae"/>
     <w:uiPriority w:val="99"/>
-    <w:rsid w:val="006C437F"/>
+    <w:rsid w:val="00B32B22"/>
   </w:style>
 </w:styles>
 </file>

</xml_diff>

<commit_message>
Final consistency pass: Japanese/English strings and the requirements document
Co-Authored-By: Claude Fable 5.1 <noreply@anthropic.com>
</commit_message>
<xml_diff>
--- a/docs/Missense_Variant_Evaluation_Report_Requirements_and_Design.docx
+++ b/docs/Missense_Variant_Evaluation_Report_Requirements_and_Design.docx
@@ -75,7 +75,7 @@
     <w:sdt>
       <w:sdtPr>
         <w:alias w:val="Contents"/>
-        <w:id w:val="1713228400"/>
+        <w:id w:val="-995481692"/>
       </w:sdtPr>
       <w:sdtEndPr/>
       <w:sdtContent>
@@ -103,7 +103,7 @@
           <w:r>
             <w:fldChar w:fldCharType="separate"/>
           </w:r>
-          <w:hyperlink w:anchor="_Toc240014600" w:history="1">
+          <w:hyperlink w:anchor="_Toc240015392" w:history="1">
             <w:r>
               <w:rPr>
                 <w:rStyle w:val="a5"/>
@@ -127,7 +127,7 @@
               <w:rPr>
                 <w:noProof/>
               </w:rPr>
-              <w:instrText xml:space="preserve"> PAGEREF _Toc240014600 \h </w:instrText>
+              <w:instrText xml:space="preserve"> PAGEREF _Toc240015392 \h </w:instrText>
             </w:r>
             <w:r>
               <w:rPr>
@@ -169,7 +169,7 @@
               <w14:ligatures w14:val="standardContextual"/>
             </w:rPr>
           </w:pPr>
-          <w:hyperlink w:anchor="_Toc240014601" w:history="1">
+          <w:hyperlink w:anchor="_Toc240015393" w:history="1">
             <w:r>
               <w:rPr>
                 <w:rStyle w:val="a5"/>
@@ -193,7 +193,7 @@
               <w:rPr>
                 <w:noProof/>
               </w:rPr>
-              <w:instrText xml:space="preserve"> PAGEREF _Toc240014601 \h </w:instrText>
+              <w:instrText xml:space="preserve"> PAGEREF _Toc240015393 \h </w:instrText>
             </w:r>
             <w:r>
               <w:rPr>
@@ -235,7 +235,7 @@
               <w14:ligatures w14:val="standardContextual"/>
             </w:rPr>
           </w:pPr>
-          <w:hyperlink w:anchor="_Toc240014602" w:history="1">
+          <w:hyperlink w:anchor="_Toc240015394" w:history="1">
             <w:r>
               <w:rPr>
                 <w:rStyle w:val="a5"/>
@@ -259,7 +259,7 @@
               <w:rPr>
                 <w:noProof/>
               </w:rPr>
-              <w:instrText xml:space="preserve"> PAGEREF _Toc240014602 \h </w:instrText>
+              <w:instrText xml:space="preserve"> PAGEREF _Toc240015394 \h </w:instrText>
             </w:r>
             <w:r>
               <w:rPr>
@@ -301,7 +301,7 @@
               <w14:ligatures w14:val="standardContextual"/>
             </w:rPr>
           </w:pPr>
-          <w:hyperlink w:anchor="_Toc240014603" w:history="1">
+          <w:hyperlink w:anchor="_Toc240015395" w:history="1">
             <w:r>
               <w:rPr>
                 <w:rStyle w:val="a5"/>
@@ -325,7 +325,7 @@
               <w:rPr>
                 <w:noProof/>
               </w:rPr>
-              <w:instrText xml:space="preserve"> PAGEREF _Toc240014603 \h </w:instrText>
+              <w:instrText xml:space="preserve"> PAGEREF _Toc240015395 \h </w:instrText>
             </w:r>
             <w:r>
               <w:rPr>
@@ -367,7 +367,7 @@
               <w14:ligatures w14:val="standardContextual"/>
             </w:rPr>
           </w:pPr>
-          <w:hyperlink w:anchor="_Toc240014604" w:history="1">
+          <w:hyperlink w:anchor="_Toc240015396" w:history="1">
             <w:r>
               <w:rPr>
                 <w:rStyle w:val="a5"/>
@@ -391,7 +391,7 @@
               <w:rPr>
                 <w:noProof/>
               </w:rPr>
-              <w:instrText xml:space="preserve"> PAGEREF _Toc240014604 \h </w:instrText>
+              <w:instrText xml:space="preserve"> PAGEREF _Toc240015396 \h </w:instrText>
             </w:r>
             <w:r>
               <w:rPr>
@@ -433,7 +433,7 @@
               <w14:ligatures w14:val="standardContextual"/>
             </w:rPr>
           </w:pPr>
-          <w:hyperlink w:anchor="_Toc240014605" w:history="1">
+          <w:hyperlink w:anchor="_Toc240015397" w:history="1">
             <w:r>
               <w:rPr>
                 <w:rStyle w:val="a5"/>
@@ -457,7 +457,7 @@
               <w:rPr>
                 <w:noProof/>
               </w:rPr>
-              <w:instrText xml:space="preserve"> PAGEREF _Toc240014605 \h </w:instrText>
+              <w:instrText xml:space="preserve"> PAGEREF _Toc240015397 \h </w:instrText>
             </w:r>
             <w:r>
               <w:rPr>
@@ -499,7 +499,7 @@
               <w14:ligatures w14:val="standardContextual"/>
             </w:rPr>
           </w:pPr>
-          <w:hyperlink w:anchor="_Toc240014606" w:history="1">
+          <w:hyperlink w:anchor="_Toc240015398" w:history="1">
             <w:r>
               <w:rPr>
                 <w:rStyle w:val="a5"/>
@@ -523,7 +523,7 @@
               <w:rPr>
                 <w:noProof/>
               </w:rPr>
-              <w:instrText xml:space="preserve"> PAGEREF _Toc240014606 \h </w:instrText>
+              <w:instrText xml:space="preserve"> PAGEREF _Toc240015398 \h </w:instrText>
             </w:r>
             <w:r>
               <w:rPr>
@@ -565,7 +565,7 @@
               <w14:ligatures w14:val="standardContextual"/>
             </w:rPr>
           </w:pPr>
-          <w:hyperlink w:anchor="_Toc240014607" w:history="1">
+          <w:hyperlink w:anchor="_Toc240015399" w:history="1">
             <w:r>
               <w:rPr>
                 <w:rStyle w:val="a5"/>
@@ -589,7 +589,7 @@
               <w:rPr>
                 <w:noProof/>
               </w:rPr>
-              <w:instrText xml:space="preserve"> PAGEREF _Toc240014607 \h </w:instrText>
+              <w:instrText xml:space="preserve"> PAGEREF _Toc240015399 \h </w:instrText>
             </w:r>
             <w:r>
               <w:rPr>
@@ -631,7 +631,7 @@
               <w14:ligatures w14:val="standardContextual"/>
             </w:rPr>
           </w:pPr>
-          <w:hyperlink w:anchor="_Toc240014608" w:history="1">
+          <w:hyperlink w:anchor="_Toc240015400" w:history="1">
             <w:r>
               <w:rPr>
                 <w:rStyle w:val="a5"/>
@@ -655,7 +655,7 @@
               <w:rPr>
                 <w:noProof/>
               </w:rPr>
-              <w:instrText xml:space="preserve"> PAGEREF _Toc240014608 \h </w:instrText>
+              <w:instrText xml:space="preserve"> PAGEREF _Toc240015400 \h </w:instrText>
             </w:r>
             <w:r>
               <w:rPr>
@@ -697,7 +697,7 @@
               <w14:ligatures w14:val="standardContextual"/>
             </w:rPr>
           </w:pPr>
-          <w:hyperlink w:anchor="_Toc240014609" w:history="1">
+          <w:hyperlink w:anchor="_Toc240015401" w:history="1">
             <w:r>
               <w:rPr>
                 <w:rStyle w:val="a5"/>
@@ -721,7 +721,7 @@
               <w:rPr>
                 <w:noProof/>
               </w:rPr>
-              <w:instrText xml:space="preserve"> PAGEREF _Toc240014609 \h </w:instrText>
+              <w:instrText xml:space="preserve"> PAGEREF _Toc240015401 \h </w:instrText>
             </w:r>
             <w:r>
               <w:rPr>
@@ -763,7 +763,7 @@
               <w14:ligatures w14:val="standardContextual"/>
             </w:rPr>
           </w:pPr>
-          <w:hyperlink w:anchor="_Toc240014610" w:history="1">
+          <w:hyperlink w:anchor="_Toc240015402" w:history="1">
             <w:r>
               <w:rPr>
                 <w:rStyle w:val="a5"/>
@@ -787,7 +787,7 @@
               <w:rPr>
                 <w:noProof/>
               </w:rPr>
-              <w:instrText xml:space="preserve"> PAGEREF _Toc240014610 \h </w:instrText>
+              <w:instrText xml:space="preserve"> PAGEREF _Toc240015402 \h </w:instrText>
             </w:r>
             <w:r>
               <w:rPr>
@@ -829,7 +829,7 @@
               <w14:ligatures w14:val="standardContextual"/>
             </w:rPr>
           </w:pPr>
-          <w:hyperlink w:anchor="_Toc240014611" w:history="1">
+          <w:hyperlink w:anchor="_Toc240015403" w:history="1">
             <w:r>
               <w:rPr>
                 <w:rStyle w:val="a5"/>
@@ -853,7 +853,7 @@
               <w:rPr>
                 <w:noProof/>
               </w:rPr>
-              <w:instrText xml:space="preserve"> PAGEREF _Toc240014611 \h </w:instrText>
+              <w:instrText xml:space="preserve"> PAGEREF _Toc240015403 \h </w:instrText>
             </w:r>
             <w:r>
               <w:rPr>
@@ -895,7 +895,7 @@
               <w14:ligatures w14:val="standardContextual"/>
             </w:rPr>
           </w:pPr>
-          <w:hyperlink w:anchor="_Toc240014612" w:history="1">
+          <w:hyperlink w:anchor="_Toc240015404" w:history="1">
             <w:r>
               <w:rPr>
                 <w:rStyle w:val="a5"/>
@@ -919,7 +919,7 @@
               <w:rPr>
                 <w:noProof/>
               </w:rPr>
-              <w:instrText xml:space="preserve"> PAGEREF _Toc240014612 \h </w:instrText>
+              <w:instrText xml:space="preserve"> PAGEREF _Toc240015404 \h </w:instrText>
             </w:r>
             <w:r>
               <w:rPr>
@@ -961,7 +961,7 @@
               <w14:ligatures w14:val="standardContextual"/>
             </w:rPr>
           </w:pPr>
-          <w:hyperlink w:anchor="_Toc240014613" w:history="1">
+          <w:hyperlink w:anchor="_Toc240015405" w:history="1">
             <w:r>
               <w:rPr>
                 <w:rStyle w:val="a5"/>
@@ -985,7 +985,7 @@
               <w:rPr>
                 <w:noProof/>
               </w:rPr>
-              <w:instrText xml:space="preserve"> PAGEREF _Toc240014613 \h </w:instrText>
+              <w:instrText xml:space="preserve"> PAGEREF _Toc240015405 \h </w:instrText>
             </w:r>
             <w:r>
               <w:rPr>
@@ -1027,7 +1027,7 @@
               <w14:ligatures w14:val="standardContextual"/>
             </w:rPr>
           </w:pPr>
-          <w:hyperlink w:anchor="_Toc240014614" w:history="1">
+          <w:hyperlink w:anchor="_Toc240015406" w:history="1">
             <w:r>
               <w:rPr>
                 <w:rStyle w:val="a5"/>
@@ -1051,7 +1051,7 @@
               <w:rPr>
                 <w:noProof/>
               </w:rPr>
-              <w:instrText xml:space="preserve"> PAGEREF _Toc240014614 \h </w:instrText>
+              <w:instrText xml:space="preserve"> PAGEREF _Toc240015406 \h </w:instrText>
             </w:r>
             <w:r>
               <w:rPr>
@@ -1093,7 +1093,7 @@
               <w14:ligatures w14:val="standardContextual"/>
             </w:rPr>
           </w:pPr>
-          <w:hyperlink w:anchor="_Toc240014615" w:history="1">
+          <w:hyperlink w:anchor="_Toc240015407" w:history="1">
             <w:r>
               <w:rPr>
                 <w:rStyle w:val="a5"/>
@@ -1117,7 +1117,7 @@
               <w:rPr>
                 <w:noProof/>
               </w:rPr>
-              <w:instrText xml:space="preserve"> PAGEREF _Toc240014615 \h </w:instrText>
+              <w:instrText xml:space="preserve"> PAGEREF _Toc240015407 \h </w:instrText>
             </w:r>
             <w:r>
               <w:rPr>
@@ -1159,7 +1159,7 @@
               <w14:ligatures w14:val="standardContextual"/>
             </w:rPr>
           </w:pPr>
-          <w:hyperlink w:anchor="_Toc240014616" w:history="1">
+          <w:hyperlink w:anchor="_Toc240015408" w:history="1">
             <w:r>
               <w:rPr>
                 <w:rStyle w:val="a5"/>
@@ -1183,7 +1183,7 @@
               <w:rPr>
                 <w:noProof/>
               </w:rPr>
-              <w:instrText xml:space="preserve"> PAGEREF _Toc240014616 \h </w:instrText>
+              <w:instrText xml:space="preserve"> PAGEREF _Toc240015408 \h </w:instrText>
             </w:r>
             <w:r>
               <w:rPr>
@@ -1225,7 +1225,7 @@
               <w14:ligatures w14:val="standardContextual"/>
             </w:rPr>
           </w:pPr>
-          <w:hyperlink w:anchor="_Toc240014617" w:history="1">
+          <w:hyperlink w:anchor="_Toc240015409" w:history="1">
             <w:r>
               <w:rPr>
                 <w:rStyle w:val="a5"/>
@@ -1249,7 +1249,7 @@
               <w:rPr>
                 <w:noProof/>
               </w:rPr>
-              <w:instrText xml:space="preserve"> PAGEREF _Toc240014617 \h </w:instrText>
+              <w:instrText xml:space="preserve"> PAGEREF _Toc240015409 \h </w:instrText>
             </w:r>
             <w:r>
               <w:rPr>
@@ -1291,7 +1291,7 @@
               <w14:ligatures w14:val="standardContextual"/>
             </w:rPr>
           </w:pPr>
-          <w:hyperlink w:anchor="_Toc240014618" w:history="1">
+          <w:hyperlink w:anchor="_Toc240015410" w:history="1">
             <w:r>
               <w:rPr>
                 <w:rStyle w:val="a5"/>
@@ -1315,7 +1315,7 @@
               <w:rPr>
                 <w:noProof/>
               </w:rPr>
-              <w:instrText xml:space="preserve"> PAGEREF _Toc240014618 \h </w:instrText>
+              <w:instrText xml:space="preserve"> PAGEREF _Toc240015410 \h </w:instrText>
             </w:r>
             <w:r>
               <w:rPr>
@@ -1357,7 +1357,7 @@
               <w14:ligatures w14:val="standardContextual"/>
             </w:rPr>
           </w:pPr>
-          <w:hyperlink w:anchor="_Toc240014619" w:history="1">
+          <w:hyperlink w:anchor="_Toc240015411" w:history="1">
             <w:r>
               <w:rPr>
                 <w:rStyle w:val="a5"/>
@@ -1381,7 +1381,7 @@
               <w:rPr>
                 <w:noProof/>
               </w:rPr>
-              <w:instrText xml:space="preserve"> PAGEREF _Toc240014619 \h </w:instrText>
+              <w:instrText xml:space="preserve"> PAGEREF _Toc240015411 \h </w:instrText>
             </w:r>
             <w:r>
               <w:rPr>
@@ -1423,7 +1423,7 @@
               <w14:ligatures w14:val="standardContextual"/>
             </w:rPr>
           </w:pPr>
-          <w:hyperlink w:anchor="_Toc240014620" w:history="1">
+          <w:hyperlink w:anchor="_Toc240015412" w:history="1">
             <w:r>
               <w:rPr>
                 <w:rStyle w:val="a5"/>
@@ -1447,7 +1447,7 @@
               <w:rPr>
                 <w:noProof/>
               </w:rPr>
-              <w:instrText xml:space="preserve"> PAGEREF _Toc240014620 \h </w:instrText>
+              <w:instrText xml:space="preserve"> PAGEREF _Toc240015412 \h </w:instrText>
             </w:r>
             <w:r>
               <w:rPr>
@@ -1490,7 +1490,7 @@
       <w:pPr>
         <w:pStyle w:val="1"/>
       </w:pPr>
-      <w:bookmarkStart w:id="0" w:name="_Toc240014600"/>
+      <w:bookmarkStart w:id="0" w:name="_Toc240015392"/>
       <w:r>
         <w:lastRenderedPageBreak/>
         <w:t>1. Purpose</w:t>
@@ -1517,7 +1517,7 @@
       <w:pPr>
         <w:pStyle w:val="1"/>
       </w:pPr>
-      <w:bookmarkStart w:id="1" w:name="_Toc240014601"/>
+      <w:bookmarkStart w:id="1" w:name="_Toc240015393"/>
       <w:r>
         <w:t>2. Scope and non-goals</w:t>
       </w:r>
@@ -1592,7 +1592,7 @@
       <w:pPr>
         <w:pStyle w:val="1"/>
       </w:pPr>
-      <w:bookmarkStart w:id="2" w:name="_Toc240014602"/>
+      <w:bookmarkStart w:id="2" w:name="_Toc240015394"/>
       <w:r>
         <w:t>3. Users and operating environment</w:t>
       </w:r>
@@ -1654,7 +1654,7 @@
       <w:pPr>
         <w:pStyle w:val="1"/>
       </w:pPr>
-      <w:bookmarkStart w:id="3" w:name="_Toc240014603"/>
+      <w:bookmarkStart w:id="3" w:name="_Toc240015395"/>
       <w:r>
         <w:t>4. Input</w:t>
       </w:r>
@@ -1683,7 +1683,7 @@
           <w:left w:w="10" w:type="dxa"/>
           <w:right w:w="10" w:type="dxa"/>
         </w:tblCellMar>
-        <w:tblLook w:val="0000" w:firstRow="0" w:lastRow="0" w:firstColumn="0" w:lastColumn="0" w:noHBand="0" w:noVBand="0"/>
+        <w:tblLook w:val="04A0" w:firstRow="1" w:lastRow="0" w:firstColumn="1" w:lastColumn="0" w:noHBand="0" w:noVBand="1"/>
       </w:tblPr>
       <w:tblGrid>
         <w:gridCol w:w="3610"/>
@@ -1886,6 +1886,7 @@
                 <w:sz w:val="18"/>
                 <w:szCs w:val="18"/>
               </w:rPr>
+              <w:lastRenderedPageBreak/>
               <w:t>SDHB c.574T&gt;C (p.Cys192Arg) / SDHB p.Cys192Arg (c.574T&gt;C)</w:t>
             </w:r>
           </w:p>
@@ -2059,7 +2060,7 @@
           <w:left w:w="10" w:type="dxa"/>
           <w:right w:w="10" w:type="dxa"/>
         </w:tblCellMar>
-        <w:tblLook w:val="0000" w:firstRow="0" w:lastRow="0" w:firstColumn="0" w:lastColumn="0" w:noHBand="0" w:noVBand="0"/>
+        <w:tblLook w:val="04A0" w:firstRow="1" w:lastRow="0" w:firstColumn="1" w:lastColumn="0" w:noHBand="0" w:noVBand="1"/>
       </w:tblPr>
       <w:tblGrid>
         <w:gridCol w:w="4513"/>
@@ -2473,7 +2474,7 @@
       <w:pPr>
         <w:pStyle w:val="1"/>
       </w:pPr>
-      <w:bookmarkStart w:id="4" w:name="_Toc240014604"/>
+      <w:bookmarkStart w:id="4" w:name="_Toc240015396"/>
       <w:r>
         <w:t>5. Data sources</w:t>
       </w:r>
@@ -2483,7 +2484,7 @@
       <w:pPr>
         <w:pStyle w:val="2"/>
       </w:pPr>
-      <w:bookmarkStart w:id="5" w:name="_Toc240014605"/>
+      <w:bookmarkStart w:id="5" w:name="_Toc240015397"/>
       <w:r>
         <w:t>5.1 Local index (offline)</w:t>
       </w:r>
@@ -2504,7 +2505,7 @@
           <w:left w:w="10" w:type="dxa"/>
           <w:right w:w="10" w:type="dxa"/>
         </w:tblCellMar>
-        <w:tblLook w:val="0000" w:firstRow="0" w:lastRow="0" w:firstColumn="0" w:lastColumn="0" w:noHBand="0" w:noVBand="0"/>
+        <w:tblLook w:val="04A0" w:firstRow="1" w:lastRow="0" w:firstColumn="1" w:lastColumn="0" w:noHBand="0" w:noVBand="1"/>
       </w:tblPr>
       <w:tblGrid>
         <w:gridCol w:w="3068"/>
@@ -2826,7 +2827,15 @@
                 <w:sz w:val="18"/>
                 <w:szCs w:val="18"/>
               </w:rPr>
-              <w:t>Comparison with a conventional ensemble predictor</w:t>
+              <w:t xml:space="preserve">Comparison with a conventional </w:t>
+            </w:r>
+            <w:r>
+              <w:rPr>
+                <w:sz w:val="18"/>
+                <w:szCs w:val="18"/>
+              </w:rPr>
+              <w:lastRenderedPageBreak/>
+              <w:t>ensemble predictor</w:t>
             </w:r>
           </w:p>
         </w:tc>
@@ -2857,6 +2866,7 @@
                 <w:sz w:val="18"/>
                 <w:szCs w:val="18"/>
               </w:rPr>
+              <w:lastRenderedPageBreak/>
               <w:t>ClinVar variant_summary</w:t>
             </w:r>
           </w:p>
@@ -3080,7 +3090,7 @@
       <w:pPr>
         <w:pStyle w:val="2"/>
       </w:pPr>
-      <w:bookmarkStart w:id="6" w:name="_Toc240014606"/>
+      <w:bookmarkStart w:id="6" w:name="_Toc240015398"/>
       <w:r>
         <w:t>5.2 Public API lookups (online, switchable)</w:t>
       </w:r>
@@ -3101,7 +3111,7 @@
           <w:left w:w="10" w:type="dxa"/>
           <w:right w:w="10" w:type="dxa"/>
         </w:tblCellMar>
-        <w:tblLook w:val="0000" w:firstRow="0" w:lastRow="0" w:firstColumn="0" w:lastColumn="0" w:noHBand="0" w:noVBand="0"/>
+        <w:tblLook w:val="04A0" w:firstRow="1" w:lastRow="0" w:firstColumn="1" w:lastColumn="0" w:noHBand="0" w:noVBand="1"/>
       </w:tblPr>
       <w:tblGrid>
         <w:gridCol w:w="2347"/>
@@ -3942,7 +3952,7 @@
       <w:pPr>
         <w:pStyle w:val="1"/>
       </w:pPr>
-      <w:bookmarkStart w:id="7" w:name="_Toc240014607"/>
+      <w:bookmarkStart w:id="7" w:name="_Toc240015399"/>
       <w:r>
         <w:t>6. Processing pipeline</w:t>
       </w:r>
@@ -4043,7 +4053,7 @@
       <w:pPr>
         <w:pStyle w:val="1"/>
       </w:pPr>
-      <w:bookmarkStart w:id="8" w:name="_Toc240014608"/>
+      <w:bookmarkStart w:id="8" w:name="_Toc240015400"/>
       <w:r>
         <w:t>7. Mapping of evidence to ACMG criteria</w:t>
       </w:r>
@@ -4064,7 +4074,7 @@
           <w:left w:w="10" w:type="dxa"/>
           <w:right w:w="10" w:type="dxa"/>
         </w:tblCellMar>
-        <w:tblLook w:val="0000" w:firstRow="0" w:lastRow="0" w:firstColumn="0" w:lastColumn="0" w:noHBand="0" w:noVBand="0"/>
+        <w:tblLook w:val="04A0" w:firstRow="1" w:lastRow="0" w:firstColumn="1" w:lastColumn="0" w:noHBand="0" w:noVBand="1"/>
       </w:tblPr>
       <w:tblGrid>
         <w:gridCol w:w="2167"/>
@@ -4982,7 +4992,7 @@
                 <w:sz w:val="18"/>
                 <w:szCs w:val="18"/>
               </w:rPr>
-              <w:t>Delta 0.5 or above: BP4 withheld and the summary box turns amber. 0.2 to 0.5: BP4 marked for review. Not retrieved: stated as not assessed (section 7.1)</w:t>
+              <w:t>Delta 0.5 or above: BP4 withheld and the summary box turns amber. 0.2 to below 0.5: BP4 marked for review. Not retrieved: stated as not assessed (section 7.1)</w:t>
             </w:r>
           </w:p>
         </w:tc>
@@ -5205,7 +5215,7 @@
       <w:pPr>
         <w:pStyle w:val="2"/>
       </w:pPr>
-      <w:bookmarkStart w:id="9" w:name="_Toc240014609"/>
+      <w:bookmarkStart w:id="9" w:name="_Toc240015401"/>
       <w:r>
         <w:t>7.1 Model adopted for PP3/BP4, and consistency with SpliceAI</w:t>
       </w:r>
@@ -5278,7 +5288,7 @@
           <w:left w:w="10" w:type="dxa"/>
           <w:right w:w="10" w:type="dxa"/>
         </w:tblCellMar>
-        <w:tblLook w:val="0000" w:firstRow="0" w:lastRow="0" w:firstColumn="0" w:lastColumn="0" w:noHBand="0" w:noVBand="0"/>
+        <w:tblLook w:val="04A0" w:firstRow="1" w:lastRow="0" w:firstColumn="1" w:lastColumn="0" w:noHBand="0" w:noVBand="1"/>
       </w:tblPr>
       <w:tblGrid>
         <w:gridCol w:w="2167"/>
@@ -5692,7 +5702,7 @@
       <w:pPr>
         <w:pStyle w:val="2"/>
       </w:pPr>
-      <w:bookmarkStart w:id="10" w:name="_Toc240014610"/>
+      <w:bookmarkStart w:id="10" w:name="_Toc240015402"/>
       <w:r>
         <w:t>7.2 Population-frequency retrieval states and PM2</w:t>
       </w:r>
@@ -5713,7 +5723,7 @@
           <w:left w:w="10" w:type="dxa"/>
           <w:right w:w="10" w:type="dxa"/>
         </w:tblCellMar>
-        <w:tblLook w:val="0000" w:firstRow="0" w:lastRow="0" w:firstColumn="0" w:lastColumn="0" w:noHBand="0" w:noVBand="0"/>
+        <w:tblLook w:val="04A0" w:firstRow="1" w:lastRow="0" w:firstColumn="1" w:lastColumn="0" w:noHBand="0" w:noVBand="1"/>
       </w:tblPr>
       <w:tblGrid>
         <w:gridCol w:w="3069"/>
@@ -6435,7 +6445,7 @@
       <w:pPr>
         <w:pStyle w:val="1"/>
       </w:pPr>
-      <w:bookmarkStart w:id="11" w:name="_Toc240014611"/>
+      <w:bookmarkStart w:id="11" w:name="_Toc240015403"/>
       <w:r>
         <w:t>8. Variants without a FuncVEP score</w:t>
       </w:r>
@@ -6524,7 +6534,7 @@
       <w:pPr>
         <w:pStyle w:val="1"/>
       </w:pPr>
-      <w:bookmarkStart w:id="12" w:name="_Toc240014612"/>
+      <w:bookmarkStart w:id="12" w:name="_Toc240015404"/>
       <w:r>
         <w:t>9. Report structure</w:t>
       </w:r>
@@ -6646,7 +6656,7 @@
       <w:pPr>
         <w:pStyle w:val="1"/>
       </w:pPr>
-      <w:bookmarkStart w:id="13" w:name="_Toc240014613"/>
+      <w:bookmarkStart w:id="13" w:name="_Toc240015405"/>
       <w:r>
         <w:t>10. Verification</w:t>
       </w:r>
@@ -6719,7 +6729,7 @@
           <w:left w:w="10" w:type="dxa"/>
           <w:right w:w="10" w:type="dxa"/>
         </w:tblCellMar>
-        <w:tblLook w:val="0000" w:firstRow="0" w:lastRow="0" w:firstColumn="0" w:lastColumn="0" w:noHBand="0" w:noVBand="0"/>
+        <w:tblLook w:val="04A0" w:firstRow="1" w:lastRow="0" w:firstColumn="1" w:lastColumn="0" w:noHBand="0" w:noVBand="1"/>
       </w:tblPr>
       <w:tblGrid>
         <w:gridCol w:w="3610"/>
@@ -7133,7 +7143,7 @@
           <w:left w:w="10" w:type="dxa"/>
           <w:right w:w="10" w:type="dxa"/>
         </w:tblCellMar>
-        <w:tblLook w:val="0000" w:firstRow="0" w:lastRow="0" w:firstColumn="0" w:lastColumn="0" w:noHBand="0" w:noVBand="0"/>
+        <w:tblLook w:val="04A0" w:firstRow="1" w:lastRow="0" w:firstColumn="1" w:lastColumn="0" w:noHBand="0" w:noVBand="1"/>
       </w:tblPr>
       <w:tblGrid>
         <w:gridCol w:w="2708"/>
@@ -7531,7 +7541,7 @@
       <w:pPr>
         <w:pStyle w:val="1"/>
       </w:pPr>
-      <w:bookmarkStart w:id="14" w:name="_Toc240014614"/>
+      <w:bookmarkStart w:id="14" w:name="_Toc240015406"/>
       <w:r>
         <w:t>11. Interpretation limits</w:t>
       </w:r>
@@ -7632,7 +7642,7 @@
       <w:pPr>
         <w:pStyle w:val="1"/>
       </w:pPr>
-      <w:bookmarkStart w:id="15" w:name="_Toc240014615"/>
+      <w:bookmarkStart w:id="15" w:name="_Toc240015407"/>
       <w:r>
         <w:t>12. Licensing and data governance</w:t>
       </w:r>
@@ -7681,7 +7691,7 @@
       <w:pPr>
         <w:pStyle w:val="1"/>
       </w:pPr>
-      <w:bookmarkStart w:id="16" w:name="_Toc240014616"/>
+      <w:bookmarkStart w:id="16" w:name="_Toc240015408"/>
       <w:r>
         <w:t>13. Acknowledgements</w:t>
       </w:r>
@@ -7704,7 +7714,7 @@
       <w:pPr>
         <w:pStyle w:val="1"/>
       </w:pPr>
-      <w:bookmarkStart w:id="17" w:name="_Toc240014617"/>
+      <w:bookmarkStart w:id="17" w:name="_Toc240015409"/>
       <w:r>
         <w:t>Appendix A. PP3/BP4 thresholds (Supplementary Table 13)</w:t>
       </w:r>
@@ -7733,7 +7743,7 @@
           <w:left w:w="10" w:type="dxa"/>
           <w:right w:w="10" w:type="dxa"/>
         </w:tblCellMar>
-        <w:tblLook w:val="0000" w:firstRow="0" w:lastRow="0" w:firstColumn="0" w:lastColumn="0" w:noHBand="0" w:noVBand="0"/>
+        <w:tblLook w:val="04A0" w:firstRow="1" w:lastRow="0" w:firstColumn="1" w:lastColumn="0" w:noHBand="0" w:noVBand="1"/>
       </w:tblPr>
       <w:tblGrid>
         <w:gridCol w:w="1445"/>
@@ -8980,7 +8990,7 @@
       <w:pPr>
         <w:pStyle w:val="1"/>
       </w:pPr>
-      <w:bookmarkStart w:id="18" w:name="_Toc240014618"/>
+      <w:bookmarkStart w:id="18" w:name="_Toc240015410"/>
       <w:r>
         <w:t>Appendix B. Components</w:t>
       </w:r>
@@ -9001,7 +9011,7 @@
           <w:left w:w="10" w:type="dxa"/>
           <w:right w:w="10" w:type="dxa"/>
         </w:tblCellMar>
-        <w:tblLook w:val="0000" w:firstRow="0" w:lastRow="0" w:firstColumn="0" w:lastColumn="0" w:noHBand="0" w:noVBand="0"/>
+        <w:tblLook w:val="04A0" w:firstRow="1" w:lastRow="0" w:firstColumn="1" w:lastColumn="0" w:noHBand="0" w:noVBand="1"/>
       </w:tblPr>
       <w:tblGrid>
         <w:gridCol w:w="3203"/>
@@ -9674,7 +9684,7 @@
       <w:pPr>
         <w:pStyle w:val="1"/>
       </w:pPr>
-      <w:bookmarkStart w:id="19" w:name="_Toc240014619"/>
+      <w:bookmarkStart w:id="19" w:name="_Toc240015411"/>
       <w:r>
         <w:t>Appendix C. Questions for the authors</w:t>
       </w:r>
@@ -9723,7 +9733,7 @@
       <w:pPr>
         <w:pStyle w:val="1"/>
       </w:pPr>
-      <w:bookmarkStart w:id="20" w:name="_Toc240014620"/>
+      <w:bookmarkStart w:id="20" w:name="_Toc240015412"/>
       <w:r>
         <w:t>Appendix D. Changes from version 1.0 (response to the design review)</w:t>
       </w:r>
@@ -9970,10 +9980,10 @@
 <file path=word/numbering.xml><?xml version="1.0" encoding="utf-8"?>
 <w:numbering xmlns:wpc="http://schemas.microsoft.com/office/word/2010/wordprocessingCanvas" xmlns:cx="http://schemas.microsoft.com/office/drawing/2014/chartex" xmlns:cx1="http://schemas.microsoft.com/office/drawing/2015/9/8/chartex" xmlns:cx2="http://schemas.microsoft.com/office/drawing/2015/10/21/chartex" xmlns:cx3="http://schemas.microsoft.com/office/drawing/2016/5/9/chartex" xmlns:cx4="http://schemas.microsoft.com/office/drawing/2016/5/10/chartex" xmlns:cx5="http://schemas.microsoft.com/office/drawing/2016/5/11/chartex" xmlns:cx6="http://schemas.microsoft.com/office/drawing/2016/5/12/chartex" xmlns:cx7="http://schemas.microsoft.com/office/drawing/2016/5/13/chartex" xmlns:cx8="http://schemas.microsoft.com/office/drawing/2016/5/14/chartex" xmlns:mc="http://schemas.openxmlformats.org/markup-compatibility/2006" xmlns:aink="http://schemas.microsoft.com/office/drawing/2016/ink" xmlns:am3d="http://schemas.microsoft.com/office/drawing/2017/model3d" xmlns:o="urn:schemas-microsoft-com:office:office" xmlns:oel="http://schemas.microsoft.com/office/2019/extlst" xmlns:r="http://schemas.openxmlformats.org/officeDocument/2006/relationships" xmlns:m="http://schemas.openxmlformats.org/officeDocument/2006/math" xmlns:v="urn:schemas-microsoft-com:vml" xmlns:wp14="http://schemas.microsoft.com/office/word/2010/wordprocessingDrawing" xmlns:wp="http://schemas.openxmlformats.org/drawingml/2006/wordprocessingDrawing" xmlns:w10="urn:schemas-microsoft-com:office:word" xmlns:w="http://schemas.openxmlformats.org/wordprocessingml/2006/main" xmlns:w14="http://schemas.microsoft.com/office/word/2010/wordml" xmlns:w15="http://schemas.microsoft.com/office/word/2012/wordml" xmlns:w16cex="http://schemas.microsoft.com/office/word/2018/wordml/cex" xmlns:w16cid="http://schemas.microsoft.com/office/word/2016/wordml/cid" xmlns:w16="http://schemas.microsoft.com/office/word/2018/wordml" xmlns:w16du="http://schemas.microsoft.com/office/word/2023/wordml/word16du" xmlns:w16sdtdh="http://schemas.microsoft.com/office/word/2020/wordml/sdtdatahash" xmlns:w16sdtfl="http://schemas.microsoft.com/office/word/2024/wordml/sdtformatlock" xmlns:w16se="http://schemas.microsoft.com/office/word/2015/wordml/symex" xmlns:wpg="http://schemas.microsoft.com/office/word/2010/wordprocessingGroup" xmlns:wpi="http://schemas.microsoft.com/office/word/2010/wordprocessingInk" xmlns:wne="http://schemas.microsoft.com/office/word/2006/wordml" xmlns:wps="http://schemas.microsoft.com/office/word/2010/wordprocessingShape" mc:Ignorable="w14 w15 w16se w16cid w16 w16cex w16sdtdh w16sdtfl w16du wp14">
   <w:abstractNum w:abstractNumId="0" w15:restartNumberingAfterBreak="0">
-    <w:nsid w:val="08C10939"/>
+    <w:nsid w:val="01816788"/>
     <w:multiLevelType w:val="hybridMultilevel"/>
-    <w:tmpl w:val="E3FCD430"/>
-    <w:lvl w:ilvl="0" w:tplc="BE6855A0">
+    <w:tmpl w:val="44ACD960"/>
+    <w:lvl w:ilvl="0" w:tplc="B5E6F0F0">
       <w:start w:val="1"/>
       <w:numFmt w:val="decimal"/>
       <w:lvlText w:val="%1."/>
@@ -9982,52 +9992,52 @@
         <w:ind w:left="540" w:hanging="360"/>
       </w:pPr>
     </w:lvl>
-    <w:lvl w:ilvl="1" w:tplc="5F3C0574">
+    <w:lvl w:ilvl="1" w:tplc="CA2EDA0C">
       <w:numFmt w:val="decimal"/>
       <w:lvlText w:val=""/>
       <w:lvlJc w:val="left"/>
     </w:lvl>
-    <w:lvl w:ilvl="2" w:tplc="9216E714">
+    <w:lvl w:ilvl="2" w:tplc="7EB2154C">
       <w:numFmt w:val="decimal"/>
       <w:lvlText w:val=""/>
       <w:lvlJc w:val="left"/>
     </w:lvl>
-    <w:lvl w:ilvl="3" w:tplc="983CC72A">
+    <w:lvl w:ilvl="3" w:tplc="7EF26A48">
       <w:numFmt w:val="decimal"/>
       <w:lvlText w:val=""/>
       <w:lvlJc w:val="left"/>
     </w:lvl>
-    <w:lvl w:ilvl="4" w:tplc="3E8E4DD8">
+    <w:lvl w:ilvl="4" w:tplc="A45010F8">
       <w:numFmt w:val="decimal"/>
       <w:lvlText w:val=""/>
       <w:lvlJc w:val="left"/>
     </w:lvl>
-    <w:lvl w:ilvl="5" w:tplc="C2F827FC">
+    <w:lvl w:ilvl="5" w:tplc="66F88D1A">
       <w:numFmt w:val="decimal"/>
       <w:lvlText w:val=""/>
       <w:lvlJc w:val="left"/>
     </w:lvl>
-    <w:lvl w:ilvl="6" w:tplc="75F6BE86">
+    <w:lvl w:ilvl="6" w:tplc="A81E0586">
       <w:numFmt w:val="decimal"/>
       <w:lvlText w:val=""/>
       <w:lvlJc w:val="left"/>
     </w:lvl>
-    <w:lvl w:ilvl="7" w:tplc="CE04F340">
+    <w:lvl w:ilvl="7" w:tplc="5FA23380">
       <w:numFmt w:val="decimal"/>
       <w:lvlText w:val=""/>
       <w:lvlJc w:val="left"/>
     </w:lvl>
-    <w:lvl w:ilvl="8" w:tplc="63C27D30">
+    <w:lvl w:ilvl="8" w:tplc="29A89036">
       <w:numFmt w:val="decimal"/>
       <w:lvlText w:val=""/>
       <w:lvlJc w:val="left"/>
     </w:lvl>
   </w:abstractNum>
   <w:abstractNum w:abstractNumId="1" w15:restartNumberingAfterBreak="0">
-    <w:nsid w:val="114405AC"/>
+    <w:nsid w:val="03546004"/>
     <w:multiLevelType w:val="hybridMultilevel"/>
-    <w:tmpl w:val="953ED474"/>
-    <w:lvl w:ilvl="0" w:tplc="178CA02C">
+    <w:tmpl w:val="77FA2FC4"/>
+    <w:lvl w:ilvl="0" w:tplc="D66685E0">
       <w:start w:val="1"/>
       <w:numFmt w:val="decimal"/>
       <w:lvlText w:val="%1."/>
@@ -10036,52 +10046,52 @@
         <w:ind w:left="540" w:hanging="360"/>
       </w:pPr>
     </w:lvl>
-    <w:lvl w:ilvl="1" w:tplc="463CED12">
+    <w:lvl w:ilvl="1" w:tplc="806405BA">
       <w:numFmt w:val="decimal"/>
       <w:lvlText w:val=""/>
       <w:lvlJc w:val="left"/>
     </w:lvl>
-    <w:lvl w:ilvl="2" w:tplc="7F94AD70">
+    <w:lvl w:ilvl="2" w:tplc="2226822C">
       <w:numFmt w:val="decimal"/>
       <w:lvlText w:val=""/>
       <w:lvlJc w:val="left"/>
     </w:lvl>
-    <w:lvl w:ilvl="3" w:tplc="50AAF216">
+    <w:lvl w:ilvl="3" w:tplc="749E5BCA">
       <w:numFmt w:val="decimal"/>
       <w:lvlText w:val=""/>
       <w:lvlJc w:val="left"/>
     </w:lvl>
-    <w:lvl w:ilvl="4" w:tplc="DFCE7E6C">
+    <w:lvl w:ilvl="4" w:tplc="C8FCFD30">
       <w:numFmt w:val="decimal"/>
       <w:lvlText w:val=""/>
       <w:lvlJc w:val="left"/>
     </w:lvl>
-    <w:lvl w:ilvl="5" w:tplc="756C26C6">
+    <w:lvl w:ilvl="5" w:tplc="E75C491A">
       <w:numFmt w:val="decimal"/>
       <w:lvlText w:val=""/>
       <w:lvlJc w:val="left"/>
     </w:lvl>
-    <w:lvl w:ilvl="6" w:tplc="DA324874">
+    <w:lvl w:ilvl="6" w:tplc="0212CA86">
       <w:numFmt w:val="decimal"/>
       <w:lvlText w:val=""/>
       <w:lvlJc w:val="left"/>
     </w:lvl>
-    <w:lvl w:ilvl="7" w:tplc="09AEDD12">
+    <w:lvl w:ilvl="7" w:tplc="28C20990">
       <w:numFmt w:val="decimal"/>
       <w:lvlText w:val=""/>
       <w:lvlJc w:val="left"/>
     </w:lvl>
-    <w:lvl w:ilvl="8" w:tplc="7D3618D8">
+    <w:lvl w:ilvl="8" w:tplc="4D40F174">
       <w:numFmt w:val="decimal"/>
       <w:lvlText w:val=""/>
       <w:lvlJc w:val="left"/>
     </w:lvl>
   </w:abstractNum>
   <w:abstractNum w:abstractNumId="2" w15:restartNumberingAfterBreak="0">
-    <w:nsid w:val="1A346B0D"/>
+    <w:nsid w:val="075A2737"/>
     <w:multiLevelType w:val="hybridMultilevel"/>
-    <w:tmpl w:val="4C8AACE0"/>
-    <w:lvl w:ilvl="0" w:tplc="8B1C53C2">
+    <w:tmpl w:val="4C42D5EA"/>
+    <w:lvl w:ilvl="0" w:tplc="29424440">
       <w:start w:val="1"/>
       <w:numFmt w:val="decimal"/>
       <w:lvlText w:val="%1."/>
@@ -10090,52 +10100,52 @@
         <w:ind w:left="540" w:hanging="360"/>
       </w:pPr>
     </w:lvl>
-    <w:lvl w:ilvl="1" w:tplc="B456E85C">
+    <w:lvl w:ilvl="1" w:tplc="9E62AB60">
       <w:numFmt w:val="decimal"/>
       <w:lvlText w:val=""/>
       <w:lvlJc w:val="left"/>
     </w:lvl>
-    <w:lvl w:ilvl="2" w:tplc="D51C1586">
+    <w:lvl w:ilvl="2" w:tplc="2DE4DA46">
       <w:numFmt w:val="decimal"/>
       <w:lvlText w:val=""/>
       <w:lvlJc w:val="left"/>
     </w:lvl>
-    <w:lvl w:ilvl="3" w:tplc="16B2285A">
+    <w:lvl w:ilvl="3" w:tplc="3712294C">
       <w:numFmt w:val="decimal"/>
       <w:lvlText w:val=""/>
       <w:lvlJc w:val="left"/>
     </w:lvl>
-    <w:lvl w:ilvl="4" w:tplc="7332B88E">
+    <w:lvl w:ilvl="4" w:tplc="8EA6E83E">
       <w:numFmt w:val="decimal"/>
       <w:lvlText w:val=""/>
       <w:lvlJc w:val="left"/>
     </w:lvl>
-    <w:lvl w:ilvl="5" w:tplc="D42E5ECC">
+    <w:lvl w:ilvl="5" w:tplc="310E71C2">
       <w:numFmt w:val="decimal"/>
       <w:lvlText w:val=""/>
       <w:lvlJc w:val="left"/>
     </w:lvl>
-    <w:lvl w:ilvl="6" w:tplc="248C7DA4">
+    <w:lvl w:ilvl="6" w:tplc="B05E754E">
       <w:numFmt w:val="decimal"/>
       <w:lvlText w:val=""/>
       <w:lvlJc w:val="left"/>
     </w:lvl>
-    <w:lvl w:ilvl="7" w:tplc="78E68D8C">
+    <w:lvl w:ilvl="7" w:tplc="C0A2A950">
       <w:numFmt w:val="decimal"/>
       <w:lvlText w:val=""/>
       <w:lvlJc w:val="left"/>
     </w:lvl>
-    <w:lvl w:ilvl="8" w:tplc="D36A299A">
+    <w:lvl w:ilvl="8" w:tplc="DA44EAF2">
       <w:numFmt w:val="decimal"/>
       <w:lvlText w:val=""/>
       <w:lvlJc w:val="left"/>
     </w:lvl>
   </w:abstractNum>
   <w:abstractNum w:abstractNumId="3" w15:restartNumberingAfterBreak="0">
-    <w:nsid w:val="1C3E2168"/>
+    <w:nsid w:val="0AC00C21"/>
     <w:multiLevelType w:val="hybridMultilevel"/>
-    <w:tmpl w:val="79B2FC72"/>
-    <w:lvl w:ilvl="0" w:tplc="58E837BE">
+    <w:tmpl w:val="E7C2BF72"/>
+    <w:lvl w:ilvl="0" w:tplc="1480F17A">
       <w:start w:val="1"/>
       <w:numFmt w:val="decimal"/>
       <w:lvlText w:val="%1."/>
@@ -10144,52 +10154,376 @@
         <w:ind w:left="540" w:hanging="360"/>
       </w:pPr>
     </w:lvl>
-    <w:lvl w:ilvl="1" w:tplc="CFF43CE6">
+    <w:lvl w:ilvl="1" w:tplc="97DA0896">
       <w:numFmt w:val="decimal"/>
       <w:lvlText w:val=""/>
       <w:lvlJc w:val="left"/>
     </w:lvl>
-    <w:lvl w:ilvl="2" w:tplc="C3204FF8">
+    <w:lvl w:ilvl="2" w:tplc="DC30A018">
       <w:numFmt w:val="decimal"/>
       <w:lvlText w:val=""/>
       <w:lvlJc w:val="left"/>
     </w:lvl>
-    <w:lvl w:ilvl="3" w:tplc="3D0A1C7E">
+    <w:lvl w:ilvl="3" w:tplc="5E60117C">
       <w:numFmt w:val="decimal"/>
       <w:lvlText w:val=""/>
       <w:lvlJc w:val="left"/>
     </w:lvl>
-    <w:lvl w:ilvl="4" w:tplc="63EA6FE8">
+    <w:lvl w:ilvl="4" w:tplc="3330488A">
       <w:numFmt w:val="decimal"/>
       <w:lvlText w:val=""/>
       <w:lvlJc w:val="left"/>
     </w:lvl>
-    <w:lvl w:ilvl="5" w:tplc="786895CE">
+    <w:lvl w:ilvl="5" w:tplc="31F2A108">
       <w:numFmt w:val="decimal"/>
       <w:lvlText w:val=""/>
       <w:lvlJc w:val="left"/>
     </w:lvl>
-    <w:lvl w:ilvl="6" w:tplc="AD808F28">
+    <w:lvl w:ilvl="6" w:tplc="42B6D4E8">
       <w:numFmt w:val="decimal"/>
       <w:lvlText w:val=""/>
       <w:lvlJc w:val="left"/>
     </w:lvl>
-    <w:lvl w:ilvl="7" w:tplc="75F25600">
+    <w:lvl w:ilvl="7" w:tplc="7700CE04">
       <w:numFmt w:val="decimal"/>
       <w:lvlText w:val=""/>
       <w:lvlJc w:val="left"/>
     </w:lvl>
-    <w:lvl w:ilvl="8" w:tplc="B28C28F4">
+    <w:lvl w:ilvl="8" w:tplc="0F80DEAC">
       <w:numFmt w:val="decimal"/>
       <w:lvlText w:val=""/>
       <w:lvlJc w:val="left"/>
     </w:lvl>
   </w:abstractNum>
   <w:abstractNum w:abstractNumId="4" w15:restartNumberingAfterBreak="0">
-    <w:nsid w:val="1D091C93"/>
+    <w:nsid w:val="0D703820"/>
     <w:multiLevelType w:val="hybridMultilevel"/>
-    <w:tmpl w:val="B9B25CF0"/>
-    <w:lvl w:ilvl="0" w:tplc="C0B8E044">
+    <w:tmpl w:val="BC209A40"/>
+    <w:lvl w:ilvl="0" w:tplc="03F0667E">
+      <w:start w:val="1"/>
+      <w:numFmt w:val="bullet"/>
+      <w:lvlText w:val="•"/>
+      <w:lvlJc w:val="left"/>
+      <w:pPr>
+        <w:ind w:left="540" w:hanging="300"/>
+      </w:pPr>
+    </w:lvl>
+    <w:lvl w:ilvl="1" w:tplc="48D209BC">
+      <w:numFmt w:val="decimal"/>
+      <w:lvlText w:val=""/>
+      <w:lvlJc w:val="left"/>
+    </w:lvl>
+    <w:lvl w:ilvl="2" w:tplc="AAE6B610">
+      <w:numFmt w:val="decimal"/>
+      <w:lvlText w:val=""/>
+      <w:lvlJc w:val="left"/>
+    </w:lvl>
+    <w:lvl w:ilvl="3" w:tplc="2F86915C">
+      <w:numFmt w:val="decimal"/>
+      <w:lvlText w:val=""/>
+      <w:lvlJc w:val="left"/>
+    </w:lvl>
+    <w:lvl w:ilvl="4" w:tplc="EB5A75C8">
+      <w:numFmt w:val="decimal"/>
+      <w:lvlText w:val=""/>
+      <w:lvlJc w:val="left"/>
+    </w:lvl>
+    <w:lvl w:ilvl="5" w:tplc="08B2DA08">
+      <w:numFmt w:val="decimal"/>
+      <w:lvlText w:val=""/>
+      <w:lvlJc w:val="left"/>
+    </w:lvl>
+    <w:lvl w:ilvl="6" w:tplc="110C7B3A">
+      <w:numFmt w:val="decimal"/>
+      <w:lvlText w:val=""/>
+      <w:lvlJc w:val="left"/>
+    </w:lvl>
+    <w:lvl w:ilvl="7" w:tplc="C3DA0F30">
+      <w:numFmt w:val="decimal"/>
+      <w:lvlText w:val=""/>
+      <w:lvlJc w:val="left"/>
+    </w:lvl>
+    <w:lvl w:ilvl="8" w:tplc="0B8695CC">
+      <w:numFmt w:val="decimal"/>
+      <w:lvlText w:val=""/>
+      <w:lvlJc w:val="left"/>
+    </w:lvl>
+  </w:abstractNum>
+  <w:abstractNum w:abstractNumId="5" w15:restartNumberingAfterBreak="0">
+    <w:nsid w:val="20C97493"/>
+    <w:multiLevelType w:val="hybridMultilevel"/>
+    <w:tmpl w:val="D412439C"/>
+    <w:lvl w:ilvl="0" w:tplc="491C4F56">
+      <w:start w:val="1"/>
+      <w:numFmt w:val="decimal"/>
+      <w:lvlText w:val="%1."/>
+      <w:lvlJc w:val="left"/>
+      <w:pPr>
+        <w:ind w:left="540" w:hanging="360"/>
+      </w:pPr>
+    </w:lvl>
+    <w:lvl w:ilvl="1" w:tplc="12F816C2">
+      <w:numFmt w:val="decimal"/>
+      <w:lvlText w:val=""/>
+      <w:lvlJc w:val="left"/>
+    </w:lvl>
+    <w:lvl w:ilvl="2" w:tplc="6BFE5A9A">
+      <w:numFmt w:val="decimal"/>
+      <w:lvlText w:val=""/>
+      <w:lvlJc w:val="left"/>
+    </w:lvl>
+    <w:lvl w:ilvl="3" w:tplc="5BDA3D22">
+      <w:numFmt w:val="decimal"/>
+      <w:lvlText w:val=""/>
+      <w:lvlJc w:val="left"/>
+    </w:lvl>
+    <w:lvl w:ilvl="4" w:tplc="9482D8B0">
+      <w:numFmt w:val="decimal"/>
+      <w:lvlText w:val=""/>
+      <w:lvlJc w:val="left"/>
+    </w:lvl>
+    <w:lvl w:ilvl="5" w:tplc="831C4D96">
+      <w:numFmt w:val="decimal"/>
+      <w:lvlText w:val=""/>
+      <w:lvlJc w:val="left"/>
+    </w:lvl>
+    <w:lvl w:ilvl="6" w:tplc="DE3E7748">
+      <w:numFmt w:val="decimal"/>
+      <w:lvlText w:val=""/>
+      <w:lvlJc w:val="left"/>
+    </w:lvl>
+    <w:lvl w:ilvl="7" w:tplc="83720DC0">
+      <w:numFmt w:val="decimal"/>
+      <w:lvlText w:val=""/>
+      <w:lvlJc w:val="left"/>
+    </w:lvl>
+    <w:lvl w:ilvl="8" w:tplc="EA0C81BC">
+      <w:numFmt w:val="decimal"/>
+      <w:lvlText w:val=""/>
+      <w:lvlJc w:val="left"/>
+    </w:lvl>
+  </w:abstractNum>
+  <w:abstractNum w:abstractNumId="6" w15:restartNumberingAfterBreak="0">
+    <w:nsid w:val="279940EE"/>
+    <w:multiLevelType w:val="hybridMultilevel"/>
+    <w:tmpl w:val="6B3ECBCE"/>
+    <w:lvl w:ilvl="0" w:tplc="560A3354">
+      <w:start w:val="1"/>
+      <w:numFmt w:val="decimal"/>
+      <w:lvlText w:val="%1."/>
+      <w:lvlJc w:val="left"/>
+      <w:pPr>
+        <w:ind w:left="540" w:hanging="360"/>
+      </w:pPr>
+    </w:lvl>
+    <w:lvl w:ilvl="1" w:tplc="918AFA2C">
+      <w:numFmt w:val="decimal"/>
+      <w:lvlText w:val=""/>
+      <w:lvlJc w:val="left"/>
+    </w:lvl>
+    <w:lvl w:ilvl="2" w:tplc="0A98AAA8">
+      <w:numFmt w:val="decimal"/>
+      <w:lvlText w:val=""/>
+      <w:lvlJc w:val="left"/>
+    </w:lvl>
+    <w:lvl w:ilvl="3" w:tplc="71064E98">
+      <w:numFmt w:val="decimal"/>
+      <w:lvlText w:val=""/>
+      <w:lvlJc w:val="left"/>
+    </w:lvl>
+    <w:lvl w:ilvl="4" w:tplc="A62A273E">
+      <w:numFmt w:val="decimal"/>
+      <w:lvlText w:val=""/>
+      <w:lvlJc w:val="left"/>
+    </w:lvl>
+    <w:lvl w:ilvl="5" w:tplc="D6505EF6">
+      <w:numFmt w:val="decimal"/>
+      <w:lvlText w:val=""/>
+      <w:lvlJc w:val="left"/>
+    </w:lvl>
+    <w:lvl w:ilvl="6" w:tplc="5A6A1616">
+      <w:numFmt w:val="decimal"/>
+      <w:lvlText w:val=""/>
+      <w:lvlJc w:val="left"/>
+    </w:lvl>
+    <w:lvl w:ilvl="7" w:tplc="8B0A79D6">
+      <w:numFmt w:val="decimal"/>
+      <w:lvlText w:val=""/>
+      <w:lvlJc w:val="left"/>
+    </w:lvl>
+    <w:lvl w:ilvl="8" w:tplc="AB3A458C">
+      <w:numFmt w:val="decimal"/>
+      <w:lvlText w:val=""/>
+      <w:lvlJc w:val="left"/>
+    </w:lvl>
+  </w:abstractNum>
+  <w:abstractNum w:abstractNumId="7" w15:restartNumberingAfterBreak="0">
+    <w:nsid w:val="49FC18BD"/>
+    <w:multiLevelType w:val="hybridMultilevel"/>
+    <w:tmpl w:val="718A1C96"/>
+    <w:lvl w:ilvl="0" w:tplc="F9DAC234">
+      <w:start w:val="1"/>
+      <w:numFmt w:val="decimal"/>
+      <w:lvlText w:val="%1."/>
+      <w:lvlJc w:val="left"/>
+      <w:pPr>
+        <w:ind w:left="540" w:hanging="360"/>
+      </w:pPr>
+    </w:lvl>
+    <w:lvl w:ilvl="1" w:tplc="C47A134A">
+      <w:numFmt w:val="decimal"/>
+      <w:lvlText w:val=""/>
+      <w:lvlJc w:val="left"/>
+    </w:lvl>
+    <w:lvl w:ilvl="2" w:tplc="7E88B92C">
+      <w:numFmt w:val="decimal"/>
+      <w:lvlText w:val=""/>
+      <w:lvlJc w:val="left"/>
+    </w:lvl>
+    <w:lvl w:ilvl="3" w:tplc="57BC5BCC">
+      <w:numFmt w:val="decimal"/>
+      <w:lvlText w:val=""/>
+      <w:lvlJc w:val="left"/>
+    </w:lvl>
+    <w:lvl w:ilvl="4" w:tplc="2A1024B2">
+      <w:numFmt w:val="decimal"/>
+      <w:lvlText w:val=""/>
+      <w:lvlJc w:val="left"/>
+    </w:lvl>
+    <w:lvl w:ilvl="5" w:tplc="10DE7B50">
+      <w:numFmt w:val="decimal"/>
+      <w:lvlText w:val=""/>
+      <w:lvlJc w:val="left"/>
+    </w:lvl>
+    <w:lvl w:ilvl="6" w:tplc="3FC25942">
+      <w:numFmt w:val="decimal"/>
+      <w:lvlText w:val=""/>
+      <w:lvlJc w:val="left"/>
+    </w:lvl>
+    <w:lvl w:ilvl="7" w:tplc="C82A9016">
+      <w:numFmt w:val="decimal"/>
+      <w:lvlText w:val=""/>
+      <w:lvlJc w:val="left"/>
+    </w:lvl>
+    <w:lvl w:ilvl="8" w:tplc="4742442E">
+      <w:numFmt w:val="decimal"/>
+      <w:lvlText w:val=""/>
+      <w:lvlJc w:val="left"/>
+    </w:lvl>
+  </w:abstractNum>
+  <w:abstractNum w:abstractNumId="8" w15:restartNumberingAfterBreak="0">
+    <w:nsid w:val="55B12F84"/>
+    <w:multiLevelType w:val="hybridMultilevel"/>
+    <w:tmpl w:val="19542F22"/>
+    <w:lvl w:ilvl="0" w:tplc="A4362792">
+      <w:start w:val="1"/>
+      <w:numFmt w:val="decimal"/>
+      <w:lvlText w:val="%1."/>
+      <w:lvlJc w:val="left"/>
+      <w:pPr>
+        <w:ind w:left="540" w:hanging="360"/>
+      </w:pPr>
+    </w:lvl>
+    <w:lvl w:ilvl="1" w:tplc="74E295F6">
+      <w:numFmt w:val="decimal"/>
+      <w:lvlText w:val=""/>
+      <w:lvlJc w:val="left"/>
+    </w:lvl>
+    <w:lvl w:ilvl="2" w:tplc="8DC645EC">
+      <w:numFmt w:val="decimal"/>
+      <w:lvlText w:val=""/>
+      <w:lvlJc w:val="left"/>
+    </w:lvl>
+    <w:lvl w:ilvl="3" w:tplc="CEAE8582">
+      <w:numFmt w:val="decimal"/>
+      <w:lvlText w:val=""/>
+      <w:lvlJc w:val="left"/>
+    </w:lvl>
+    <w:lvl w:ilvl="4" w:tplc="6C6CCFDA">
+      <w:numFmt w:val="decimal"/>
+      <w:lvlText w:val=""/>
+      <w:lvlJc w:val="left"/>
+    </w:lvl>
+    <w:lvl w:ilvl="5" w:tplc="9E62897C">
+      <w:numFmt w:val="decimal"/>
+      <w:lvlText w:val=""/>
+      <w:lvlJc w:val="left"/>
+    </w:lvl>
+    <w:lvl w:ilvl="6" w:tplc="F07A402C">
+      <w:numFmt w:val="decimal"/>
+      <w:lvlText w:val=""/>
+      <w:lvlJc w:val="left"/>
+    </w:lvl>
+    <w:lvl w:ilvl="7" w:tplc="39305DB6">
+      <w:numFmt w:val="decimal"/>
+      <w:lvlText w:val=""/>
+      <w:lvlJc w:val="left"/>
+    </w:lvl>
+    <w:lvl w:ilvl="8" w:tplc="AB4AC72C">
+      <w:numFmt w:val="decimal"/>
+      <w:lvlText w:val=""/>
+      <w:lvlJc w:val="left"/>
+    </w:lvl>
+  </w:abstractNum>
+  <w:abstractNum w:abstractNumId="9" w15:restartNumberingAfterBreak="0">
+    <w:nsid w:val="597F1680"/>
+    <w:multiLevelType w:val="hybridMultilevel"/>
+    <w:tmpl w:val="B43CFBEA"/>
+    <w:lvl w:ilvl="0" w:tplc="EF7AD31C">
+      <w:start w:val="1"/>
+      <w:numFmt w:val="decimal"/>
+      <w:lvlText w:val="%1."/>
+      <w:lvlJc w:val="left"/>
+      <w:pPr>
+        <w:ind w:left="540" w:hanging="360"/>
+      </w:pPr>
+    </w:lvl>
+    <w:lvl w:ilvl="1" w:tplc="5ABEA5A4">
+      <w:numFmt w:val="decimal"/>
+      <w:lvlText w:val=""/>
+      <w:lvlJc w:val="left"/>
+    </w:lvl>
+    <w:lvl w:ilvl="2" w:tplc="0414D7FC">
+      <w:numFmt w:val="decimal"/>
+      <w:lvlText w:val=""/>
+      <w:lvlJc w:val="left"/>
+    </w:lvl>
+    <w:lvl w:ilvl="3" w:tplc="8E7A7306">
+      <w:numFmt w:val="decimal"/>
+      <w:lvlText w:val=""/>
+      <w:lvlJc w:val="left"/>
+    </w:lvl>
+    <w:lvl w:ilvl="4" w:tplc="289A09C0">
+      <w:numFmt w:val="decimal"/>
+      <w:lvlText w:val=""/>
+      <w:lvlJc w:val="left"/>
+    </w:lvl>
+    <w:lvl w:ilvl="5" w:tplc="8BE67F5A">
+      <w:numFmt w:val="decimal"/>
+      <w:lvlText w:val=""/>
+      <w:lvlJc w:val="left"/>
+    </w:lvl>
+    <w:lvl w:ilvl="6" w:tplc="1FF2E602">
+      <w:numFmt w:val="decimal"/>
+      <w:lvlText w:val=""/>
+      <w:lvlJc w:val="left"/>
+    </w:lvl>
+    <w:lvl w:ilvl="7" w:tplc="68982C32">
+      <w:numFmt w:val="decimal"/>
+      <w:lvlText w:val=""/>
+      <w:lvlJc w:val="left"/>
+    </w:lvl>
+    <w:lvl w:ilvl="8" w:tplc="041AA822">
+      <w:numFmt w:val="decimal"/>
+      <w:lvlText w:val=""/>
+      <w:lvlJc w:val="left"/>
+    </w:lvl>
+  </w:abstractNum>
+  <w:abstractNum w:abstractNumId="10" w15:restartNumberingAfterBreak="0">
+    <w:nsid w:val="61303276"/>
+    <w:multiLevelType w:val="hybridMultilevel"/>
+    <w:tmpl w:val="1E82ADCE"/>
+    <w:lvl w:ilvl="0" w:tplc="6810A170">
       <w:start w:val="1"/>
       <w:numFmt w:val="bullet"/>
       <w:lvlText w:val="●"/>
@@ -10198,7 +10532,7 @@
         <w:ind w:left="720" w:hanging="360"/>
       </w:pPr>
     </w:lvl>
-    <w:lvl w:ilvl="1" w:tplc="175ECBC0">
+    <w:lvl w:ilvl="1" w:tplc="D960EE0A">
       <w:start w:val="1"/>
       <w:numFmt w:val="bullet"/>
       <w:lvlText w:val="○"/>
@@ -10207,7 +10541,7 @@
         <w:ind w:left="1440" w:hanging="360"/>
       </w:pPr>
     </w:lvl>
-    <w:lvl w:ilvl="2" w:tplc="33EEA416">
+    <w:lvl w:ilvl="2" w:tplc="A16A0E82">
       <w:start w:val="1"/>
       <w:numFmt w:val="bullet"/>
       <w:lvlText w:val="■"/>
@@ -10216,7 +10550,7 @@
         <w:ind w:left="2160" w:hanging="360"/>
       </w:pPr>
     </w:lvl>
-    <w:lvl w:ilvl="3" w:tplc="6E621C38">
+    <w:lvl w:ilvl="3" w:tplc="D8AA7060">
       <w:start w:val="1"/>
       <w:numFmt w:val="bullet"/>
       <w:lvlText w:val="●"/>
@@ -10225,7 +10559,7 @@
         <w:ind w:left="2880" w:hanging="360"/>
       </w:pPr>
     </w:lvl>
-    <w:lvl w:ilvl="4" w:tplc="04DA63D8">
+    <w:lvl w:ilvl="4" w:tplc="9F1ED6E0">
       <w:start w:val="1"/>
       <w:numFmt w:val="bullet"/>
       <w:lvlText w:val="○"/>
@@ -10234,7 +10568,7 @@
         <w:ind w:left="3600" w:hanging="360"/>
       </w:pPr>
     </w:lvl>
-    <w:lvl w:ilvl="5" w:tplc="D160E50A">
+    <w:lvl w:ilvl="5" w:tplc="F13293EC">
       <w:start w:val="1"/>
       <w:numFmt w:val="bullet"/>
       <w:lvlText w:val="■"/>
@@ -10243,7 +10577,7 @@
         <w:ind w:left="4320" w:hanging="360"/>
       </w:pPr>
     </w:lvl>
-    <w:lvl w:ilvl="6" w:tplc="53C052C2">
+    <w:lvl w:ilvl="6" w:tplc="593812B2">
       <w:start w:val="1"/>
       <w:numFmt w:val="bullet"/>
       <w:lvlText w:val="●"/>
@@ -10252,7 +10586,7 @@
         <w:ind w:left="5040" w:hanging="360"/>
       </w:pPr>
     </w:lvl>
-    <w:lvl w:ilvl="7" w:tplc="38B03716">
+    <w:lvl w:ilvl="7" w:tplc="9886D44A">
       <w:start w:val="1"/>
       <w:numFmt w:val="bullet"/>
       <w:lvlText w:val="●"/>
@@ -10261,7 +10595,7 @@
         <w:ind w:left="5760" w:hanging="360"/>
       </w:pPr>
     </w:lvl>
-    <w:lvl w:ilvl="8" w:tplc="D856F18A">
+    <w:lvl w:ilvl="8" w:tplc="D5A81FBE">
       <w:start w:val="1"/>
       <w:numFmt w:val="bullet"/>
       <w:lvlText w:val="●"/>
@@ -10271,11 +10605,11 @@
       </w:pPr>
     </w:lvl>
   </w:abstractNum>
-  <w:abstractNum w:abstractNumId="5" w15:restartNumberingAfterBreak="0">
-    <w:nsid w:val="237573D7"/>
+  <w:abstractNum w:abstractNumId="11" w15:restartNumberingAfterBreak="0">
+    <w:nsid w:val="6BCB1DD5"/>
     <w:multiLevelType w:val="hybridMultilevel"/>
-    <w:tmpl w:val="9DD8E9FC"/>
-    <w:lvl w:ilvl="0" w:tplc="0A0023E0">
+    <w:tmpl w:val="5D529046"/>
+    <w:lvl w:ilvl="0" w:tplc="3746E0C0">
       <w:start w:val="1"/>
       <w:numFmt w:val="decimal"/>
       <w:lvlText w:val="%1."/>
@@ -10284,52 +10618,52 @@
         <w:ind w:left="540" w:hanging="360"/>
       </w:pPr>
     </w:lvl>
-    <w:lvl w:ilvl="1" w:tplc="9BC0998A">
+    <w:lvl w:ilvl="1" w:tplc="A5F680F6">
       <w:numFmt w:val="decimal"/>
       <w:lvlText w:val=""/>
       <w:lvlJc w:val="left"/>
     </w:lvl>
-    <w:lvl w:ilvl="2" w:tplc="AC1C56D8">
+    <w:lvl w:ilvl="2" w:tplc="BB7038D8">
       <w:numFmt w:val="decimal"/>
       <w:lvlText w:val=""/>
       <w:lvlJc w:val="left"/>
     </w:lvl>
-    <w:lvl w:ilvl="3" w:tplc="30DA8C6A">
+    <w:lvl w:ilvl="3" w:tplc="07FED9BA">
       <w:numFmt w:val="decimal"/>
       <w:lvlText w:val=""/>
       <w:lvlJc w:val="left"/>
     </w:lvl>
-    <w:lvl w:ilvl="4" w:tplc="225EDE02">
+    <w:lvl w:ilvl="4" w:tplc="62109C90">
       <w:numFmt w:val="decimal"/>
       <w:lvlText w:val=""/>
       <w:lvlJc w:val="left"/>
     </w:lvl>
-    <w:lvl w:ilvl="5" w:tplc="A1F48D58">
+    <w:lvl w:ilvl="5" w:tplc="B164ED68">
       <w:numFmt w:val="decimal"/>
       <w:lvlText w:val=""/>
       <w:lvlJc w:val="left"/>
     </w:lvl>
-    <w:lvl w:ilvl="6" w:tplc="FF0E803C">
+    <w:lvl w:ilvl="6" w:tplc="42E0E11A">
       <w:numFmt w:val="decimal"/>
       <w:lvlText w:val=""/>
       <w:lvlJc w:val="left"/>
     </w:lvl>
-    <w:lvl w:ilvl="7" w:tplc="24345196">
+    <w:lvl w:ilvl="7" w:tplc="64AEF41A">
       <w:numFmt w:val="decimal"/>
       <w:lvlText w:val=""/>
       <w:lvlJc w:val="left"/>
     </w:lvl>
-    <w:lvl w:ilvl="8" w:tplc="82A0D544">
+    <w:lvl w:ilvl="8" w:tplc="3AE8465E">
       <w:numFmt w:val="decimal"/>
       <w:lvlText w:val=""/>
       <w:lvlJc w:val="left"/>
     </w:lvl>
   </w:abstractNum>
-  <w:abstractNum w:abstractNumId="6" w15:restartNumberingAfterBreak="0">
-    <w:nsid w:val="273603B2"/>
+  <w:abstractNum w:abstractNumId="12" w15:restartNumberingAfterBreak="0">
+    <w:nsid w:val="76155647"/>
     <w:multiLevelType w:val="hybridMultilevel"/>
-    <w:tmpl w:val="F56E3C46"/>
-    <w:lvl w:ilvl="0" w:tplc="DCDEE214">
+    <w:tmpl w:val="76E6D4EC"/>
+    <w:lvl w:ilvl="0" w:tplc="F2F2DB3E">
       <w:start w:val="1"/>
       <w:numFmt w:val="decimal"/>
       <w:lvlText w:val="%1."/>
@@ -10338,52 +10672,52 @@
         <w:ind w:left="540" w:hanging="360"/>
       </w:pPr>
     </w:lvl>
-    <w:lvl w:ilvl="1" w:tplc="CBD4107E">
+    <w:lvl w:ilvl="1" w:tplc="52A038E0">
       <w:numFmt w:val="decimal"/>
       <w:lvlText w:val=""/>
       <w:lvlJc w:val="left"/>
     </w:lvl>
-    <w:lvl w:ilvl="2" w:tplc="28362724">
+    <w:lvl w:ilvl="2" w:tplc="71680044">
       <w:numFmt w:val="decimal"/>
       <w:lvlText w:val=""/>
       <w:lvlJc w:val="left"/>
     </w:lvl>
-    <w:lvl w:ilvl="3" w:tplc="DFDC7AD2">
+    <w:lvl w:ilvl="3" w:tplc="80D00ABC">
       <w:numFmt w:val="decimal"/>
       <w:lvlText w:val=""/>
       <w:lvlJc w:val="left"/>
     </w:lvl>
-    <w:lvl w:ilvl="4" w:tplc="254C59D0">
+    <w:lvl w:ilvl="4" w:tplc="3C0E5D22">
       <w:numFmt w:val="decimal"/>
       <w:lvlText w:val=""/>
       <w:lvlJc w:val="left"/>
     </w:lvl>
-    <w:lvl w:ilvl="5" w:tplc="EEC6E00A">
+    <w:lvl w:ilvl="5" w:tplc="520AC630">
       <w:numFmt w:val="decimal"/>
       <w:lvlText w:val=""/>
       <w:lvlJc w:val="left"/>
     </w:lvl>
-    <w:lvl w:ilvl="6" w:tplc="9886B7F4">
+    <w:lvl w:ilvl="6" w:tplc="AED6D08E">
       <w:numFmt w:val="decimal"/>
       <w:lvlText w:val=""/>
       <w:lvlJc w:val="left"/>
     </w:lvl>
-    <w:lvl w:ilvl="7" w:tplc="B7107E70">
+    <w:lvl w:ilvl="7" w:tplc="93FEE54E">
       <w:numFmt w:val="decimal"/>
       <w:lvlText w:val=""/>
       <w:lvlJc w:val="left"/>
     </w:lvl>
-    <w:lvl w:ilvl="8" w:tplc="1C0A1A36">
+    <w:lvl w:ilvl="8" w:tplc="959054E8">
       <w:numFmt w:val="decimal"/>
       <w:lvlText w:val=""/>
       <w:lvlJc w:val="left"/>
     </w:lvl>
   </w:abstractNum>
-  <w:abstractNum w:abstractNumId="7" w15:restartNumberingAfterBreak="0">
-    <w:nsid w:val="3CF77DE4"/>
+  <w:abstractNum w:abstractNumId="13" w15:restartNumberingAfterBreak="0">
+    <w:nsid w:val="7C5E6604"/>
     <w:multiLevelType w:val="hybridMultilevel"/>
-    <w:tmpl w:val="BFF24D04"/>
-    <w:lvl w:ilvl="0" w:tplc="F18E5CE6">
+    <w:tmpl w:val="D4F088BE"/>
+    <w:lvl w:ilvl="0" w:tplc="4FB2DC9E">
       <w:start w:val="1"/>
       <w:numFmt w:val="decimal"/>
       <w:lvlText w:val="%1."/>
@@ -10392,397 +10726,73 @@
         <w:ind w:left="540" w:hanging="360"/>
       </w:pPr>
     </w:lvl>
-    <w:lvl w:ilvl="1" w:tplc="48D6B51E">
+    <w:lvl w:ilvl="1" w:tplc="493C019C">
       <w:numFmt w:val="decimal"/>
       <w:lvlText w:val=""/>
       <w:lvlJc w:val="left"/>
     </w:lvl>
-    <w:lvl w:ilvl="2" w:tplc="D7543FAE">
+    <w:lvl w:ilvl="2" w:tplc="2EBADAE0">
       <w:numFmt w:val="decimal"/>
       <w:lvlText w:val=""/>
       <w:lvlJc w:val="left"/>
     </w:lvl>
-    <w:lvl w:ilvl="3" w:tplc="4D784374">
+    <w:lvl w:ilvl="3" w:tplc="5C106060">
       <w:numFmt w:val="decimal"/>
       <w:lvlText w:val=""/>
       <w:lvlJc w:val="left"/>
     </w:lvl>
-    <w:lvl w:ilvl="4" w:tplc="36B8AFE0">
+    <w:lvl w:ilvl="4" w:tplc="B0A2ECBE">
       <w:numFmt w:val="decimal"/>
       <w:lvlText w:val=""/>
       <w:lvlJc w:val="left"/>
     </w:lvl>
-    <w:lvl w:ilvl="5" w:tplc="D488EE0A">
+    <w:lvl w:ilvl="5" w:tplc="C13CA302">
       <w:numFmt w:val="decimal"/>
       <w:lvlText w:val=""/>
       <w:lvlJc w:val="left"/>
     </w:lvl>
-    <w:lvl w:ilvl="6" w:tplc="7ADCA9B4">
+    <w:lvl w:ilvl="6" w:tplc="0450DEE4">
       <w:numFmt w:val="decimal"/>
       <w:lvlText w:val=""/>
       <w:lvlJc w:val="left"/>
     </w:lvl>
-    <w:lvl w:ilvl="7" w:tplc="E4A653DC">
+    <w:lvl w:ilvl="7" w:tplc="6E1A393C">
       <w:numFmt w:val="decimal"/>
       <w:lvlText w:val=""/>
       <w:lvlJc w:val="left"/>
     </w:lvl>
-    <w:lvl w:ilvl="8" w:tplc="9A58AA12">
+    <w:lvl w:ilvl="8" w:tplc="1DEAEC08">
       <w:numFmt w:val="decimal"/>
       <w:lvlText w:val=""/>
       <w:lvlJc w:val="left"/>
     </w:lvl>
   </w:abstractNum>
-  <w:abstractNum w:abstractNumId="8" w15:restartNumberingAfterBreak="0">
-    <w:nsid w:val="496D2D9F"/>
-    <w:multiLevelType w:val="hybridMultilevel"/>
-    <w:tmpl w:val="B868E994"/>
-    <w:lvl w:ilvl="0" w:tplc="539E5D20">
-      <w:start w:val="1"/>
-      <w:numFmt w:val="decimal"/>
-      <w:lvlText w:val="%1."/>
-      <w:lvlJc w:val="left"/>
-      <w:pPr>
-        <w:ind w:left="540" w:hanging="360"/>
-      </w:pPr>
-    </w:lvl>
-    <w:lvl w:ilvl="1" w:tplc="088E935E">
-      <w:numFmt w:val="decimal"/>
-      <w:lvlText w:val=""/>
-      <w:lvlJc w:val="left"/>
-    </w:lvl>
-    <w:lvl w:ilvl="2" w:tplc="0E067956">
-      <w:numFmt w:val="decimal"/>
-      <w:lvlText w:val=""/>
-      <w:lvlJc w:val="left"/>
-    </w:lvl>
-    <w:lvl w:ilvl="3" w:tplc="3886DB48">
-      <w:numFmt w:val="decimal"/>
-      <w:lvlText w:val=""/>
-      <w:lvlJc w:val="left"/>
-    </w:lvl>
-    <w:lvl w:ilvl="4" w:tplc="F45E71E8">
-      <w:numFmt w:val="decimal"/>
-      <w:lvlText w:val=""/>
-      <w:lvlJc w:val="left"/>
-    </w:lvl>
-    <w:lvl w:ilvl="5" w:tplc="667C4122">
-      <w:numFmt w:val="decimal"/>
-      <w:lvlText w:val=""/>
-      <w:lvlJc w:val="left"/>
-    </w:lvl>
-    <w:lvl w:ilvl="6" w:tplc="23A864FE">
-      <w:numFmt w:val="decimal"/>
-      <w:lvlText w:val=""/>
-      <w:lvlJc w:val="left"/>
-    </w:lvl>
-    <w:lvl w:ilvl="7" w:tplc="DD00CBF6">
-      <w:numFmt w:val="decimal"/>
-      <w:lvlText w:val=""/>
-      <w:lvlJc w:val="left"/>
-    </w:lvl>
-    <w:lvl w:ilvl="8" w:tplc="26888C48">
-      <w:numFmt w:val="decimal"/>
-      <w:lvlText w:val=""/>
-      <w:lvlJc w:val="left"/>
-    </w:lvl>
-  </w:abstractNum>
-  <w:abstractNum w:abstractNumId="9" w15:restartNumberingAfterBreak="0">
-    <w:nsid w:val="581D1FD3"/>
-    <w:multiLevelType w:val="hybridMultilevel"/>
-    <w:tmpl w:val="28D01E4A"/>
-    <w:lvl w:ilvl="0" w:tplc="868E7C80">
-      <w:start w:val="1"/>
-      <w:numFmt w:val="decimal"/>
-      <w:lvlText w:val="%1."/>
-      <w:lvlJc w:val="left"/>
-      <w:pPr>
-        <w:ind w:left="540" w:hanging="360"/>
-      </w:pPr>
-    </w:lvl>
-    <w:lvl w:ilvl="1" w:tplc="9C8E8DAE">
-      <w:numFmt w:val="decimal"/>
-      <w:lvlText w:val=""/>
-      <w:lvlJc w:val="left"/>
-    </w:lvl>
-    <w:lvl w:ilvl="2" w:tplc="EEC46DCE">
-      <w:numFmt w:val="decimal"/>
-      <w:lvlText w:val=""/>
-      <w:lvlJc w:val="left"/>
-    </w:lvl>
-    <w:lvl w:ilvl="3" w:tplc="17CEAA08">
-      <w:numFmt w:val="decimal"/>
-      <w:lvlText w:val=""/>
-      <w:lvlJc w:val="left"/>
-    </w:lvl>
-    <w:lvl w:ilvl="4" w:tplc="921012BA">
-      <w:numFmt w:val="decimal"/>
-      <w:lvlText w:val=""/>
-      <w:lvlJc w:val="left"/>
-    </w:lvl>
-    <w:lvl w:ilvl="5" w:tplc="B784B58E">
-      <w:numFmt w:val="decimal"/>
-      <w:lvlText w:val=""/>
-      <w:lvlJc w:val="left"/>
-    </w:lvl>
-    <w:lvl w:ilvl="6" w:tplc="8C7CEAA6">
-      <w:numFmt w:val="decimal"/>
-      <w:lvlText w:val=""/>
-      <w:lvlJc w:val="left"/>
-    </w:lvl>
-    <w:lvl w:ilvl="7" w:tplc="A8DA6706">
-      <w:numFmt w:val="decimal"/>
-      <w:lvlText w:val=""/>
-      <w:lvlJc w:val="left"/>
-    </w:lvl>
-    <w:lvl w:ilvl="8" w:tplc="C90EAF84">
-      <w:numFmt w:val="decimal"/>
-      <w:lvlText w:val=""/>
-      <w:lvlJc w:val="left"/>
-    </w:lvl>
-  </w:abstractNum>
-  <w:abstractNum w:abstractNumId="10" w15:restartNumberingAfterBreak="0">
-    <w:nsid w:val="59F25BDB"/>
-    <w:multiLevelType w:val="hybridMultilevel"/>
-    <w:tmpl w:val="42204D52"/>
-    <w:lvl w:ilvl="0" w:tplc="A3CA0714">
-      <w:start w:val="1"/>
-      <w:numFmt w:val="decimal"/>
-      <w:lvlText w:val="%1."/>
-      <w:lvlJc w:val="left"/>
-      <w:pPr>
-        <w:ind w:left="540" w:hanging="360"/>
-      </w:pPr>
-    </w:lvl>
-    <w:lvl w:ilvl="1" w:tplc="F1CE357E">
-      <w:numFmt w:val="decimal"/>
-      <w:lvlText w:val=""/>
-      <w:lvlJc w:val="left"/>
-    </w:lvl>
-    <w:lvl w:ilvl="2" w:tplc="716E2D50">
-      <w:numFmt w:val="decimal"/>
-      <w:lvlText w:val=""/>
-      <w:lvlJc w:val="left"/>
-    </w:lvl>
-    <w:lvl w:ilvl="3" w:tplc="DEF849A4">
-      <w:numFmt w:val="decimal"/>
-      <w:lvlText w:val=""/>
-      <w:lvlJc w:val="left"/>
-    </w:lvl>
-    <w:lvl w:ilvl="4" w:tplc="89D89DD6">
-      <w:numFmt w:val="decimal"/>
-      <w:lvlText w:val=""/>
-      <w:lvlJc w:val="left"/>
-    </w:lvl>
-    <w:lvl w:ilvl="5" w:tplc="A6582C50">
-      <w:numFmt w:val="decimal"/>
-      <w:lvlText w:val=""/>
-      <w:lvlJc w:val="left"/>
-    </w:lvl>
-    <w:lvl w:ilvl="6" w:tplc="4B2E850E">
-      <w:numFmt w:val="decimal"/>
-      <w:lvlText w:val=""/>
-      <w:lvlJc w:val="left"/>
-    </w:lvl>
-    <w:lvl w:ilvl="7" w:tplc="D77C3B4A">
-      <w:numFmt w:val="decimal"/>
-      <w:lvlText w:val=""/>
-      <w:lvlJc w:val="left"/>
-    </w:lvl>
-    <w:lvl w:ilvl="8" w:tplc="D70A1C16">
-      <w:numFmt w:val="decimal"/>
-      <w:lvlText w:val=""/>
-      <w:lvlJc w:val="left"/>
-    </w:lvl>
-  </w:abstractNum>
-  <w:abstractNum w:abstractNumId="11" w15:restartNumberingAfterBreak="0">
-    <w:nsid w:val="63975DF0"/>
-    <w:multiLevelType w:val="hybridMultilevel"/>
-    <w:tmpl w:val="F370D99E"/>
-    <w:lvl w:ilvl="0" w:tplc="162A9072">
-      <w:start w:val="1"/>
-      <w:numFmt w:val="decimal"/>
-      <w:lvlText w:val="%1."/>
-      <w:lvlJc w:val="left"/>
-      <w:pPr>
-        <w:ind w:left="540" w:hanging="360"/>
-      </w:pPr>
-    </w:lvl>
-    <w:lvl w:ilvl="1" w:tplc="D6A649D8">
-      <w:numFmt w:val="decimal"/>
-      <w:lvlText w:val=""/>
-      <w:lvlJc w:val="left"/>
-    </w:lvl>
-    <w:lvl w:ilvl="2" w:tplc="42CE23F4">
-      <w:numFmt w:val="decimal"/>
-      <w:lvlText w:val=""/>
-      <w:lvlJc w:val="left"/>
-    </w:lvl>
-    <w:lvl w:ilvl="3" w:tplc="AAC0349A">
-      <w:numFmt w:val="decimal"/>
-      <w:lvlText w:val=""/>
-      <w:lvlJc w:val="left"/>
-    </w:lvl>
-    <w:lvl w:ilvl="4" w:tplc="530ED81C">
-      <w:numFmt w:val="decimal"/>
-      <w:lvlText w:val=""/>
-      <w:lvlJc w:val="left"/>
-    </w:lvl>
-    <w:lvl w:ilvl="5" w:tplc="36360CA8">
-      <w:numFmt w:val="decimal"/>
-      <w:lvlText w:val=""/>
-      <w:lvlJc w:val="left"/>
-    </w:lvl>
-    <w:lvl w:ilvl="6" w:tplc="DFA2D338">
-      <w:numFmt w:val="decimal"/>
-      <w:lvlText w:val=""/>
-      <w:lvlJc w:val="left"/>
-    </w:lvl>
-    <w:lvl w:ilvl="7" w:tplc="9F5AEFF6">
-      <w:numFmt w:val="decimal"/>
-      <w:lvlText w:val=""/>
-      <w:lvlJc w:val="left"/>
-    </w:lvl>
-    <w:lvl w:ilvl="8" w:tplc="651EC5E4">
-      <w:numFmt w:val="decimal"/>
-      <w:lvlText w:val=""/>
-      <w:lvlJc w:val="left"/>
-    </w:lvl>
-  </w:abstractNum>
-  <w:abstractNum w:abstractNumId="12" w15:restartNumberingAfterBreak="0">
-    <w:nsid w:val="74FB083A"/>
-    <w:multiLevelType w:val="hybridMultilevel"/>
-    <w:tmpl w:val="7B9A63EA"/>
-    <w:lvl w:ilvl="0" w:tplc="733AE042">
-      <w:start w:val="1"/>
-      <w:numFmt w:val="decimal"/>
-      <w:lvlText w:val="%1."/>
-      <w:lvlJc w:val="left"/>
-      <w:pPr>
-        <w:ind w:left="540" w:hanging="360"/>
-      </w:pPr>
-    </w:lvl>
-    <w:lvl w:ilvl="1" w:tplc="FC060502">
-      <w:numFmt w:val="decimal"/>
-      <w:lvlText w:val=""/>
-      <w:lvlJc w:val="left"/>
-    </w:lvl>
-    <w:lvl w:ilvl="2" w:tplc="5770F558">
-      <w:numFmt w:val="decimal"/>
-      <w:lvlText w:val=""/>
-      <w:lvlJc w:val="left"/>
-    </w:lvl>
-    <w:lvl w:ilvl="3" w:tplc="BEC8A158">
-      <w:numFmt w:val="decimal"/>
-      <w:lvlText w:val=""/>
-      <w:lvlJc w:val="left"/>
-    </w:lvl>
-    <w:lvl w:ilvl="4" w:tplc="201E5F06">
-      <w:numFmt w:val="decimal"/>
-      <w:lvlText w:val=""/>
-      <w:lvlJc w:val="left"/>
-    </w:lvl>
-    <w:lvl w:ilvl="5" w:tplc="CC266F6C">
-      <w:numFmt w:val="decimal"/>
-      <w:lvlText w:val=""/>
-      <w:lvlJc w:val="left"/>
-    </w:lvl>
-    <w:lvl w:ilvl="6" w:tplc="EC5AD226">
-      <w:numFmt w:val="decimal"/>
-      <w:lvlText w:val=""/>
-      <w:lvlJc w:val="left"/>
-    </w:lvl>
-    <w:lvl w:ilvl="7" w:tplc="97A08564">
-      <w:numFmt w:val="decimal"/>
-      <w:lvlText w:val=""/>
-      <w:lvlJc w:val="left"/>
-    </w:lvl>
-    <w:lvl w:ilvl="8" w:tplc="B5BA20E6">
-      <w:numFmt w:val="decimal"/>
-      <w:lvlText w:val=""/>
-      <w:lvlJc w:val="left"/>
-    </w:lvl>
-  </w:abstractNum>
-  <w:abstractNum w:abstractNumId="13" w15:restartNumberingAfterBreak="0">
-    <w:nsid w:val="74FF27C8"/>
-    <w:multiLevelType w:val="hybridMultilevel"/>
-    <w:tmpl w:val="D5A244B4"/>
-    <w:lvl w:ilvl="0" w:tplc="FF4808BE">
-      <w:start w:val="1"/>
-      <w:numFmt w:val="bullet"/>
-      <w:lvlText w:val="•"/>
-      <w:lvlJc w:val="left"/>
-      <w:pPr>
-        <w:ind w:left="540" w:hanging="300"/>
-      </w:pPr>
-    </w:lvl>
-    <w:lvl w:ilvl="1" w:tplc="BAC23B0E">
-      <w:numFmt w:val="decimal"/>
-      <w:lvlText w:val=""/>
-      <w:lvlJc w:val="left"/>
-    </w:lvl>
-    <w:lvl w:ilvl="2" w:tplc="188C2D28">
-      <w:numFmt w:val="decimal"/>
-      <w:lvlText w:val=""/>
-      <w:lvlJc w:val="left"/>
-    </w:lvl>
-    <w:lvl w:ilvl="3" w:tplc="D7CE84CC">
-      <w:numFmt w:val="decimal"/>
-      <w:lvlText w:val=""/>
-      <w:lvlJc w:val="left"/>
-    </w:lvl>
-    <w:lvl w:ilvl="4" w:tplc="EA9260D2">
-      <w:numFmt w:val="decimal"/>
-      <w:lvlText w:val=""/>
-      <w:lvlJc w:val="left"/>
-    </w:lvl>
-    <w:lvl w:ilvl="5" w:tplc="D6D09A92">
-      <w:numFmt w:val="decimal"/>
-      <w:lvlText w:val=""/>
-      <w:lvlJc w:val="left"/>
-    </w:lvl>
-    <w:lvl w:ilvl="6" w:tplc="72581DD2">
-      <w:numFmt w:val="decimal"/>
-      <w:lvlText w:val=""/>
-      <w:lvlJc w:val="left"/>
-    </w:lvl>
-    <w:lvl w:ilvl="7" w:tplc="66402E12">
-      <w:numFmt w:val="decimal"/>
-      <w:lvlText w:val=""/>
-      <w:lvlJc w:val="left"/>
-    </w:lvl>
-    <w:lvl w:ilvl="8" w:tplc="E9FAC184">
-      <w:numFmt w:val="decimal"/>
-      <w:lvlText w:val=""/>
-      <w:lvlJc w:val="left"/>
-    </w:lvl>
-  </w:abstractNum>
-  <w:num w:numId="1" w16cid:durableId="1559509371">
+  <w:num w:numId="1" w16cid:durableId="213585069">
+    <w:abstractNumId w:val="10"/>
+    <w:lvlOverride w:ilvl="0">
+      <w:startOverride w:val="1"/>
+    </w:lvlOverride>
+  </w:num>
+  <w:num w:numId="2" w16cid:durableId="1537155263">
     <w:abstractNumId w:val="4"/>
     <w:lvlOverride w:ilvl="0">
       <w:startOverride w:val="1"/>
     </w:lvlOverride>
   </w:num>
-  <w:num w:numId="2" w16cid:durableId="1997686225">
-    <w:abstractNumId w:val="13"/>
+  <w:num w:numId="3" w16cid:durableId="460271938">
+    <w:abstractNumId w:val="7"/>
     <w:lvlOverride w:ilvl="0">
       <w:startOverride w:val="1"/>
     </w:lvlOverride>
   </w:num>
-  <w:num w:numId="3" w16cid:durableId="325058920">
-    <w:abstractNumId w:val="11"/>
+  <w:num w:numId="4" w16cid:durableId="396711934">
+    <w:abstractNumId w:val="0"/>
     <w:lvlOverride w:ilvl="0">
       <w:startOverride w:val="1"/>
     </w:lvlOverride>
   </w:num>
-  <w:num w:numId="4" w16cid:durableId="871962863">
-    <w:abstractNumId w:val="3"/>
-    <w:lvlOverride w:ilvl="0">
-      <w:startOverride w:val="1"/>
-    </w:lvlOverride>
-  </w:num>
-  <w:num w:numId="5" w16cid:durableId="72313562">
-    <w:abstractNumId w:val="8"/>
+  <w:num w:numId="5" w16cid:durableId="565383956">
+    <w:abstractNumId w:val="11"/>
     <w:lvlOverride w:ilvl="0">
       <w:startOverride w:val="1"/>
     </w:lvlOverride>
@@ -11393,7 +11403,7 @@
     <w:autoRedefine/>
     <w:uiPriority w:val="39"/>
     <w:unhideWhenUsed/>
-    <w:rsid w:val="00B32B22"/>
+    <w:rsid w:val="00323305"/>
   </w:style>
   <w:style w:type="paragraph" w:styleId="20">
     <w:name w:val="toc 2"/>
@@ -11402,7 +11412,7 @@
     <w:autoRedefine/>
     <w:uiPriority w:val="39"/>
     <w:unhideWhenUsed/>
-    <w:rsid w:val="00B32B22"/>
+    <w:rsid w:val="00323305"/>
     <w:pPr>
       <w:ind w:leftChars="100" w:left="200"/>
     </w:pPr>
@@ -11413,7 +11423,7 @@
     <w:link w:val="ad"/>
     <w:uiPriority w:val="99"/>
     <w:unhideWhenUsed/>
-    <w:rsid w:val="00B32B22"/>
+    <w:rsid w:val="00323305"/>
     <w:pPr>
       <w:tabs>
         <w:tab w:val="center" w:pos="4252"/>
@@ -11427,7 +11437,7 @@
     <w:basedOn w:val="a0"/>
     <w:link w:val="ac"/>
     <w:uiPriority w:val="99"/>
-    <w:rsid w:val="00B32B22"/>
+    <w:rsid w:val="00323305"/>
   </w:style>
   <w:style w:type="paragraph" w:styleId="ae">
     <w:name w:val="footer"/>
@@ -11435,7 +11445,7 @@
     <w:link w:val="af"/>
     <w:uiPriority w:val="99"/>
     <w:unhideWhenUsed/>
-    <w:rsid w:val="00B32B22"/>
+    <w:rsid w:val="00323305"/>
     <w:pPr>
       <w:tabs>
         <w:tab w:val="center" w:pos="4252"/>
@@ -11449,7 +11459,7 @@
     <w:basedOn w:val="a0"/>
     <w:link w:val="ae"/>
     <w:uiPriority w:val="99"/>
-    <w:rsid w:val="00B32B22"/>
+    <w:rsid w:val="00323305"/>
   </w:style>
 </w:styles>
 </file>

</xml_diff>